<commit_message>
Docs update and file cleanup
</commit_message>
<xml_diff>
--- a/docs/eParafia dokumentacja.docx
+++ b/docs/eParafia dokumentacja.docx
@@ -1,6 +1,6 @@
 
 <file path=word/document.xml><?xml version="1.0" encoding="utf-8"?>
-<w:document xmlns:wpc="http://schemas.microsoft.com/office/word/2010/wordprocessingCanvas" xmlns:cx="http://schemas.microsoft.com/office/drawing/2014/chartex" xmlns:cx1="http://schemas.microsoft.com/office/drawing/2015/9/8/chartex" xmlns:mc="http://schemas.openxmlformats.org/markup-compatibility/2006" xmlns:o="urn:schemas-microsoft-com:office:office" xmlns:r="http://schemas.openxmlformats.org/officeDocument/2006/relationships" xmlns:m="http://schemas.openxmlformats.org/officeDocument/2006/math" xmlns:v="urn:schemas-microsoft-com:vml" xmlns:wp14="http://schemas.microsoft.com/office/word/2010/wordprocessingDrawing" xmlns:wp="http://schemas.openxmlformats.org/drawingml/2006/wordprocessingDrawing" xmlns:w10="urn:schemas-microsoft-com:office:word" xmlns:w="http://schemas.openxmlformats.org/wordprocessingml/2006/main" xmlns:w14="http://schemas.microsoft.com/office/word/2010/wordml" xmlns:w15="http://schemas.microsoft.com/office/word/2012/wordml" xmlns:w16se="http://schemas.microsoft.com/office/word/2015/wordml/symex" xmlns:wpg="http://schemas.microsoft.com/office/word/2010/wordprocessingGroup" xmlns:wpi="http://schemas.microsoft.com/office/word/2010/wordprocessingInk" xmlns:wne="http://schemas.microsoft.com/office/word/2006/wordml" xmlns:wps="http://schemas.microsoft.com/office/word/2010/wordprocessingShape" mc:Ignorable="w14 w15 w16se wp14">
+<w:document xmlns:wpc="http://schemas.microsoft.com/office/word/2010/wordprocessingCanvas" xmlns:cx="http://schemas.microsoft.com/office/drawing/2014/chartex" xmlns:cx1="http://schemas.microsoft.com/office/drawing/2015/9/8/chartex" xmlns:cx2="http://schemas.microsoft.com/office/drawing/2015/10/21/chartex" xmlns:cx3="http://schemas.microsoft.com/office/drawing/2016/5/9/chartex" xmlns:cx4="http://schemas.microsoft.com/office/drawing/2016/5/10/chartex" xmlns:cx5="http://schemas.microsoft.com/office/drawing/2016/5/11/chartex" xmlns:cx6="http://schemas.microsoft.com/office/drawing/2016/5/12/chartex" xmlns:cx7="http://schemas.microsoft.com/office/drawing/2016/5/13/chartex" xmlns:cx8="http://schemas.microsoft.com/office/drawing/2016/5/14/chartex" xmlns:mc="http://schemas.openxmlformats.org/markup-compatibility/2006" xmlns:aink="http://schemas.microsoft.com/office/drawing/2016/ink" xmlns:am3d="http://schemas.microsoft.com/office/drawing/2017/model3d" xmlns:o="urn:schemas-microsoft-com:office:office" xmlns:oel="http://schemas.microsoft.com/office/2019/extlst" xmlns:r="http://schemas.openxmlformats.org/officeDocument/2006/relationships" xmlns:m="http://schemas.openxmlformats.org/officeDocument/2006/math" xmlns:v="urn:schemas-microsoft-com:vml" xmlns:wp14="http://schemas.microsoft.com/office/word/2010/wordprocessingDrawing" xmlns:wp="http://schemas.openxmlformats.org/drawingml/2006/wordprocessingDrawing" xmlns:w10="urn:schemas-microsoft-com:office:word" xmlns:w="http://schemas.openxmlformats.org/wordprocessingml/2006/main" xmlns:w14="http://schemas.microsoft.com/office/word/2010/wordml" xmlns:w15="http://schemas.microsoft.com/office/word/2012/wordml" xmlns:w16cex="http://schemas.microsoft.com/office/word/2018/wordml/cex" xmlns:w16cid="http://schemas.microsoft.com/office/word/2016/wordml/cid" xmlns:w16="http://schemas.microsoft.com/office/word/2018/wordml" xmlns:w16du="http://schemas.microsoft.com/office/word/2023/wordml/word16du" xmlns:w16sdtdh="http://schemas.microsoft.com/office/word/2020/wordml/sdtdatahash" xmlns:w16sdtfl="http://schemas.microsoft.com/office/word/2024/wordml/sdtformatlock" xmlns:w16se="http://schemas.microsoft.com/office/word/2015/wordml/symex" xmlns:wpg="http://schemas.microsoft.com/office/word/2010/wordprocessingGroup" xmlns:wpi="http://schemas.microsoft.com/office/word/2010/wordprocessingInk" xmlns:wne="http://schemas.microsoft.com/office/word/2006/wordml" xmlns:wps="http://schemas.microsoft.com/office/word/2010/wordprocessingShape" mc:Ignorable="w14 w15 w16se w16cid w16 w16cex w16sdtdh w16sdtfl w16du wp14">
   <w:body>
     <w:tbl>
       <w:tblPr>
@@ -332,6 +332,13 @@
                 <w:szCs w:val="24"/>
               </w:rPr>
             </w:pPr>
+            <w:r>
+              <w:rPr>
+                <w:rFonts w:ascii="Calibri" w:hAnsi="Calibri" w:cs="Calibri"/>
+                <w:szCs w:val="24"/>
+              </w:rPr>
+              <w:t>09.06.2026</w:t>
+            </w:r>
           </w:p>
         </w:tc>
         <w:tc>
@@ -707,6 +714,7 @@
             <w:rPr>
               <w:rFonts w:eastAsiaTheme="minorEastAsia"/>
               <w:noProof/>
+              <w:sz w:val="24"/>
               <w:szCs w:val="24"/>
               <w:lang w:eastAsia="pl-PL"/>
             </w:rPr>
@@ -720,7 +728,7 @@
           <w:r>
             <w:fldChar w:fldCharType="separate"/>
           </w:r>
-          <w:hyperlink w:anchor="_Toc224203095" w:history="1">
+          <w:hyperlink w:anchor="_Toc232014349" w:history="1">
             <w:r>
               <w:rPr>
                 <w:rStyle w:val="Hipercze"/>
@@ -732,6 +740,7 @@
               <w:rPr>
                 <w:rFonts w:eastAsiaTheme="minorEastAsia"/>
                 <w:noProof/>
+                <w:sz w:val="24"/>
                 <w:szCs w:val="24"/>
                 <w:lang w:eastAsia="pl-PL"/>
               </w:rPr>
@@ -763,7 +772,7 @@
                 <w:noProof/>
                 <w:webHidden/>
               </w:rPr>
-              <w:instrText xml:space="preserve"> PAGEREF _Toc224203095 \h </w:instrText>
+              <w:instrText xml:space="preserve"> PAGEREF _Toc232014349 \h </w:instrText>
             </w:r>
             <w:r>
               <w:rPr>
@@ -783,7 +792,7 @@
                 <w:noProof/>
                 <w:webHidden/>
               </w:rPr>
-              <w:t>2</w:t>
+              <w:t>3</w:t>
             </w:r>
             <w:r>
               <w:rPr>
@@ -804,11 +813,12 @@
             <w:rPr>
               <w:rFonts w:eastAsiaTheme="minorEastAsia"/>
               <w:noProof/>
+              <w:sz w:val="24"/>
               <w:szCs w:val="24"/>
               <w:lang w:eastAsia="pl-PL"/>
             </w:rPr>
           </w:pPr>
-          <w:hyperlink w:anchor="_Toc224203096" w:history="1">
+          <w:hyperlink w:anchor="_Toc232014350" w:history="1">
             <w:r>
               <w:rPr>
                 <w:rStyle w:val="Hipercze"/>
@@ -820,6 +830,7 @@
               <w:rPr>
                 <w:rFonts w:eastAsiaTheme="minorEastAsia"/>
                 <w:noProof/>
+                <w:sz w:val="24"/>
                 <w:szCs w:val="24"/>
                 <w:lang w:eastAsia="pl-PL"/>
               </w:rPr>
@@ -851,7 +862,7 @@
                 <w:noProof/>
                 <w:webHidden/>
               </w:rPr>
-              <w:instrText xml:space="preserve"> PAGEREF _Toc224203096 \h </w:instrText>
+              <w:instrText xml:space="preserve"> PAGEREF _Toc232014350 \h </w:instrText>
             </w:r>
             <w:r>
               <w:rPr>
@@ -871,7 +882,7 @@
                 <w:noProof/>
                 <w:webHidden/>
               </w:rPr>
-              <w:t>2</w:t>
+              <w:t>3</w:t>
             </w:r>
             <w:r>
               <w:rPr>
@@ -892,11 +903,12 @@
             <w:rPr>
               <w:rFonts w:eastAsiaTheme="minorEastAsia"/>
               <w:noProof/>
+              <w:sz w:val="24"/>
               <w:szCs w:val="24"/>
               <w:lang w:eastAsia="pl-PL"/>
             </w:rPr>
           </w:pPr>
-          <w:hyperlink w:anchor="_Toc224203097" w:history="1">
+          <w:hyperlink w:anchor="_Toc232014351" w:history="1">
             <w:r>
               <w:rPr>
                 <w:rStyle w:val="Hipercze"/>
@@ -908,6 +920,7 @@
               <w:rPr>
                 <w:rFonts w:eastAsiaTheme="minorEastAsia"/>
                 <w:noProof/>
+                <w:sz w:val="24"/>
                 <w:szCs w:val="24"/>
                 <w:lang w:eastAsia="pl-PL"/>
               </w:rPr>
@@ -939,7 +952,7 @@
                 <w:noProof/>
                 <w:webHidden/>
               </w:rPr>
-              <w:instrText xml:space="preserve"> PAGEREF _Toc224203097 \h </w:instrText>
+              <w:instrText xml:space="preserve"> PAGEREF _Toc232014351 \h </w:instrText>
             </w:r>
             <w:r>
               <w:rPr>
@@ -959,7 +972,7 @@
                 <w:noProof/>
                 <w:webHidden/>
               </w:rPr>
-              <w:t>2</w:t>
+              <w:t>3</w:t>
             </w:r>
             <w:r>
               <w:rPr>
@@ -980,11 +993,12 @@
             <w:rPr>
               <w:rFonts w:eastAsiaTheme="minorEastAsia"/>
               <w:noProof/>
+              <w:sz w:val="24"/>
               <w:szCs w:val="24"/>
               <w:lang w:eastAsia="pl-PL"/>
             </w:rPr>
           </w:pPr>
-          <w:hyperlink w:anchor="_Toc224203098" w:history="1">
+          <w:hyperlink w:anchor="_Toc232014352" w:history="1">
             <w:r>
               <w:rPr>
                 <w:rStyle w:val="Hipercze"/>
@@ -996,6 +1010,7 @@
               <w:rPr>
                 <w:rFonts w:eastAsiaTheme="minorEastAsia"/>
                 <w:noProof/>
+                <w:sz w:val="24"/>
                 <w:szCs w:val="24"/>
                 <w:lang w:eastAsia="pl-PL"/>
               </w:rPr>
@@ -1027,7 +1042,7 @@
                 <w:noProof/>
                 <w:webHidden/>
               </w:rPr>
-              <w:instrText xml:space="preserve"> PAGEREF _Toc224203098 \h </w:instrText>
+              <w:instrText xml:space="preserve"> PAGEREF _Toc232014352 \h </w:instrText>
             </w:r>
             <w:r>
               <w:rPr>
@@ -1047,7 +1062,7 @@
                 <w:noProof/>
                 <w:webHidden/>
               </w:rPr>
-              <w:t>3</w:t>
+              <w:t>4</w:t>
             </w:r>
             <w:r>
               <w:rPr>
@@ -1062,17 +1077,18 @@
           <w:pPr>
             <w:pStyle w:val="Spistreci3"/>
             <w:tabs>
-              <w:tab w:val="left" w:pos="1440"/>
+              <w:tab w:val="left" w:pos="1200"/>
               <w:tab w:val="right" w:leader="dot" w:pos="9062"/>
             </w:tabs>
             <w:rPr>
               <w:rFonts w:eastAsiaTheme="minorEastAsia"/>
               <w:noProof/>
+              <w:sz w:val="24"/>
               <w:szCs w:val="24"/>
               <w:lang w:eastAsia="pl-PL"/>
             </w:rPr>
           </w:pPr>
-          <w:hyperlink w:anchor="_Toc224203099" w:history="1">
+          <w:hyperlink w:anchor="_Toc232014353" w:history="1">
             <w:r>
               <w:rPr>
                 <w:rStyle w:val="Hipercze"/>
@@ -1084,6 +1100,7 @@
               <w:rPr>
                 <w:rFonts w:eastAsiaTheme="minorEastAsia"/>
                 <w:noProof/>
+                <w:sz w:val="24"/>
                 <w:szCs w:val="24"/>
                 <w:lang w:eastAsia="pl-PL"/>
               </w:rPr>
@@ -1115,7 +1132,7 @@
                 <w:noProof/>
                 <w:webHidden/>
               </w:rPr>
-              <w:instrText xml:space="preserve"> PAGEREF _Toc224203099 \h </w:instrText>
+              <w:instrText xml:space="preserve"> PAGEREF _Toc232014353 \h </w:instrText>
             </w:r>
             <w:r>
               <w:rPr>
@@ -1135,7 +1152,7 @@
                 <w:noProof/>
                 <w:webHidden/>
               </w:rPr>
-              <w:t>3</w:t>
+              <w:t>4</w:t>
             </w:r>
             <w:r>
               <w:rPr>
@@ -1150,17 +1167,18 @@
           <w:pPr>
             <w:pStyle w:val="Spistreci3"/>
             <w:tabs>
-              <w:tab w:val="left" w:pos="1440"/>
+              <w:tab w:val="left" w:pos="1200"/>
               <w:tab w:val="right" w:leader="dot" w:pos="9062"/>
             </w:tabs>
             <w:rPr>
               <w:rFonts w:eastAsiaTheme="minorEastAsia"/>
               <w:noProof/>
+              <w:sz w:val="24"/>
               <w:szCs w:val="24"/>
               <w:lang w:eastAsia="pl-PL"/>
             </w:rPr>
           </w:pPr>
-          <w:hyperlink w:anchor="_Toc224203100" w:history="1">
+          <w:hyperlink w:anchor="_Toc232014354" w:history="1">
             <w:r>
               <w:rPr>
                 <w:rStyle w:val="Hipercze"/>
@@ -1172,6 +1190,7 @@
               <w:rPr>
                 <w:rFonts w:eastAsiaTheme="minorEastAsia"/>
                 <w:noProof/>
+                <w:sz w:val="24"/>
                 <w:szCs w:val="24"/>
                 <w:lang w:eastAsia="pl-PL"/>
               </w:rPr>
@@ -1203,7 +1222,7 @@
                 <w:noProof/>
                 <w:webHidden/>
               </w:rPr>
-              <w:instrText xml:space="preserve"> PAGEREF _Toc224203100 \h </w:instrText>
+              <w:instrText xml:space="preserve"> PAGEREF _Toc232014354 \h </w:instrText>
             </w:r>
             <w:r>
               <w:rPr>
@@ -1223,7 +1242,7 @@
                 <w:noProof/>
                 <w:webHidden/>
               </w:rPr>
-              <w:t>4</w:t>
+              <w:t>6</w:t>
             </w:r>
             <w:r>
               <w:rPr>
@@ -1238,17 +1257,18 @@
           <w:pPr>
             <w:pStyle w:val="Spistreci3"/>
             <w:tabs>
-              <w:tab w:val="left" w:pos="1440"/>
+              <w:tab w:val="left" w:pos="1200"/>
               <w:tab w:val="right" w:leader="dot" w:pos="9062"/>
             </w:tabs>
             <w:rPr>
               <w:rFonts w:eastAsiaTheme="minorEastAsia"/>
               <w:noProof/>
+              <w:sz w:val="24"/>
               <w:szCs w:val="24"/>
               <w:lang w:eastAsia="pl-PL"/>
             </w:rPr>
           </w:pPr>
-          <w:hyperlink w:anchor="_Toc224203101" w:history="1">
+          <w:hyperlink w:anchor="_Toc232014355" w:history="1">
             <w:r>
               <w:rPr>
                 <w:rStyle w:val="Hipercze"/>
@@ -1260,6 +1280,7 @@
               <w:rPr>
                 <w:rFonts w:eastAsiaTheme="minorEastAsia"/>
                 <w:noProof/>
+                <w:sz w:val="24"/>
                 <w:szCs w:val="24"/>
                 <w:lang w:eastAsia="pl-PL"/>
               </w:rPr>
@@ -1291,7 +1312,7 @@
                 <w:noProof/>
                 <w:webHidden/>
               </w:rPr>
-              <w:instrText xml:space="preserve"> PAGEREF _Toc224203101 \h </w:instrText>
+              <w:instrText xml:space="preserve"> PAGEREF _Toc232014355 \h </w:instrText>
             </w:r>
             <w:r>
               <w:rPr>
@@ -1311,7 +1332,7 @@
                 <w:noProof/>
                 <w:webHidden/>
               </w:rPr>
-              <w:t>4</w:t>
+              <w:t>12</w:t>
             </w:r>
             <w:r>
               <w:rPr>
@@ -1332,11 +1353,12 @@
             <w:rPr>
               <w:rFonts w:eastAsiaTheme="minorEastAsia"/>
               <w:noProof/>
+              <w:sz w:val="24"/>
               <w:szCs w:val="24"/>
               <w:lang w:eastAsia="pl-PL"/>
             </w:rPr>
           </w:pPr>
-          <w:hyperlink w:anchor="_Toc224203102" w:history="1">
+          <w:hyperlink w:anchor="_Toc232014356" w:history="1">
             <w:r>
               <w:rPr>
                 <w:rStyle w:val="Hipercze"/>
@@ -1348,6 +1370,7 @@
               <w:rPr>
                 <w:rFonts w:eastAsiaTheme="minorEastAsia"/>
                 <w:noProof/>
+                <w:sz w:val="24"/>
                 <w:szCs w:val="24"/>
                 <w:lang w:eastAsia="pl-PL"/>
               </w:rPr>
@@ -1379,7 +1402,7 @@
                 <w:noProof/>
                 <w:webHidden/>
               </w:rPr>
-              <w:instrText xml:space="preserve"> PAGEREF _Toc224203102 \h </w:instrText>
+              <w:instrText xml:space="preserve"> PAGEREF _Toc232014356 \h </w:instrText>
             </w:r>
             <w:r>
               <w:rPr>
@@ -1399,7 +1422,7 @@
                 <w:noProof/>
                 <w:webHidden/>
               </w:rPr>
-              <w:t>4</w:t>
+              <w:t>14</w:t>
             </w:r>
             <w:r>
               <w:rPr>
@@ -1414,17 +1437,18 @@
           <w:pPr>
             <w:pStyle w:val="Spistreci3"/>
             <w:tabs>
-              <w:tab w:val="left" w:pos="1440"/>
+              <w:tab w:val="left" w:pos="1200"/>
               <w:tab w:val="right" w:leader="dot" w:pos="9062"/>
             </w:tabs>
             <w:rPr>
               <w:rFonts w:eastAsiaTheme="minorEastAsia"/>
               <w:noProof/>
+              <w:sz w:val="24"/>
               <w:szCs w:val="24"/>
               <w:lang w:eastAsia="pl-PL"/>
             </w:rPr>
           </w:pPr>
-          <w:hyperlink w:anchor="_Toc224203103" w:history="1">
+          <w:hyperlink w:anchor="_Toc232014357" w:history="1">
             <w:r>
               <w:rPr>
                 <w:rStyle w:val="Hipercze"/>
@@ -1436,6 +1460,7 @@
               <w:rPr>
                 <w:rFonts w:eastAsiaTheme="minorEastAsia"/>
                 <w:noProof/>
+                <w:sz w:val="24"/>
                 <w:szCs w:val="24"/>
                 <w:lang w:eastAsia="pl-PL"/>
               </w:rPr>
@@ -1467,7 +1492,7 @@
                 <w:noProof/>
                 <w:webHidden/>
               </w:rPr>
-              <w:instrText xml:space="preserve"> PAGEREF _Toc224203103 \h </w:instrText>
+              <w:instrText xml:space="preserve"> PAGEREF _Toc232014357 \h </w:instrText>
             </w:r>
             <w:r>
               <w:rPr>
@@ -1487,7 +1512,7 @@
                 <w:noProof/>
                 <w:webHidden/>
               </w:rPr>
-              <w:t>4</w:t>
+              <w:t>14</w:t>
             </w:r>
             <w:r>
               <w:rPr>
@@ -1502,17 +1527,18 @@
           <w:pPr>
             <w:pStyle w:val="Spistreci3"/>
             <w:tabs>
-              <w:tab w:val="left" w:pos="1440"/>
+              <w:tab w:val="left" w:pos="1200"/>
               <w:tab w:val="right" w:leader="dot" w:pos="9062"/>
             </w:tabs>
             <w:rPr>
               <w:rFonts w:eastAsiaTheme="minorEastAsia"/>
               <w:noProof/>
+              <w:sz w:val="24"/>
               <w:szCs w:val="24"/>
               <w:lang w:eastAsia="pl-PL"/>
             </w:rPr>
           </w:pPr>
-          <w:hyperlink w:anchor="_Toc224203104" w:history="1">
+          <w:hyperlink w:anchor="_Toc232014358" w:history="1">
             <w:r>
               <w:rPr>
                 <w:rStyle w:val="Hipercze"/>
@@ -1524,6 +1550,7 @@
               <w:rPr>
                 <w:rFonts w:eastAsiaTheme="minorEastAsia"/>
                 <w:noProof/>
+                <w:sz w:val="24"/>
                 <w:szCs w:val="24"/>
                 <w:lang w:eastAsia="pl-PL"/>
               </w:rPr>
@@ -1555,7 +1582,7 @@
                 <w:noProof/>
                 <w:webHidden/>
               </w:rPr>
-              <w:instrText xml:space="preserve"> PAGEREF _Toc224203104 \h </w:instrText>
+              <w:instrText xml:space="preserve"> PAGEREF _Toc232014358 \h </w:instrText>
             </w:r>
             <w:r>
               <w:rPr>
@@ -1575,7 +1602,7 @@
                 <w:noProof/>
                 <w:webHidden/>
               </w:rPr>
-              <w:t>5</w:t>
+              <w:t>14</w:t>
             </w:r>
             <w:r>
               <w:rPr>
@@ -1590,17 +1617,18 @@
           <w:pPr>
             <w:pStyle w:val="Spistreci3"/>
             <w:tabs>
-              <w:tab w:val="left" w:pos="1440"/>
+              <w:tab w:val="left" w:pos="1200"/>
               <w:tab w:val="right" w:leader="dot" w:pos="9062"/>
             </w:tabs>
             <w:rPr>
               <w:rFonts w:eastAsiaTheme="minorEastAsia"/>
               <w:noProof/>
+              <w:sz w:val="24"/>
               <w:szCs w:val="24"/>
               <w:lang w:eastAsia="pl-PL"/>
             </w:rPr>
           </w:pPr>
-          <w:hyperlink w:anchor="_Toc224203105" w:history="1">
+          <w:hyperlink w:anchor="_Toc232014359" w:history="1">
             <w:r>
               <w:rPr>
                 <w:rStyle w:val="Hipercze"/>
@@ -1612,6 +1640,7 @@
               <w:rPr>
                 <w:rFonts w:eastAsiaTheme="minorEastAsia"/>
                 <w:noProof/>
+                <w:sz w:val="24"/>
                 <w:szCs w:val="24"/>
                 <w:lang w:eastAsia="pl-PL"/>
               </w:rPr>
@@ -1643,7 +1672,7 @@
                 <w:noProof/>
                 <w:webHidden/>
               </w:rPr>
-              <w:instrText xml:space="preserve"> PAGEREF _Toc224203105 \h </w:instrText>
+              <w:instrText xml:space="preserve"> PAGEREF _Toc232014359 \h </w:instrText>
             </w:r>
             <w:r>
               <w:rPr>
@@ -1663,7 +1692,7 @@
                 <w:noProof/>
                 <w:webHidden/>
               </w:rPr>
-              <w:t>5</w:t>
+              <w:t>17</w:t>
             </w:r>
             <w:r>
               <w:rPr>
@@ -1684,11 +1713,12 @@
             <w:rPr>
               <w:rFonts w:eastAsiaTheme="minorEastAsia"/>
               <w:noProof/>
+              <w:sz w:val="24"/>
               <w:szCs w:val="24"/>
               <w:lang w:eastAsia="pl-PL"/>
             </w:rPr>
           </w:pPr>
-          <w:hyperlink w:anchor="_Toc224203106" w:history="1">
+          <w:hyperlink w:anchor="_Toc232014360" w:history="1">
             <w:r>
               <w:rPr>
                 <w:rStyle w:val="Hipercze"/>
@@ -1700,6 +1730,7 @@
               <w:rPr>
                 <w:rFonts w:eastAsiaTheme="minorEastAsia"/>
                 <w:noProof/>
+                <w:sz w:val="24"/>
                 <w:szCs w:val="24"/>
                 <w:lang w:eastAsia="pl-PL"/>
               </w:rPr>
@@ -1731,7 +1762,7 @@
                 <w:noProof/>
                 <w:webHidden/>
               </w:rPr>
-              <w:instrText xml:space="preserve"> PAGEREF _Toc224203106 \h </w:instrText>
+              <w:instrText xml:space="preserve"> PAGEREF _Toc232014360 \h </w:instrText>
             </w:r>
             <w:r>
               <w:rPr>
@@ -1751,7 +1782,7 @@
                 <w:noProof/>
                 <w:webHidden/>
               </w:rPr>
-              <w:t>5</w:t>
+              <w:t>22</w:t>
             </w:r>
             <w:r>
               <w:rPr>
@@ -1772,11 +1803,12 @@
             <w:rPr>
               <w:rFonts w:eastAsiaTheme="minorEastAsia"/>
               <w:noProof/>
+              <w:sz w:val="24"/>
               <w:szCs w:val="24"/>
               <w:lang w:eastAsia="pl-PL"/>
             </w:rPr>
           </w:pPr>
-          <w:hyperlink w:anchor="_Toc224203107" w:history="1">
+          <w:hyperlink w:anchor="_Toc232014361" w:history="1">
             <w:r>
               <w:rPr>
                 <w:rStyle w:val="Hipercze"/>
@@ -1788,6 +1820,7 @@
               <w:rPr>
                 <w:rFonts w:eastAsiaTheme="minorEastAsia"/>
                 <w:noProof/>
+                <w:sz w:val="24"/>
                 <w:szCs w:val="24"/>
                 <w:lang w:eastAsia="pl-PL"/>
               </w:rPr>
@@ -1819,7 +1852,7 @@
                 <w:noProof/>
                 <w:webHidden/>
               </w:rPr>
-              <w:instrText xml:space="preserve"> PAGEREF _Toc224203107 \h </w:instrText>
+              <w:instrText xml:space="preserve"> PAGEREF _Toc232014361 \h </w:instrText>
             </w:r>
             <w:r>
               <w:rPr>
@@ -1839,7 +1872,727 @@
                 <w:noProof/>
                 <w:webHidden/>
               </w:rPr>
-              <w:t>5</w:t>
+              <w:t>22</w:t>
+            </w:r>
+            <w:r>
+              <w:rPr>
+                <w:noProof/>
+                <w:webHidden/>
+              </w:rPr>
+              <w:fldChar w:fldCharType="end"/>
+            </w:r>
+          </w:hyperlink>
+        </w:p>
+        <w:p>
+          <w:pPr>
+            <w:pStyle w:val="Spistreci2"/>
+            <w:tabs>
+              <w:tab w:val="left" w:pos="960"/>
+              <w:tab w:val="right" w:leader="dot" w:pos="9062"/>
+            </w:tabs>
+            <w:rPr>
+              <w:rFonts w:eastAsiaTheme="minorEastAsia"/>
+              <w:noProof/>
+              <w:sz w:val="24"/>
+              <w:szCs w:val="24"/>
+              <w:lang w:eastAsia="pl-PL"/>
+            </w:rPr>
+          </w:pPr>
+          <w:hyperlink w:anchor="_Toc232014362" w:history="1">
+            <w:r>
+              <w:rPr>
+                <w:rStyle w:val="Hipercze"/>
+                <w:noProof/>
+              </w:rPr>
+              <w:t>4.1</w:t>
+            </w:r>
+            <w:r>
+              <w:rPr>
+                <w:rFonts w:eastAsiaTheme="minorEastAsia"/>
+                <w:noProof/>
+                <w:sz w:val="24"/>
+                <w:szCs w:val="24"/>
+                <w:lang w:eastAsia="pl-PL"/>
+              </w:rPr>
+              <w:tab/>
+            </w:r>
+            <w:r>
+              <w:rPr>
+                <w:rStyle w:val="Hipercze"/>
+                <w:noProof/>
+              </w:rPr>
+              <w:t>Architektura aplikacji</w:t>
+            </w:r>
+            <w:r>
+              <w:rPr>
+                <w:noProof/>
+                <w:webHidden/>
+              </w:rPr>
+              <w:tab/>
+            </w:r>
+            <w:r>
+              <w:rPr>
+                <w:noProof/>
+                <w:webHidden/>
+              </w:rPr>
+              <w:fldChar w:fldCharType="begin"/>
+            </w:r>
+            <w:r>
+              <w:rPr>
+                <w:noProof/>
+                <w:webHidden/>
+              </w:rPr>
+              <w:instrText xml:space="preserve"> PAGEREF _Toc232014362 \h </w:instrText>
+            </w:r>
+            <w:r>
+              <w:rPr>
+                <w:noProof/>
+                <w:webHidden/>
+              </w:rPr>
+            </w:r>
+            <w:r>
+              <w:rPr>
+                <w:noProof/>
+                <w:webHidden/>
+              </w:rPr>
+              <w:fldChar w:fldCharType="separate"/>
+            </w:r>
+            <w:r>
+              <w:rPr>
+                <w:noProof/>
+                <w:webHidden/>
+              </w:rPr>
+              <w:t>22</w:t>
+            </w:r>
+            <w:r>
+              <w:rPr>
+                <w:noProof/>
+                <w:webHidden/>
+              </w:rPr>
+              <w:fldChar w:fldCharType="end"/>
+            </w:r>
+          </w:hyperlink>
+        </w:p>
+        <w:p>
+          <w:pPr>
+            <w:pStyle w:val="Spistreci2"/>
+            <w:tabs>
+              <w:tab w:val="left" w:pos="960"/>
+              <w:tab w:val="right" w:leader="dot" w:pos="9062"/>
+            </w:tabs>
+            <w:rPr>
+              <w:rFonts w:eastAsiaTheme="minorEastAsia"/>
+              <w:noProof/>
+              <w:sz w:val="24"/>
+              <w:szCs w:val="24"/>
+              <w:lang w:eastAsia="pl-PL"/>
+            </w:rPr>
+          </w:pPr>
+          <w:hyperlink w:anchor="_Toc232014363" w:history="1">
+            <w:r>
+              <w:rPr>
+                <w:rStyle w:val="Hipercze"/>
+                <w:noProof/>
+              </w:rPr>
+              <w:t>4.2</w:t>
+            </w:r>
+            <w:r>
+              <w:rPr>
+                <w:rFonts w:eastAsiaTheme="minorEastAsia"/>
+                <w:noProof/>
+                <w:sz w:val="24"/>
+                <w:szCs w:val="24"/>
+                <w:lang w:eastAsia="pl-PL"/>
+              </w:rPr>
+              <w:tab/>
+            </w:r>
+            <w:r>
+              <w:rPr>
+                <w:rStyle w:val="Hipercze"/>
+                <w:noProof/>
+              </w:rPr>
+              <w:t>Konteksty domenowe</w:t>
+            </w:r>
+            <w:r>
+              <w:rPr>
+                <w:noProof/>
+                <w:webHidden/>
+              </w:rPr>
+              <w:tab/>
+            </w:r>
+            <w:r>
+              <w:rPr>
+                <w:noProof/>
+                <w:webHidden/>
+              </w:rPr>
+              <w:fldChar w:fldCharType="begin"/>
+            </w:r>
+            <w:r>
+              <w:rPr>
+                <w:noProof/>
+                <w:webHidden/>
+              </w:rPr>
+              <w:instrText xml:space="preserve"> PAGEREF _Toc232014363 \h </w:instrText>
+            </w:r>
+            <w:r>
+              <w:rPr>
+                <w:noProof/>
+                <w:webHidden/>
+              </w:rPr>
+            </w:r>
+            <w:r>
+              <w:rPr>
+                <w:noProof/>
+                <w:webHidden/>
+              </w:rPr>
+              <w:fldChar w:fldCharType="separate"/>
+            </w:r>
+            <w:r>
+              <w:rPr>
+                <w:noProof/>
+                <w:webHidden/>
+              </w:rPr>
+              <w:t>22</w:t>
+            </w:r>
+            <w:r>
+              <w:rPr>
+                <w:noProof/>
+                <w:webHidden/>
+              </w:rPr>
+              <w:fldChar w:fldCharType="end"/>
+            </w:r>
+          </w:hyperlink>
+        </w:p>
+        <w:p>
+          <w:pPr>
+            <w:pStyle w:val="Spistreci2"/>
+            <w:tabs>
+              <w:tab w:val="left" w:pos="960"/>
+              <w:tab w:val="right" w:leader="dot" w:pos="9062"/>
+            </w:tabs>
+            <w:rPr>
+              <w:rFonts w:eastAsiaTheme="minorEastAsia"/>
+              <w:noProof/>
+              <w:sz w:val="24"/>
+              <w:szCs w:val="24"/>
+              <w:lang w:eastAsia="pl-PL"/>
+            </w:rPr>
+          </w:pPr>
+          <w:hyperlink w:anchor="_Toc232014364" w:history="1">
+            <w:r>
+              <w:rPr>
+                <w:rStyle w:val="Hipercze"/>
+                <w:noProof/>
+              </w:rPr>
+              <w:t>4.3</w:t>
+            </w:r>
+            <w:r>
+              <w:rPr>
+                <w:rFonts w:eastAsiaTheme="minorEastAsia"/>
+                <w:noProof/>
+                <w:sz w:val="24"/>
+                <w:szCs w:val="24"/>
+                <w:lang w:eastAsia="pl-PL"/>
+              </w:rPr>
+              <w:tab/>
+            </w:r>
+            <w:r>
+              <w:rPr>
+                <w:rStyle w:val="Hipercze"/>
+                <w:noProof/>
+              </w:rPr>
+              <w:t>Encje JPA i persystencja danych</w:t>
+            </w:r>
+            <w:r>
+              <w:rPr>
+                <w:noProof/>
+                <w:webHidden/>
+              </w:rPr>
+              <w:tab/>
+            </w:r>
+            <w:r>
+              <w:rPr>
+                <w:noProof/>
+                <w:webHidden/>
+              </w:rPr>
+              <w:fldChar w:fldCharType="begin"/>
+            </w:r>
+            <w:r>
+              <w:rPr>
+                <w:noProof/>
+                <w:webHidden/>
+              </w:rPr>
+              <w:instrText xml:space="preserve"> PAGEREF _Toc232014364 \h </w:instrText>
+            </w:r>
+            <w:r>
+              <w:rPr>
+                <w:noProof/>
+                <w:webHidden/>
+              </w:rPr>
+            </w:r>
+            <w:r>
+              <w:rPr>
+                <w:noProof/>
+                <w:webHidden/>
+              </w:rPr>
+              <w:fldChar w:fldCharType="separate"/>
+            </w:r>
+            <w:r>
+              <w:rPr>
+                <w:noProof/>
+                <w:webHidden/>
+              </w:rPr>
+              <w:t>22</w:t>
+            </w:r>
+            <w:r>
+              <w:rPr>
+                <w:noProof/>
+                <w:webHidden/>
+              </w:rPr>
+              <w:fldChar w:fldCharType="end"/>
+            </w:r>
+          </w:hyperlink>
+        </w:p>
+        <w:p>
+          <w:pPr>
+            <w:pStyle w:val="Spistreci2"/>
+            <w:tabs>
+              <w:tab w:val="left" w:pos="960"/>
+              <w:tab w:val="right" w:leader="dot" w:pos="9062"/>
+            </w:tabs>
+            <w:rPr>
+              <w:rFonts w:eastAsiaTheme="minorEastAsia"/>
+              <w:noProof/>
+              <w:sz w:val="24"/>
+              <w:szCs w:val="24"/>
+              <w:lang w:eastAsia="pl-PL"/>
+            </w:rPr>
+          </w:pPr>
+          <w:hyperlink w:anchor="_Toc232014365" w:history="1">
+            <w:r>
+              <w:rPr>
+                <w:rStyle w:val="Hipercze"/>
+                <w:noProof/>
+              </w:rPr>
+              <w:t>4.4</w:t>
+            </w:r>
+            <w:r>
+              <w:rPr>
+                <w:rFonts w:eastAsiaTheme="minorEastAsia"/>
+                <w:noProof/>
+                <w:sz w:val="24"/>
+                <w:szCs w:val="24"/>
+                <w:lang w:eastAsia="pl-PL"/>
+              </w:rPr>
+              <w:tab/>
+            </w:r>
+            <w:r>
+              <w:rPr>
+                <w:rStyle w:val="Hipercze"/>
+                <w:noProof/>
+              </w:rPr>
+              <w:t>Agregaty domenowe</w:t>
+            </w:r>
+            <w:r>
+              <w:rPr>
+                <w:noProof/>
+                <w:webHidden/>
+              </w:rPr>
+              <w:tab/>
+            </w:r>
+            <w:r>
+              <w:rPr>
+                <w:noProof/>
+                <w:webHidden/>
+              </w:rPr>
+              <w:fldChar w:fldCharType="begin"/>
+            </w:r>
+            <w:r>
+              <w:rPr>
+                <w:noProof/>
+                <w:webHidden/>
+              </w:rPr>
+              <w:instrText xml:space="preserve"> PAGEREF _Toc232014365 \h </w:instrText>
+            </w:r>
+            <w:r>
+              <w:rPr>
+                <w:noProof/>
+                <w:webHidden/>
+              </w:rPr>
+            </w:r>
+            <w:r>
+              <w:rPr>
+                <w:noProof/>
+                <w:webHidden/>
+              </w:rPr>
+              <w:fldChar w:fldCharType="separate"/>
+            </w:r>
+            <w:r>
+              <w:rPr>
+                <w:noProof/>
+                <w:webHidden/>
+              </w:rPr>
+              <w:t>23</w:t>
+            </w:r>
+            <w:r>
+              <w:rPr>
+                <w:noProof/>
+                <w:webHidden/>
+              </w:rPr>
+              <w:fldChar w:fldCharType="end"/>
+            </w:r>
+          </w:hyperlink>
+        </w:p>
+        <w:p>
+          <w:pPr>
+            <w:pStyle w:val="Spistreci2"/>
+            <w:tabs>
+              <w:tab w:val="left" w:pos="960"/>
+              <w:tab w:val="right" w:leader="dot" w:pos="9062"/>
+            </w:tabs>
+            <w:rPr>
+              <w:rFonts w:eastAsiaTheme="minorEastAsia"/>
+              <w:noProof/>
+              <w:sz w:val="24"/>
+              <w:szCs w:val="24"/>
+              <w:lang w:eastAsia="pl-PL"/>
+            </w:rPr>
+          </w:pPr>
+          <w:hyperlink w:anchor="_Toc232014366" w:history="1">
+            <w:r>
+              <w:rPr>
+                <w:rStyle w:val="Hipercze"/>
+                <w:noProof/>
+              </w:rPr>
+              <w:t>4.5</w:t>
+            </w:r>
+            <w:r>
+              <w:rPr>
+                <w:rFonts w:eastAsiaTheme="minorEastAsia"/>
+                <w:noProof/>
+                <w:sz w:val="24"/>
+                <w:szCs w:val="24"/>
+                <w:lang w:eastAsia="pl-PL"/>
+              </w:rPr>
+              <w:tab/>
+            </w:r>
+            <w:r>
+              <w:rPr>
+                <w:rStyle w:val="Hipercze"/>
+                <w:noProof/>
+              </w:rPr>
+              <w:t>Interfejs REST API</w:t>
+            </w:r>
+            <w:r>
+              <w:rPr>
+                <w:noProof/>
+                <w:webHidden/>
+              </w:rPr>
+              <w:tab/>
+            </w:r>
+            <w:r>
+              <w:rPr>
+                <w:noProof/>
+                <w:webHidden/>
+              </w:rPr>
+              <w:fldChar w:fldCharType="begin"/>
+            </w:r>
+            <w:r>
+              <w:rPr>
+                <w:noProof/>
+                <w:webHidden/>
+              </w:rPr>
+              <w:instrText xml:space="preserve"> PAGEREF _Toc232014366 \h </w:instrText>
+            </w:r>
+            <w:r>
+              <w:rPr>
+                <w:noProof/>
+                <w:webHidden/>
+              </w:rPr>
+            </w:r>
+            <w:r>
+              <w:rPr>
+                <w:noProof/>
+                <w:webHidden/>
+              </w:rPr>
+              <w:fldChar w:fldCharType="separate"/>
+            </w:r>
+            <w:r>
+              <w:rPr>
+                <w:noProof/>
+                <w:webHidden/>
+              </w:rPr>
+              <w:t>23</w:t>
+            </w:r>
+            <w:r>
+              <w:rPr>
+                <w:noProof/>
+                <w:webHidden/>
+              </w:rPr>
+              <w:fldChar w:fldCharType="end"/>
+            </w:r>
+          </w:hyperlink>
+        </w:p>
+        <w:p>
+          <w:pPr>
+            <w:pStyle w:val="Spistreci2"/>
+            <w:tabs>
+              <w:tab w:val="left" w:pos="960"/>
+              <w:tab w:val="right" w:leader="dot" w:pos="9062"/>
+            </w:tabs>
+            <w:rPr>
+              <w:rFonts w:eastAsiaTheme="minorEastAsia"/>
+              <w:noProof/>
+              <w:sz w:val="24"/>
+              <w:szCs w:val="24"/>
+              <w:lang w:eastAsia="pl-PL"/>
+            </w:rPr>
+          </w:pPr>
+          <w:hyperlink w:anchor="_Toc232014367" w:history="1">
+            <w:r>
+              <w:rPr>
+                <w:rStyle w:val="Hipercze"/>
+                <w:noProof/>
+              </w:rPr>
+              <w:t>4.6</w:t>
+            </w:r>
+            <w:r>
+              <w:rPr>
+                <w:rFonts w:eastAsiaTheme="minorEastAsia"/>
+                <w:noProof/>
+                <w:sz w:val="24"/>
+                <w:szCs w:val="24"/>
+                <w:lang w:eastAsia="pl-PL"/>
+              </w:rPr>
+              <w:tab/>
+            </w:r>
+            <w:r>
+              <w:rPr>
+                <w:rStyle w:val="Hipercze"/>
+                <w:noProof/>
+              </w:rPr>
+              <w:t>Obsługa błędów</w:t>
+            </w:r>
+            <w:r>
+              <w:rPr>
+                <w:noProof/>
+                <w:webHidden/>
+              </w:rPr>
+              <w:tab/>
+            </w:r>
+            <w:r>
+              <w:rPr>
+                <w:noProof/>
+                <w:webHidden/>
+              </w:rPr>
+              <w:fldChar w:fldCharType="begin"/>
+            </w:r>
+            <w:r>
+              <w:rPr>
+                <w:noProof/>
+                <w:webHidden/>
+              </w:rPr>
+              <w:instrText xml:space="preserve"> PAGEREF _Toc232014367 \h </w:instrText>
+            </w:r>
+            <w:r>
+              <w:rPr>
+                <w:noProof/>
+                <w:webHidden/>
+              </w:rPr>
+            </w:r>
+            <w:r>
+              <w:rPr>
+                <w:noProof/>
+                <w:webHidden/>
+              </w:rPr>
+              <w:fldChar w:fldCharType="separate"/>
+            </w:r>
+            <w:r>
+              <w:rPr>
+                <w:noProof/>
+                <w:webHidden/>
+              </w:rPr>
+              <w:t>24</w:t>
+            </w:r>
+            <w:r>
+              <w:rPr>
+                <w:noProof/>
+                <w:webHidden/>
+              </w:rPr>
+              <w:fldChar w:fldCharType="end"/>
+            </w:r>
+          </w:hyperlink>
+        </w:p>
+        <w:p>
+          <w:pPr>
+            <w:pStyle w:val="Spistreci2"/>
+            <w:tabs>
+              <w:tab w:val="left" w:pos="960"/>
+              <w:tab w:val="right" w:leader="dot" w:pos="9062"/>
+            </w:tabs>
+            <w:rPr>
+              <w:rFonts w:eastAsiaTheme="minorEastAsia"/>
+              <w:noProof/>
+              <w:sz w:val="24"/>
+              <w:szCs w:val="24"/>
+              <w:lang w:eastAsia="pl-PL"/>
+            </w:rPr>
+          </w:pPr>
+          <w:hyperlink w:anchor="_Toc232014368" w:history="1">
+            <w:r>
+              <w:rPr>
+                <w:rStyle w:val="Hipercze"/>
+                <w:noProof/>
+              </w:rPr>
+              <w:t>4.7</w:t>
+            </w:r>
+            <w:r>
+              <w:rPr>
+                <w:rFonts w:eastAsiaTheme="minorEastAsia"/>
+                <w:noProof/>
+                <w:sz w:val="24"/>
+                <w:szCs w:val="24"/>
+                <w:lang w:eastAsia="pl-PL"/>
+              </w:rPr>
+              <w:tab/>
+            </w:r>
+            <w:r>
+              <w:rPr>
+                <w:rStyle w:val="Hipercze"/>
+                <w:noProof/>
+              </w:rPr>
+              <w:t>Inicjalizacja i konfiguracja</w:t>
+            </w:r>
+            <w:r>
+              <w:rPr>
+                <w:noProof/>
+                <w:webHidden/>
+              </w:rPr>
+              <w:tab/>
+            </w:r>
+            <w:r>
+              <w:rPr>
+                <w:noProof/>
+                <w:webHidden/>
+              </w:rPr>
+              <w:fldChar w:fldCharType="begin"/>
+            </w:r>
+            <w:r>
+              <w:rPr>
+                <w:noProof/>
+                <w:webHidden/>
+              </w:rPr>
+              <w:instrText xml:space="preserve"> PAGEREF _Toc232014368 \h </w:instrText>
+            </w:r>
+            <w:r>
+              <w:rPr>
+                <w:noProof/>
+                <w:webHidden/>
+              </w:rPr>
+            </w:r>
+            <w:r>
+              <w:rPr>
+                <w:noProof/>
+                <w:webHidden/>
+              </w:rPr>
+              <w:fldChar w:fldCharType="separate"/>
+            </w:r>
+            <w:r>
+              <w:rPr>
+                <w:noProof/>
+                <w:webHidden/>
+              </w:rPr>
+              <w:t>24</w:t>
+            </w:r>
+            <w:r>
+              <w:rPr>
+                <w:noProof/>
+                <w:webHidden/>
+              </w:rPr>
+              <w:fldChar w:fldCharType="end"/>
+            </w:r>
+          </w:hyperlink>
+        </w:p>
+        <w:p>
+          <w:pPr>
+            <w:pStyle w:val="Spistreci2"/>
+            <w:tabs>
+              <w:tab w:val="left" w:pos="960"/>
+              <w:tab w:val="right" w:leader="dot" w:pos="9062"/>
+            </w:tabs>
+            <w:rPr>
+              <w:rFonts w:eastAsiaTheme="minorEastAsia"/>
+              <w:noProof/>
+              <w:sz w:val="24"/>
+              <w:szCs w:val="24"/>
+              <w:lang w:eastAsia="pl-PL"/>
+            </w:rPr>
+          </w:pPr>
+          <w:hyperlink w:anchor="_Toc232014369" w:history="1">
+            <w:r>
+              <w:rPr>
+                <w:rStyle w:val="Hipercze"/>
+                <w:noProof/>
+              </w:rPr>
+              <w:t>4.8</w:t>
+            </w:r>
+            <w:r>
+              <w:rPr>
+                <w:rFonts w:eastAsiaTheme="minorEastAsia"/>
+                <w:noProof/>
+                <w:sz w:val="24"/>
+                <w:szCs w:val="24"/>
+                <w:lang w:eastAsia="pl-PL"/>
+              </w:rPr>
+              <w:tab/>
+            </w:r>
+            <w:r>
+              <w:rPr>
+                <w:rStyle w:val="Hipercze"/>
+                <w:noProof/>
+              </w:rPr>
+              <w:t>Dokumentacja interaktywna API</w:t>
+            </w:r>
+            <w:r>
+              <w:rPr>
+                <w:noProof/>
+                <w:webHidden/>
+              </w:rPr>
+              <w:tab/>
+            </w:r>
+            <w:r>
+              <w:rPr>
+                <w:noProof/>
+                <w:webHidden/>
+              </w:rPr>
+              <w:fldChar w:fldCharType="begin"/>
+            </w:r>
+            <w:r>
+              <w:rPr>
+                <w:noProof/>
+                <w:webHidden/>
+              </w:rPr>
+              <w:instrText xml:space="preserve"> PAGEREF _Toc232014369 \h </w:instrText>
+            </w:r>
+            <w:r>
+              <w:rPr>
+                <w:noProof/>
+                <w:webHidden/>
+              </w:rPr>
+            </w:r>
+            <w:r>
+              <w:rPr>
+                <w:noProof/>
+                <w:webHidden/>
+              </w:rPr>
+              <w:fldChar w:fldCharType="separate"/>
+            </w:r>
+            <w:r>
+              <w:rPr>
+                <w:noProof/>
+                <w:webHidden/>
+              </w:rPr>
+              <w:t>24</w:t>
             </w:r>
             <w:r>
               <w:rPr>
@@ -1860,11 +2613,12 @@
             <w:rPr>
               <w:rFonts w:eastAsiaTheme="minorEastAsia"/>
               <w:noProof/>
+              <w:sz w:val="24"/>
               <w:szCs w:val="24"/>
               <w:lang w:eastAsia="pl-PL"/>
             </w:rPr>
           </w:pPr>
-          <w:hyperlink w:anchor="_Toc224203108" w:history="1">
+          <w:hyperlink w:anchor="_Toc232014370" w:history="1">
             <w:r>
               <w:rPr>
                 <w:rStyle w:val="Hipercze"/>
@@ -1876,6 +2630,7 @@
               <w:rPr>
                 <w:rFonts w:eastAsiaTheme="minorEastAsia"/>
                 <w:noProof/>
+                <w:sz w:val="24"/>
                 <w:szCs w:val="24"/>
                 <w:lang w:eastAsia="pl-PL"/>
               </w:rPr>
@@ -1907,7 +2662,7 @@
                 <w:noProof/>
                 <w:webHidden/>
               </w:rPr>
-              <w:instrText xml:space="preserve"> PAGEREF _Toc224203108 \h </w:instrText>
+              <w:instrText xml:space="preserve"> PAGEREF _Toc232014370 \h </w:instrText>
             </w:r>
             <w:r>
               <w:rPr>
@@ -1927,7 +2682,637 @@
                 <w:noProof/>
                 <w:webHidden/>
               </w:rPr>
-              <w:t>6</w:t>
+              <w:t>24</w:t>
+            </w:r>
+            <w:r>
+              <w:rPr>
+                <w:noProof/>
+                <w:webHidden/>
+              </w:rPr>
+              <w:fldChar w:fldCharType="end"/>
+            </w:r>
+          </w:hyperlink>
+        </w:p>
+        <w:p>
+          <w:pPr>
+            <w:pStyle w:val="Spistreci2"/>
+            <w:tabs>
+              <w:tab w:val="left" w:pos="960"/>
+              <w:tab w:val="right" w:leader="dot" w:pos="9062"/>
+            </w:tabs>
+            <w:rPr>
+              <w:rFonts w:eastAsiaTheme="minorEastAsia"/>
+              <w:noProof/>
+              <w:sz w:val="24"/>
+              <w:szCs w:val="24"/>
+              <w:lang w:eastAsia="pl-PL"/>
+            </w:rPr>
+          </w:pPr>
+          <w:hyperlink w:anchor="_Toc232014371" w:history="1">
+            <w:r>
+              <w:rPr>
+                <w:rStyle w:val="Hipercze"/>
+                <w:noProof/>
+              </w:rPr>
+              <w:t>5.1</w:t>
+            </w:r>
+            <w:r>
+              <w:rPr>
+                <w:rFonts w:eastAsiaTheme="minorEastAsia"/>
+                <w:noProof/>
+                <w:sz w:val="24"/>
+                <w:szCs w:val="24"/>
+                <w:lang w:eastAsia="pl-PL"/>
+              </w:rPr>
+              <w:tab/>
+            </w:r>
+            <w:r>
+              <w:rPr>
+                <w:rStyle w:val="Hipercze"/>
+                <w:noProof/>
+              </w:rPr>
+              <w:t>Cel testów</w:t>
+            </w:r>
+            <w:r>
+              <w:rPr>
+                <w:noProof/>
+                <w:webHidden/>
+              </w:rPr>
+              <w:tab/>
+            </w:r>
+            <w:r>
+              <w:rPr>
+                <w:noProof/>
+                <w:webHidden/>
+              </w:rPr>
+              <w:fldChar w:fldCharType="begin"/>
+            </w:r>
+            <w:r>
+              <w:rPr>
+                <w:noProof/>
+                <w:webHidden/>
+              </w:rPr>
+              <w:instrText xml:space="preserve"> PAGEREF _Toc232014371 \h </w:instrText>
+            </w:r>
+            <w:r>
+              <w:rPr>
+                <w:noProof/>
+                <w:webHidden/>
+              </w:rPr>
+            </w:r>
+            <w:r>
+              <w:rPr>
+                <w:noProof/>
+                <w:webHidden/>
+              </w:rPr>
+              <w:fldChar w:fldCharType="separate"/>
+            </w:r>
+            <w:r>
+              <w:rPr>
+                <w:noProof/>
+                <w:webHidden/>
+              </w:rPr>
+              <w:t>24</w:t>
+            </w:r>
+            <w:r>
+              <w:rPr>
+                <w:noProof/>
+                <w:webHidden/>
+              </w:rPr>
+              <w:fldChar w:fldCharType="end"/>
+            </w:r>
+          </w:hyperlink>
+        </w:p>
+        <w:p>
+          <w:pPr>
+            <w:pStyle w:val="Spistreci2"/>
+            <w:tabs>
+              <w:tab w:val="left" w:pos="960"/>
+              <w:tab w:val="right" w:leader="dot" w:pos="9062"/>
+            </w:tabs>
+            <w:rPr>
+              <w:rFonts w:eastAsiaTheme="minorEastAsia"/>
+              <w:noProof/>
+              <w:sz w:val="24"/>
+              <w:szCs w:val="24"/>
+              <w:lang w:eastAsia="pl-PL"/>
+            </w:rPr>
+          </w:pPr>
+          <w:hyperlink w:anchor="_Toc232014372" w:history="1">
+            <w:r>
+              <w:rPr>
+                <w:rStyle w:val="Hipercze"/>
+                <w:noProof/>
+              </w:rPr>
+              <w:t>5.2</w:t>
+            </w:r>
+            <w:r>
+              <w:rPr>
+                <w:rFonts w:eastAsiaTheme="minorEastAsia"/>
+                <w:noProof/>
+                <w:sz w:val="24"/>
+                <w:szCs w:val="24"/>
+                <w:lang w:eastAsia="pl-PL"/>
+              </w:rPr>
+              <w:tab/>
+            </w:r>
+            <w:r>
+              <w:rPr>
+                <w:rStyle w:val="Hipercze"/>
+                <w:noProof/>
+              </w:rPr>
+              <w:t>Organizacja testów</w:t>
+            </w:r>
+            <w:r>
+              <w:rPr>
+                <w:noProof/>
+                <w:webHidden/>
+              </w:rPr>
+              <w:tab/>
+            </w:r>
+            <w:r>
+              <w:rPr>
+                <w:noProof/>
+                <w:webHidden/>
+              </w:rPr>
+              <w:fldChar w:fldCharType="begin"/>
+            </w:r>
+            <w:r>
+              <w:rPr>
+                <w:noProof/>
+                <w:webHidden/>
+              </w:rPr>
+              <w:instrText xml:space="preserve"> PAGEREF _Toc232014372 \h </w:instrText>
+            </w:r>
+            <w:r>
+              <w:rPr>
+                <w:noProof/>
+                <w:webHidden/>
+              </w:rPr>
+            </w:r>
+            <w:r>
+              <w:rPr>
+                <w:noProof/>
+                <w:webHidden/>
+              </w:rPr>
+              <w:fldChar w:fldCharType="separate"/>
+            </w:r>
+            <w:r>
+              <w:rPr>
+                <w:noProof/>
+                <w:webHidden/>
+              </w:rPr>
+              <w:t>25</w:t>
+            </w:r>
+            <w:r>
+              <w:rPr>
+                <w:noProof/>
+                <w:webHidden/>
+              </w:rPr>
+              <w:fldChar w:fldCharType="end"/>
+            </w:r>
+          </w:hyperlink>
+        </w:p>
+        <w:p>
+          <w:pPr>
+            <w:pStyle w:val="Spistreci2"/>
+            <w:tabs>
+              <w:tab w:val="left" w:pos="960"/>
+              <w:tab w:val="right" w:leader="dot" w:pos="9062"/>
+            </w:tabs>
+            <w:rPr>
+              <w:rFonts w:eastAsiaTheme="minorEastAsia"/>
+              <w:noProof/>
+              <w:sz w:val="24"/>
+              <w:szCs w:val="24"/>
+              <w:lang w:eastAsia="pl-PL"/>
+            </w:rPr>
+          </w:pPr>
+          <w:hyperlink w:anchor="_Toc232014373" w:history="1">
+            <w:r>
+              <w:rPr>
+                <w:rStyle w:val="Hipercze"/>
+                <w:noProof/>
+              </w:rPr>
+              <w:t>5.3</w:t>
+            </w:r>
+            <w:r>
+              <w:rPr>
+                <w:rFonts w:eastAsiaTheme="minorEastAsia"/>
+                <w:noProof/>
+                <w:sz w:val="24"/>
+                <w:szCs w:val="24"/>
+                <w:lang w:eastAsia="pl-PL"/>
+              </w:rPr>
+              <w:tab/>
+            </w:r>
+            <w:r>
+              <w:rPr>
+                <w:rStyle w:val="Hipercze"/>
+                <w:noProof/>
+              </w:rPr>
+              <w:t>Przygotowanie danych testowych</w:t>
+            </w:r>
+            <w:r>
+              <w:rPr>
+                <w:noProof/>
+                <w:webHidden/>
+              </w:rPr>
+              <w:tab/>
+            </w:r>
+            <w:r>
+              <w:rPr>
+                <w:noProof/>
+                <w:webHidden/>
+              </w:rPr>
+              <w:fldChar w:fldCharType="begin"/>
+            </w:r>
+            <w:r>
+              <w:rPr>
+                <w:noProof/>
+                <w:webHidden/>
+              </w:rPr>
+              <w:instrText xml:space="preserve"> PAGEREF _Toc232014373 \h </w:instrText>
+            </w:r>
+            <w:r>
+              <w:rPr>
+                <w:noProof/>
+                <w:webHidden/>
+              </w:rPr>
+            </w:r>
+            <w:r>
+              <w:rPr>
+                <w:noProof/>
+                <w:webHidden/>
+              </w:rPr>
+              <w:fldChar w:fldCharType="separate"/>
+            </w:r>
+            <w:r>
+              <w:rPr>
+                <w:noProof/>
+                <w:webHidden/>
+              </w:rPr>
+              <w:t>27</w:t>
+            </w:r>
+            <w:r>
+              <w:rPr>
+                <w:noProof/>
+                <w:webHidden/>
+              </w:rPr>
+              <w:fldChar w:fldCharType="end"/>
+            </w:r>
+          </w:hyperlink>
+        </w:p>
+        <w:p>
+          <w:pPr>
+            <w:pStyle w:val="Spistreci2"/>
+            <w:tabs>
+              <w:tab w:val="left" w:pos="960"/>
+              <w:tab w:val="right" w:leader="dot" w:pos="9062"/>
+            </w:tabs>
+            <w:rPr>
+              <w:rFonts w:eastAsiaTheme="minorEastAsia"/>
+              <w:noProof/>
+              <w:sz w:val="24"/>
+              <w:szCs w:val="24"/>
+              <w:lang w:eastAsia="pl-PL"/>
+            </w:rPr>
+          </w:pPr>
+          <w:hyperlink w:anchor="_Toc232014374" w:history="1">
+            <w:r>
+              <w:rPr>
+                <w:rStyle w:val="Hipercze"/>
+                <w:noProof/>
+              </w:rPr>
+              <w:t>5.4</w:t>
+            </w:r>
+            <w:r>
+              <w:rPr>
+                <w:rFonts w:eastAsiaTheme="minorEastAsia"/>
+                <w:noProof/>
+                <w:sz w:val="24"/>
+                <w:szCs w:val="24"/>
+                <w:lang w:eastAsia="pl-PL"/>
+              </w:rPr>
+              <w:tab/>
+            </w:r>
+            <w:r>
+              <w:rPr>
+                <w:rStyle w:val="Hipercze"/>
+                <w:noProof/>
+              </w:rPr>
+              <w:t>Testy opieki duszpasterskiej i kartotek (Pastoral Care)</w:t>
+            </w:r>
+            <w:r>
+              <w:rPr>
+                <w:noProof/>
+                <w:webHidden/>
+              </w:rPr>
+              <w:tab/>
+            </w:r>
+            <w:r>
+              <w:rPr>
+                <w:noProof/>
+                <w:webHidden/>
+              </w:rPr>
+              <w:fldChar w:fldCharType="begin"/>
+            </w:r>
+            <w:r>
+              <w:rPr>
+                <w:noProof/>
+                <w:webHidden/>
+              </w:rPr>
+              <w:instrText xml:space="preserve"> PAGEREF _Toc232014374 \h </w:instrText>
+            </w:r>
+            <w:r>
+              <w:rPr>
+                <w:noProof/>
+                <w:webHidden/>
+              </w:rPr>
+            </w:r>
+            <w:r>
+              <w:rPr>
+                <w:noProof/>
+                <w:webHidden/>
+              </w:rPr>
+              <w:fldChar w:fldCharType="separate"/>
+            </w:r>
+            <w:r>
+              <w:rPr>
+                <w:noProof/>
+                <w:webHidden/>
+              </w:rPr>
+              <w:t>27</w:t>
+            </w:r>
+            <w:r>
+              <w:rPr>
+                <w:noProof/>
+                <w:webHidden/>
+              </w:rPr>
+              <w:fldChar w:fldCharType="end"/>
+            </w:r>
+          </w:hyperlink>
+        </w:p>
+        <w:p>
+          <w:pPr>
+            <w:pStyle w:val="Spistreci2"/>
+            <w:tabs>
+              <w:tab w:val="left" w:pos="960"/>
+              <w:tab w:val="right" w:leader="dot" w:pos="9062"/>
+            </w:tabs>
+            <w:rPr>
+              <w:rFonts w:eastAsiaTheme="minorEastAsia"/>
+              <w:noProof/>
+              <w:sz w:val="24"/>
+              <w:szCs w:val="24"/>
+              <w:lang w:eastAsia="pl-PL"/>
+            </w:rPr>
+          </w:pPr>
+          <w:hyperlink w:anchor="_Toc232014375" w:history="1">
+            <w:r>
+              <w:rPr>
+                <w:rStyle w:val="Hipercze"/>
+                <w:noProof/>
+              </w:rPr>
+              <w:t>5.5</w:t>
+            </w:r>
+            <w:r>
+              <w:rPr>
+                <w:rFonts w:eastAsiaTheme="minorEastAsia"/>
+                <w:noProof/>
+                <w:sz w:val="24"/>
+                <w:szCs w:val="24"/>
+                <w:lang w:eastAsia="pl-PL"/>
+              </w:rPr>
+              <w:tab/>
+            </w:r>
+            <w:r>
+              <w:rPr>
+                <w:rStyle w:val="Hipercze"/>
+                <w:noProof/>
+              </w:rPr>
+              <w:t>Testy grup parafialnych (Parish Groups)</w:t>
+            </w:r>
+            <w:r>
+              <w:rPr>
+                <w:noProof/>
+                <w:webHidden/>
+              </w:rPr>
+              <w:tab/>
+            </w:r>
+            <w:r>
+              <w:rPr>
+                <w:noProof/>
+                <w:webHidden/>
+              </w:rPr>
+              <w:fldChar w:fldCharType="begin"/>
+            </w:r>
+            <w:r>
+              <w:rPr>
+                <w:noProof/>
+                <w:webHidden/>
+              </w:rPr>
+              <w:instrText xml:space="preserve"> PAGEREF _Toc232014375 \h </w:instrText>
+            </w:r>
+            <w:r>
+              <w:rPr>
+                <w:noProof/>
+                <w:webHidden/>
+              </w:rPr>
+            </w:r>
+            <w:r>
+              <w:rPr>
+                <w:noProof/>
+                <w:webHidden/>
+              </w:rPr>
+              <w:fldChar w:fldCharType="separate"/>
+            </w:r>
+            <w:r>
+              <w:rPr>
+                <w:noProof/>
+                <w:webHidden/>
+              </w:rPr>
+              <w:t>29</w:t>
+            </w:r>
+            <w:r>
+              <w:rPr>
+                <w:noProof/>
+                <w:webHidden/>
+              </w:rPr>
+              <w:fldChar w:fldCharType="end"/>
+            </w:r>
+          </w:hyperlink>
+        </w:p>
+        <w:p>
+          <w:pPr>
+            <w:pStyle w:val="Spistreci2"/>
+            <w:tabs>
+              <w:tab w:val="left" w:pos="960"/>
+              <w:tab w:val="right" w:leader="dot" w:pos="9062"/>
+            </w:tabs>
+            <w:rPr>
+              <w:rFonts w:eastAsiaTheme="minorEastAsia"/>
+              <w:noProof/>
+              <w:sz w:val="24"/>
+              <w:szCs w:val="24"/>
+              <w:lang w:eastAsia="pl-PL"/>
+            </w:rPr>
+          </w:pPr>
+          <w:hyperlink w:anchor="_Toc232014376" w:history="1">
+            <w:r>
+              <w:rPr>
+                <w:rStyle w:val="Hipercze"/>
+                <w:noProof/>
+              </w:rPr>
+              <w:t>5.6</w:t>
+            </w:r>
+            <w:r>
+              <w:rPr>
+                <w:rFonts w:eastAsiaTheme="minorEastAsia"/>
+                <w:noProof/>
+                <w:sz w:val="24"/>
+                <w:szCs w:val="24"/>
+                <w:lang w:eastAsia="pl-PL"/>
+              </w:rPr>
+              <w:tab/>
+            </w:r>
+            <w:r>
+              <w:rPr>
+                <w:rStyle w:val="Hipercze"/>
+                <w:noProof/>
+              </w:rPr>
+              <w:t>Testy organizacji wydarzeń i harmonogramów (Event Coordination)</w:t>
+            </w:r>
+            <w:r>
+              <w:rPr>
+                <w:noProof/>
+                <w:webHidden/>
+              </w:rPr>
+              <w:tab/>
+            </w:r>
+            <w:r>
+              <w:rPr>
+                <w:noProof/>
+                <w:webHidden/>
+              </w:rPr>
+              <w:fldChar w:fldCharType="begin"/>
+            </w:r>
+            <w:r>
+              <w:rPr>
+                <w:noProof/>
+                <w:webHidden/>
+              </w:rPr>
+              <w:instrText xml:space="preserve"> PAGEREF _Toc232014376 \h </w:instrText>
+            </w:r>
+            <w:r>
+              <w:rPr>
+                <w:noProof/>
+                <w:webHidden/>
+              </w:rPr>
+            </w:r>
+            <w:r>
+              <w:rPr>
+                <w:noProof/>
+                <w:webHidden/>
+              </w:rPr>
+              <w:fldChar w:fldCharType="separate"/>
+            </w:r>
+            <w:r>
+              <w:rPr>
+                <w:noProof/>
+                <w:webHidden/>
+              </w:rPr>
+              <w:t>30</w:t>
+            </w:r>
+            <w:r>
+              <w:rPr>
+                <w:noProof/>
+                <w:webHidden/>
+              </w:rPr>
+              <w:fldChar w:fldCharType="end"/>
+            </w:r>
+          </w:hyperlink>
+        </w:p>
+        <w:p>
+          <w:pPr>
+            <w:pStyle w:val="Spistreci2"/>
+            <w:tabs>
+              <w:tab w:val="left" w:pos="960"/>
+              <w:tab w:val="right" w:leader="dot" w:pos="9062"/>
+            </w:tabs>
+            <w:rPr>
+              <w:rFonts w:eastAsiaTheme="minorEastAsia"/>
+              <w:noProof/>
+              <w:sz w:val="24"/>
+              <w:szCs w:val="24"/>
+              <w:lang w:eastAsia="pl-PL"/>
+            </w:rPr>
+          </w:pPr>
+          <w:hyperlink w:anchor="_Toc232014377" w:history="1">
+            <w:r>
+              <w:rPr>
+                <w:rStyle w:val="Hipercze"/>
+                <w:noProof/>
+              </w:rPr>
+              <w:t>5.7</w:t>
+            </w:r>
+            <w:r>
+              <w:rPr>
+                <w:rFonts w:eastAsiaTheme="minorEastAsia"/>
+                <w:noProof/>
+                <w:sz w:val="24"/>
+                <w:szCs w:val="24"/>
+                <w:lang w:eastAsia="pl-PL"/>
+              </w:rPr>
+              <w:tab/>
+            </w:r>
+            <w:r>
+              <w:rPr>
+                <w:rStyle w:val="Hipercze"/>
+                <w:noProof/>
+              </w:rPr>
+              <w:t>Podsumowanie</w:t>
+            </w:r>
+            <w:r>
+              <w:rPr>
+                <w:noProof/>
+                <w:webHidden/>
+              </w:rPr>
+              <w:tab/>
+            </w:r>
+            <w:r>
+              <w:rPr>
+                <w:noProof/>
+                <w:webHidden/>
+              </w:rPr>
+              <w:fldChar w:fldCharType="begin"/>
+            </w:r>
+            <w:r>
+              <w:rPr>
+                <w:noProof/>
+                <w:webHidden/>
+              </w:rPr>
+              <w:instrText xml:space="preserve"> PAGEREF _Toc232014377 \h </w:instrText>
+            </w:r>
+            <w:r>
+              <w:rPr>
+                <w:noProof/>
+                <w:webHidden/>
+              </w:rPr>
+            </w:r>
+            <w:r>
+              <w:rPr>
+                <w:noProof/>
+                <w:webHidden/>
+              </w:rPr>
+              <w:fldChar w:fldCharType="separate"/>
+            </w:r>
+            <w:r>
+              <w:rPr>
+                <w:noProof/>
+                <w:webHidden/>
+              </w:rPr>
+              <w:t>31</w:t>
             </w:r>
             <w:r>
               <w:rPr>
@@ -1948,11 +3333,12 @@
             <w:rPr>
               <w:rFonts w:eastAsiaTheme="minorEastAsia"/>
               <w:noProof/>
+              <w:sz w:val="24"/>
               <w:szCs w:val="24"/>
               <w:lang w:eastAsia="pl-PL"/>
             </w:rPr>
           </w:pPr>
-          <w:hyperlink w:anchor="_Toc224203109" w:history="1">
+          <w:hyperlink w:anchor="_Toc232014378" w:history="1">
             <w:r>
               <w:rPr>
                 <w:rStyle w:val="Hipercze"/>
@@ -1964,6 +3350,7 @@
               <w:rPr>
                 <w:rFonts w:eastAsiaTheme="minorEastAsia"/>
                 <w:noProof/>
+                <w:sz w:val="24"/>
                 <w:szCs w:val="24"/>
                 <w:lang w:eastAsia="pl-PL"/>
               </w:rPr>
@@ -1995,7 +3382,7 @@
                 <w:noProof/>
                 <w:webHidden/>
               </w:rPr>
-              <w:instrText xml:space="preserve"> PAGEREF _Toc224203109 \h </w:instrText>
+              <w:instrText xml:space="preserve"> PAGEREF _Toc232014378 \h </w:instrText>
             </w:r>
             <w:r>
               <w:rPr>
@@ -2015,7 +3402,7 @@
                 <w:noProof/>
                 <w:webHidden/>
               </w:rPr>
-              <w:t>6</w:t>
+              <w:t>31</w:t>
             </w:r>
             <w:r>
               <w:rPr>
@@ -2036,11 +3423,12 @@
             <w:rPr>
               <w:rFonts w:eastAsiaTheme="minorEastAsia"/>
               <w:noProof/>
+              <w:sz w:val="24"/>
               <w:szCs w:val="24"/>
               <w:lang w:eastAsia="pl-PL"/>
             </w:rPr>
           </w:pPr>
-          <w:hyperlink w:anchor="_Toc224203110" w:history="1">
+          <w:hyperlink w:anchor="_Toc232014379" w:history="1">
             <w:r>
               <w:rPr>
                 <w:rStyle w:val="Hipercze"/>
@@ -2052,6 +3440,7 @@
               <w:rPr>
                 <w:rFonts w:eastAsiaTheme="minorEastAsia"/>
                 <w:noProof/>
+                <w:sz w:val="24"/>
                 <w:szCs w:val="24"/>
                 <w:lang w:eastAsia="pl-PL"/>
               </w:rPr>
@@ -2083,7 +3472,7 @@
                 <w:noProof/>
                 <w:webHidden/>
               </w:rPr>
-              <w:instrText xml:space="preserve"> PAGEREF _Toc224203110 \h </w:instrText>
+              <w:instrText xml:space="preserve"> PAGEREF _Toc232014379 \h </w:instrText>
             </w:r>
             <w:r>
               <w:rPr>
@@ -2103,7 +3492,7 @@
                 <w:noProof/>
                 <w:webHidden/>
               </w:rPr>
-              <w:t>6</w:t>
+              <w:t>31</w:t>
             </w:r>
             <w:r>
               <w:rPr>
@@ -2142,7 +3531,6 @@
           <w:szCs w:val="32"/>
         </w:rPr>
       </w:pPr>
-      <w:bookmarkStart w:id="0" w:name="_Toc224203095"/>
       <w:r>
         <w:br w:type="page"/>
       </w:r>
@@ -2151,6 +3539,7 @@
       <w:pPr>
         <w:pStyle w:val="Nagwek1"/>
       </w:pPr>
+      <w:bookmarkStart w:id="0" w:name="_Toc232014349"/>
       <w:r>
         <w:lastRenderedPageBreak/>
         <w:t>Wprowadzenie</w:t>
@@ -2180,7 +3569,7 @@
       <w:pPr>
         <w:pStyle w:val="Nagwek1"/>
       </w:pPr>
-      <w:bookmarkStart w:id="1" w:name="_Toc224203096"/>
+      <w:bookmarkStart w:id="1" w:name="_Toc232014350"/>
       <w:r>
         <w:t>Analiza</w:t>
       </w:r>
@@ -2190,14 +3579,13 @@
       <w:pPr>
         <w:pStyle w:val="Nagwek2"/>
       </w:pPr>
-      <w:bookmarkStart w:id="2" w:name="_Toc224203097"/>
+      <w:bookmarkStart w:id="2" w:name="_Toc232014351"/>
       <w:r>
         <w:t>Opis wymagań</w:t>
       </w:r>
       <w:bookmarkEnd w:id="2"/>
     </w:p>
     <w:p>
-      <w:bookmarkStart w:id="3" w:name="_Toc224203098"/>
       <w:r>
         <w:t xml:space="preserve">System </w:t>
       </w:r>
@@ -2508,6 +3896,7 @@
       <w:pPr>
         <w:pStyle w:val="Nagwek2"/>
       </w:pPr>
+      <w:bookmarkStart w:id="3" w:name="_Toc232014352"/>
       <w:r>
         <w:lastRenderedPageBreak/>
         <w:t xml:space="preserve">Model </w:t>
@@ -2524,7 +3913,7 @@
       <w:pPr>
         <w:pStyle w:val="Nagwek3"/>
       </w:pPr>
-      <w:bookmarkStart w:id="4" w:name="_Toc224203099"/>
+      <w:bookmarkStart w:id="4" w:name="_Toc232014353"/>
       <w:r>
         <w:t>Odk</w:t>
       </w:r>
@@ -2537,7 +3926,6 @@
       <w:r>
         <w:t>pojęć</w:t>
       </w:r>
-      <w:bookmarkStart w:id="5" w:name="_Toc224203100"/>
       <w:bookmarkEnd w:id="4"/>
     </w:p>
     <w:p>
@@ -3773,27 +5161,14 @@
       <w:r>
         <w:t xml:space="preserve">Tabela </w:t>
       </w:r>
-      <w:r>
-        <w:fldChar w:fldCharType="begin"/>
-      </w:r>
-      <w:r>
-        <w:instrText xml:space="preserve"> SEQ Tabela \* ARABIC </w:instrText>
-      </w:r>
-      <w:r>
-        <w:fldChar w:fldCharType="separate"/>
-      </w:r>
-      <w:r>
-        <w:rPr>
-          <w:noProof/>
-        </w:rPr>
-        <w:t>1</w:t>
-      </w:r>
-      <w:r>
-        <w:rPr>
-          <w:noProof/>
-        </w:rPr>
-        <w:fldChar w:fldCharType="end"/>
-      </w:r>
+      <w:fldSimple w:instr=" SEQ Tabela \* ARABIC ">
+        <w:r>
+          <w:rPr>
+            <w:noProof/>
+          </w:rPr>
+          <w:t>1</w:t>
+        </w:r>
+      </w:fldSimple>
       <w:r>
         <w:t>. Opis encji</w:t>
       </w:r>
@@ -3802,11 +5177,11 @@
       <w:pPr>
         <w:pStyle w:val="Nagwek3"/>
       </w:pPr>
+      <w:bookmarkStart w:id="5" w:name="_Toc232014354"/>
       <w:r>
         <w:lastRenderedPageBreak/>
         <w:t>Szkic modelu dziedziny</w:t>
       </w:r>
-      <w:bookmarkStart w:id="6" w:name="_Toc224203101"/>
       <w:bookmarkEnd w:id="5"/>
     </w:p>
     <w:p>
@@ -3865,27 +5240,14 @@
       <w:r>
         <w:t xml:space="preserve">Rysunek </w:t>
       </w:r>
-      <w:r>
-        <w:fldChar w:fldCharType="begin"/>
-      </w:r>
-      <w:r>
-        <w:instrText xml:space="preserve"> SEQ Rysunek \* ARABIC </w:instrText>
-      </w:r>
-      <w:r>
-        <w:fldChar w:fldCharType="separate"/>
-      </w:r>
-      <w:r>
-        <w:rPr>
-          <w:noProof/>
-        </w:rPr>
-        <w:t>1</w:t>
-      </w:r>
-      <w:r>
-        <w:rPr>
-          <w:noProof/>
-        </w:rPr>
-        <w:fldChar w:fldCharType="end"/>
-      </w:r>
+      <w:fldSimple w:instr=" SEQ Rysunek \* ARABIC ">
+        <w:r>
+          <w:rPr>
+            <w:noProof/>
+          </w:rPr>
+          <w:t>1</w:t>
+        </w:r>
+      </w:fldSimple>
       <w:r>
         <w:t>. Diagram ERD</w:t>
       </w:r>
@@ -3947,27 +5309,14 @@
       <w:r>
         <w:t xml:space="preserve">Rysunek </w:t>
       </w:r>
-      <w:r>
-        <w:fldChar w:fldCharType="begin"/>
-      </w:r>
-      <w:r>
-        <w:instrText xml:space="preserve"> SEQ Rysunek \* ARABIC </w:instrText>
-      </w:r>
-      <w:r>
-        <w:fldChar w:fldCharType="separate"/>
-      </w:r>
-      <w:r>
-        <w:rPr>
-          <w:noProof/>
-        </w:rPr>
-        <w:t>2</w:t>
-      </w:r>
-      <w:r>
-        <w:rPr>
-          <w:noProof/>
-        </w:rPr>
-        <w:fldChar w:fldCharType="end"/>
-      </w:r>
+      <w:fldSimple w:instr=" SEQ Rysunek \* ARABIC ">
+        <w:r>
+          <w:rPr>
+            <w:noProof/>
+          </w:rPr>
+          <w:t>2</w:t>
+        </w:r>
+      </w:fldSimple>
       <w:r>
         <w:t>. Diagram relacyjny</w:t>
       </w:r>
@@ -4055,27 +5404,14 @@
       <w:r>
         <w:t xml:space="preserve">Rysunek </w:t>
       </w:r>
-      <w:r>
-        <w:fldChar w:fldCharType="begin"/>
-      </w:r>
-      <w:r>
-        <w:instrText xml:space="preserve"> SEQ Rysunek \* ARABIC </w:instrText>
-      </w:r>
-      <w:r>
-        <w:fldChar w:fldCharType="separate"/>
-      </w:r>
-      <w:r>
-        <w:rPr>
-          <w:noProof/>
-        </w:rPr>
-        <w:t>3</w:t>
-      </w:r>
-      <w:r>
-        <w:rPr>
-          <w:noProof/>
-        </w:rPr>
-        <w:fldChar w:fldCharType="end"/>
-      </w:r>
+      <w:fldSimple w:instr=" SEQ Rysunek \* ARABIC ">
+        <w:r>
+          <w:rPr>
+            <w:noProof/>
+          </w:rPr>
+          <w:t>3</w:t>
+        </w:r>
+      </w:fldSimple>
       <w:r>
         <w:t>. Diagram relacyjny po podziale na konteksty</w:t>
       </w:r>
@@ -4122,7 +5458,7 @@
               </wp:anchor>
             </w:drawing>
           </mc:Choice>
-          <mc:Fallback xmlns:w16sdtfl="http://schemas.microsoft.com/office/word/2024/wordml/sdtformatlock" xmlns:w16sdtdh="http://schemas.microsoft.com/office/word/2020/wordml/sdtdatahash" xmlns:w16du="http://schemas.microsoft.com/office/word/2023/wordml/word16du" xmlns:w16="http://schemas.microsoft.com/office/word/2018/wordml" xmlns:w16cid="http://schemas.microsoft.com/office/word/2016/wordml/cid" xmlns:w16cex="http://schemas.microsoft.com/office/word/2018/wordml/cex" xmlns:oel="http://schemas.microsoft.com/office/2019/extlst" xmlns:am3d="http://schemas.microsoft.com/office/drawing/2017/model3d" xmlns:aink="http://schemas.microsoft.com/office/drawing/2016/ink" xmlns:cx8="http://schemas.microsoft.com/office/drawing/2016/5/14/chartex" xmlns:cx7="http://schemas.microsoft.com/office/drawing/2016/5/13/chartex" xmlns:cx6="http://schemas.microsoft.com/office/drawing/2016/5/12/chartex" xmlns:cx5="http://schemas.microsoft.com/office/drawing/2016/5/11/chartex" xmlns:cx4="http://schemas.microsoft.com/office/drawing/2016/5/10/chartex" xmlns:cx3="http://schemas.microsoft.com/office/drawing/2016/5/9/chartex" xmlns:cx2="http://schemas.microsoft.com/office/drawing/2015/10/21/chartex">
+          <mc:Fallback>
             <w:pict>
               <v:shapetype w14:anchorId="286D09DB" id="_x0000_t75" coordsize="21600,21600" o:spt="75" o:preferrelative="t" path="m@4@5l@4@11@9@11@9@5xe" filled="f" stroked="f">
                 <v:stroke joinstyle="miter"/>
@@ -5115,6 +6451,7 @@
       <w:pPr>
         <w:pStyle w:val="Nagwek3"/>
       </w:pPr>
+      <w:bookmarkStart w:id="6" w:name="_Toc232014355"/>
       <w:r>
         <w:lastRenderedPageBreak/>
         <w:t>Wyjaśnienie modelu</w:t>
@@ -5189,7 +6526,15 @@
           </w:tcPr>
           <w:p>
             <w:r>
-              <w:t>Parafia – Pracownik (1:N)</w:t>
+              <w:t>Parafia – Pracownik (</w:t>
+            </w:r>
+            <w:proofErr w:type="gramStart"/>
+            <w:r>
+              <w:t>1:N</w:t>
+            </w:r>
+            <w:proofErr w:type="gramEnd"/>
+            <w:r>
+              <w:t>)</w:t>
             </w:r>
           </w:p>
         </w:tc>
@@ -5211,7 +6556,15 @@
           </w:tcPr>
           <w:p>
             <w:r>
-              <w:t>Pracownik – Stanowisko (1:N)</w:t>
+              <w:t>Pracownik – Stanowisko (</w:t>
+            </w:r>
+            <w:proofErr w:type="gramStart"/>
+            <w:r>
+              <w:t>1:N</w:t>
+            </w:r>
+            <w:proofErr w:type="gramEnd"/>
+            <w:r>
+              <w:t>)</w:t>
             </w:r>
           </w:p>
         </w:tc>
@@ -5233,7 +6586,15 @@
           </w:tcPr>
           <w:p>
             <w:r>
-              <w:t>Stanowisko – Obowiązek (1:N)</w:t>
+              <w:t>Stanowisko – Obowiązek (</w:t>
+            </w:r>
+            <w:proofErr w:type="gramStart"/>
+            <w:r>
+              <w:t>1:N</w:t>
+            </w:r>
+            <w:proofErr w:type="gramEnd"/>
+            <w:r>
+              <w:t>)</w:t>
             </w:r>
           </w:p>
         </w:tc>
@@ -5255,7 +6616,15 @@
           </w:tcPr>
           <w:p>
             <w:r>
-              <w:t>Parafia – Parafianin (1:N)</w:t>
+              <w:t>Parafia – Parafianin (</w:t>
+            </w:r>
+            <w:proofErr w:type="gramStart"/>
+            <w:r>
+              <w:t>1:N</w:t>
+            </w:r>
+            <w:proofErr w:type="gramEnd"/>
+            <w:r>
+              <w:t>)</w:t>
             </w:r>
           </w:p>
         </w:tc>
@@ -5277,7 +6646,15 @@
           </w:tcPr>
           <w:p>
             <w:r>
-              <w:t>Parafianin – Członkostwo (1:N)</w:t>
+              <w:t>Parafianin – Członkostwo (</w:t>
+            </w:r>
+            <w:proofErr w:type="gramStart"/>
+            <w:r>
+              <w:t>1:N</w:t>
+            </w:r>
+            <w:proofErr w:type="gramEnd"/>
+            <w:r>
+              <w:t>)</w:t>
             </w:r>
           </w:p>
         </w:tc>
@@ -5299,7 +6676,15 @@
           </w:tcPr>
           <w:p>
             <w:r>
-              <w:t>Grupa – Członkostwo (1:N)</w:t>
+              <w:t>Grupa – Członkostwo (</w:t>
+            </w:r>
+            <w:proofErr w:type="gramStart"/>
+            <w:r>
+              <w:t>1:N</w:t>
+            </w:r>
+            <w:proofErr w:type="gramEnd"/>
+            <w:r>
+              <w:t>)</w:t>
             </w:r>
           </w:p>
         </w:tc>
@@ -5321,7 +6706,15 @@
           </w:tcPr>
           <w:p>
             <w:r>
-              <w:t>Rodzina – Parafianin (1:N)</w:t>
+              <w:t>Rodzina – Parafianin (</w:t>
+            </w:r>
+            <w:proofErr w:type="gramStart"/>
+            <w:r>
+              <w:t>1:N</w:t>
+            </w:r>
+            <w:proofErr w:type="gramEnd"/>
+            <w:r>
+              <w:t>)</w:t>
             </w:r>
           </w:p>
         </w:tc>
@@ -5392,7 +6785,15 @@
           </w:tcPr>
           <w:p>
             <w:r>
-              <w:t>Kartoteka – Dokument (1:N)</w:t>
+              <w:t>Kartoteka – Dokument (</w:t>
+            </w:r>
+            <w:proofErr w:type="gramStart"/>
+            <w:r>
+              <w:t>1:N</w:t>
+            </w:r>
+            <w:proofErr w:type="gramEnd"/>
+            <w:r>
+              <w:t>)</w:t>
             </w:r>
           </w:p>
         </w:tc>
@@ -5439,7 +6840,15 @@
               <w:t xml:space="preserve">Diecezja – Miejscowość </w:t>
             </w:r>
             <w:r>
-              <w:t>(1:N)</w:t>
+              <w:t>(</w:t>
+            </w:r>
+            <w:proofErr w:type="gramStart"/>
+            <w:r>
+              <w:t>1:N</w:t>
+            </w:r>
+            <w:proofErr w:type="gramEnd"/>
+            <w:r>
+              <w:t>)</w:t>
             </w:r>
           </w:p>
         </w:tc>
@@ -5464,7 +6873,15 @@
           </w:tcPr>
           <w:p>
             <w:r>
-              <w:t>Parafia – Ksiądz (1:N)</w:t>
+              <w:t>Parafia – Ksiądz (</w:t>
+            </w:r>
+            <w:proofErr w:type="gramStart"/>
+            <w:r>
+              <w:t>1:N</w:t>
+            </w:r>
+            <w:proofErr w:type="gramEnd"/>
+            <w:r>
+              <w:t>)</w:t>
             </w:r>
           </w:p>
         </w:tc>
@@ -5486,7 +6903,15 @@
           </w:tcPr>
           <w:p>
             <w:r>
-              <w:t>Ksiądz – Udzielanie sakramentu (1:N)</w:t>
+              <w:t>Ksiądz – Udzielanie sakramentu (</w:t>
+            </w:r>
+            <w:proofErr w:type="gramStart"/>
+            <w:r>
+              <w:t>1:N</w:t>
+            </w:r>
+            <w:proofErr w:type="gramEnd"/>
+            <w:r>
+              <w:t>)</w:t>
             </w:r>
           </w:p>
         </w:tc>
@@ -5508,7 +6933,15 @@
           </w:tcPr>
           <w:p>
             <w:r>
-              <w:t>Sakrament – Udzielanie sakramentu (1:N)</w:t>
+              <w:t>Sakrament – Udzielanie sakramentu (</w:t>
+            </w:r>
+            <w:proofErr w:type="gramStart"/>
+            <w:r>
+              <w:t>1:N</w:t>
+            </w:r>
+            <w:proofErr w:type="gramEnd"/>
+            <w:r>
+              <w:t>)</w:t>
             </w:r>
           </w:p>
         </w:tc>
@@ -5530,7 +6963,15 @@
           </w:tcPr>
           <w:p>
             <w:r>
-              <w:t>Parafia – Wydarzenie (1:N)</w:t>
+              <w:t>Parafia – Wydarzenie (</w:t>
+            </w:r>
+            <w:proofErr w:type="gramStart"/>
+            <w:r>
+              <w:t>1:N</w:t>
+            </w:r>
+            <w:proofErr w:type="gramEnd"/>
+            <w:r>
+              <w:t>)</w:t>
             </w:r>
           </w:p>
         </w:tc>
@@ -5557,7 +6998,15 @@
             </w:r>
             <w:proofErr w:type="spellEnd"/>
             <w:r>
-              <w:t xml:space="preserve"> – Wydarzenie (1:N)</w:t>
+              <w:t xml:space="preserve"> – Wydarzenie (</w:t>
+            </w:r>
+            <w:proofErr w:type="gramStart"/>
+            <w:r>
+              <w:t>1:N</w:t>
+            </w:r>
+            <w:proofErr w:type="gramEnd"/>
+            <w:r>
+              <w:t>)</w:t>
             </w:r>
           </w:p>
         </w:tc>
@@ -5580,7 +7029,15 @@
           <w:p>
             <w:r>
               <w:lastRenderedPageBreak/>
-              <w:t>Harmonogram – Wydarzenie (1:N)</w:t>
+              <w:t>Harmonogram – Wydarzenie (</w:t>
+            </w:r>
+            <w:proofErr w:type="gramStart"/>
+            <w:r>
+              <w:t>1:N</w:t>
+            </w:r>
+            <w:proofErr w:type="gramEnd"/>
+            <w:r>
+              <w:t>)</w:t>
             </w:r>
           </w:p>
         </w:tc>
@@ -5610,7 +7067,15 @@
           </w:tcPr>
           <w:p>
             <w:r>
-              <w:t>Wydarzenie – Intencja (1:N)</w:t>
+              <w:t>Wydarzenie – Intencja (</w:t>
+            </w:r>
+            <w:proofErr w:type="gramStart"/>
+            <w:r>
+              <w:t>1:N</w:t>
+            </w:r>
+            <w:proofErr w:type="gramEnd"/>
+            <w:r>
+              <w:t>)</w:t>
             </w:r>
           </w:p>
         </w:tc>
@@ -5632,7 +7097,15 @@
           </w:tcPr>
           <w:p>
             <w:r>
-              <w:t>Wydarzenie – Ofiara (1:N)</w:t>
+              <w:t>Wydarzenie – Ofiara (</w:t>
+            </w:r>
+            <w:proofErr w:type="gramStart"/>
+            <w:r>
+              <w:t>1:N</w:t>
+            </w:r>
+            <w:proofErr w:type="gramEnd"/>
+            <w:r>
+              <w:t>)</w:t>
             </w:r>
           </w:p>
         </w:tc>
@@ -5654,7 +7127,15 @@
           </w:tcPr>
           <w:p>
             <w:r>
-              <w:t>Wydarzenie – Ogłoszenie (1:N)</w:t>
+              <w:t>Wydarzenie – Ogłoszenie (</w:t>
+            </w:r>
+            <w:proofErr w:type="gramStart"/>
+            <w:r>
+              <w:t>1:N</w:t>
+            </w:r>
+            <w:proofErr w:type="gramEnd"/>
+            <w:r>
+              <w:t>)</w:t>
             </w:r>
           </w:p>
         </w:tc>
@@ -5676,7 +7157,15 @@
           </w:tcPr>
           <w:p>
             <w:r>
-              <w:t>Wydarzenie – Organizator (1:N)</w:t>
+              <w:t>Wydarzenie – Organizator (</w:t>
+            </w:r>
+            <w:proofErr w:type="gramStart"/>
+            <w:r>
+              <w:t>1:N</w:t>
+            </w:r>
+            <w:proofErr w:type="gramEnd"/>
+            <w:r>
+              <w:t>)</w:t>
             </w:r>
           </w:p>
         </w:tc>
@@ -5698,7 +7187,15 @@
           </w:tcPr>
           <w:p>
             <w:r>
-              <w:t>Wydarzenie – Uczestnik (1:N)</w:t>
+              <w:t>Wydarzenie – Uczestnik (</w:t>
+            </w:r>
+            <w:proofErr w:type="gramStart"/>
+            <w:r>
+              <w:t>1:N</w:t>
+            </w:r>
+            <w:proofErr w:type="gramEnd"/>
+            <w:r>
+              <w:t>)</w:t>
             </w:r>
           </w:p>
         </w:tc>
@@ -5721,27 +7218,14 @@
       <w:r>
         <w:t xml:space="preserve">Tabela </w:t>
       </w:r>
-      <w:r>
-        <w:fldChar w:fldCharType="begin"/>
-      </w:r>
-      <w:r>
-        <w:instrText xml:space="preserve"> SEQ Tabela \* ARABIC </w:instrText>
-      </w:r>
-      <w:r>
-        <w:fldChar w:fldCharType="separate"/>
-      </w:r>
-      <w:r>
-        <w:rPr>
-          <w:noProof/>
-        </w:rPr>
-        <w:t>2</w:t>
-      </w:r>
-      <w:r>
-        <w:rPr>
-          <w:noProof/>
-        </w:rPr>
-        <w:fldChar w:fldCharType="end"/>
-      </w:r>
+      <w:fldSimple w:instr=" SEQ Tabela \* ARABIC ">
+        <w:r>
+          <w:rPr>
+            <w:noProof/>
+          </w:rPr>
+          <w:t>2</w:t>
+        </w:r>
+      </w:fldSimple>
       <w:r>
         <w:t>. Opis relacji</w:t>
       </w:r>
@@ -5757,7 +7241,6 @@
           <w:szCs w:val="28"/>
         </w:rPr>
       </w:pPr>
-      <w:bookmarkStart w:id="7" w:name="_Toc224203102"/>
       <w:r>
         <w:br w:type="page"/>
       </w:r>
@@ -5766,6 +7249,7 @@
       <w:pPr>
         <w:pStyle w:val="Nagwek2"/>
       </w:pPr>
+      <w:bookmarkStart w:id="7" w:name="_Toc232014356"/>
       <w:r>
         <w:lastRenderedPageBreak/>
         <w:t>Model przypadków użycia</w:t>
@@ -5776,7 +7260,7 @@
       <w:pPr>
         <w:pStyle w:val="Nagwek3"/>
       </w:pPr>
-      <w:bookmarkStart w:id="8" w:name="_Toc224203103"/>
+      <w:bookmarkStart w:id="8" w:name="_Toc232014357"/>
       <w:r>
         <w:t>Odkrywanie przypadków użycia</w:t>
       </w:r>
@@ -5794,7 +7278,7 @@
       <w:pPr>
         <w:pStyle w:val="Nagwek3"/>
       </w:pPr>
-      <w:bookmarkStart w:id="9" w:name="_Toc224203104"/>
+      <w:bookmarkStart w:id="9" w:name="_Toc232014358"/>
       <w:r>
         <w:t>Diagram przypadków użycia</w:t>
       </w:r>
@@ -5888,27 +7372,14 @@
       <w:r>
         <w:t xml:space="preserve">Rysunek </w:t>
       </w:r>
-      <w:r>
-        <w:fldChar w:fldCharType="begin"/>
-      </w:r>
-      <w:r>
-        <w:instrText xml:space="preserve"> SEQ Rysunek \* ARABIC </w:instrText>
-      </w:r>
-      <w:r>
-        <w:fldChar w:fldCharType="separate"/>
-      </w:r>
-      <w:r>
-        <w:rPr>
-          <w:noProof/>
-        </w:rPr>
-        <w:t>4</w:t>
-      </w:r>
-      <w:r>
-        <w:rPr>
-          <w:noProof/>
-        </w:rPr>
-        <w:fldChar w:fldCharType="end"/>
-      </w:r>
+      <w:fldSimple w:instr=" SEQ Rysunek \* ARABIC ">
+        <w:r>
+          <w:rPr>
+            <w:noProof/>
+          </w:rPr>
+          <w:t>4</w:t>
+        </w:r>
+      </w:fldSimple>
       <w:r>
         <w:t>. Diagram przypadków użycia - organizowanie wydarzeń parafialnych</w:t>
       </w:r>
@@ -5984,27 +7455,14 @@
       <w:r>
         <w:t xml:space="preserve">Rysunek </w:t>
       </w:r>
-      <w:r>
-        <w:fldChar w:fldCharType="begin"/>
-      </w:r>
-      <w:r>
-        <w:instrText xml:space="preserve"> SEQ Rysunek \* ARABIC </w:instrText>
-      </w:r>
-      <w:r>
-        <w:fldChar w:fldCharType="separate"/>
-      </w:r>
-      <w:r>
-        <w:rPr>
-          <w:noProof/>
-        </w:rPr>
-        <w:t>5</w:t>
-      </w:r>
-      <w:r>
-        <w:rPr>
-          <w:noProof/>
-        </w:rPr>
-        <w:fldChar w:fldCharType="end"/>
-      </w:r>
+      <w:fldSimple w:instr=" SEQ Rysunek \* ARABIC ">
+        <w:r>
+          <w:rPr>
+            <w:noProof/>
+          </w:rPr>
+          <w:t>5</w:t>
+        </w:r>
+      </w:fldSimple>
       <w:r>
         <w:t xml:space="preserve">. </w:t>
       </w:r>
@@ -6102,34 +7560,20 @@
       <w:r>
         <w:t xml:space="preserve">Rysunek </w:t>
       </w:r>
-      <w:r>
-        <w:fldChar w:fldCharType="begin"/>
-      </w:r>
-      <w:r>
-        <w:instrText xml:space="preserve"> SEQ Rysunek \* ARABIC </w:instrText>
-      </w:r>
-      <w:r>
-        <w:fldChar w:fldCharType="separate"/>
-      </w:r>
-      <w:r>
-        <w:rPr>
-          <w:noProof/>
-        </w:rPr>
-        <w:t>6</w:t>
-      </w:r>
-      <w:r>
-        <w:rPr>
-          <w:noProof/>
-        </w:rPr>
-        <w:fldChar w:fldCharType="end"/>
-      </w:r>
+      <w:fldSimple w:instr=" SEQ Rysunek \* ARABIC ">
+        <w:r>
+          <w:rPr>
+            <w:noProof/>
+          </w:rPr>
+          <w:t>6</w:t>
+        </w:r>
+      </w:fldSimple>
       <w:r>
         <w:t xml:space="preserve">. </w:t>
       </w:r>
       <w:r>
         <w:t>Diagram przypadków użycia – zarządzanie parafianami</w:t>
       </w:r>
-      <w:bookmarkStart w:id="10" w:name="_Toc224203105"/>
     </w:p>
     <w:p>
       <w:pPr>
@@ -6221,27 +7665,14 @@
       <w:r>
         <w:t xml:space="preserve">Rysunek </w:t>
       </w:r>
-      <w:r>
-        <w:fldChar w:fldCharType="begin"/>
-      </w:r>
-      <w:r>
-        <w:instrText xml:space="preserve"> SEQ Rysunek \* ARABIC </w:instrText>
-      </w:r>
-      <w:r>
-        <w:fldChar w:fldCharType="separate"/>
-      </w:r>
-      <w:r>
-        <w:rPr>
-          <w:noProof/>
-        </w:rPr>
-        <w:t>7</w:t>
-      </w:r>
-      <w:r>
-        <w:rPr>
-          <w:noProof/>
-        </w:rPr>
-        <w:fldChar w:fldCharType="end"/>
-      </w:r>
+      <w:fldSimple w:instr=" SEQ Rysunek \* ARABIC ">
+        <w:r>
+          <w:rPr>
+            <w:noProof/>
+          </w:rPr>
+          <w:t>7</w:t>
+        </w:r>
+      </w:fldSimple>
       <w:r>
         <w:t xml:space="preserve"> </w:t>
       </w:r>
@@ -6334,27 +7765,14 @@
       <w:r>
         <w:t xml:space="preserve">Rysunek </w:t>
       </w:r>
-      <w:r>
-        <w:fldChar w:fldCharType="begin"/>
-      </w:r>
-      <w:r>
-        <w:instrText xml:space="preserve"> SEQ Rysunek \* ARABIC </w:instrText>
-      </w:r>
-      <w:r>
-        <w:fldChar w:fldCharType="separate"/>
-      </w:r>
-      <w:r>
-        <w:rPr>
-          <w:noProof/>
-        </w:rPr>
-        <w:t>8</w:t>
-      </w:r>
-      <w:r>
-        <w:rPr>
-          <w:noProof/>
-        </w:rPr>
-        <w:fldChar w:fldCharType="end"/>
-      </w:r>
+      <w:fldSimple w:instr=" SEQ Rysunek \* ARABIC ">
+        <w:r>
+          <w:rPr>
+            <w:noProof/>
+          </w:rPr>
+          <w:t>8</w:t>
+        </w:r>
+      </w:fldSimple>
       <w:r>
         <w:t xml:space="preserve"> Diagram przypadków użycia - zarządzanie wspólnotą parafialną</w:t>
       </w:r>
@@ -6446,27 +7864,14 @@
       <w:r>
         <w:t xml:space="preserve">Rysunek </w:t>
       </w:r>
-      <w:r>
-        <w:fldChar w:fldCharType="begin"/>
-      </w:r>
-      <w:r>
-        <w:instrText xml:space="preserve"> SEQ Rysunek \* ARABIC </w:instrText>
-      </w:r>
-      <w:r>
-        <w:fldChar w:fldCharType="separate"/>
-      </w:r>
-      <w:r>
-        <w:rPr>
-          <w:noProof/>
-        </w:rPr>
-        <w:t>9</w:t>
-      </w:r>
-      <w:r>
-        <w:rPr>
-          <w:noProof/>
-        </w:rPr>
-        <w:fldChar w:fldCharType="end"/>
-      </w:r>
+      <w:fldSimple w:instr=" SEQ Rysunek \* ARABIC ">
+        <w:r>
+          <w:rPr>
+            <w:noProof/>
+          </w:rPr>
+          <w:t>9</w:t>
+        </w:r>
+      </w:fldSimple>
       <w:r>
         <w:t xml:space="preserve"> </w:t>
       </w:r>
@@ -6498,6 +7903,7 @@
       <w:pPr>
         <w:pStyle w:val="Nagwek3"/>
       </w:pPr>
+      <w:bookmarkStart w:id="10" w:name="_Toc232014359"/>
       <w:r>
         <w:lastRenderedPageBreak/>
         <w:t>Opis przypadków użycia</w:t>
@@ -7502,7 +8908,6 @@
           <w:szCs w:val="32"/>
         </w:rPr>
       </w:pPr>
-      <w:bookmarkStart w:id="11" w:name="_Toc224203106"/>
       <w:r>
         <w:br w:type="page"/>
       </w:r>
@@ -7511,41 +8916,1387 @@
       <w:pPr>
         <w:pStyle w:val="Nagwek1"/>
       </w:pPr>
+      <w:bookmarkStart w:id="11" w:name="_Toc232014360"/>
       <w:r>
         <w:lastRenderedPageBreak/>
         <w:t>Projekt</w:t>
       </w:r>
       <w:bookmarkEnd w:id="11"/>
     </w:p>
-    <w:p/>
     <w:p>
       <w:pPr>
         <w:pStyle w:val="Nagwek1"/>
       </w:pPr>
-      <w:bookmarkStart w:id="12" w:name="_Toc224203107"/>
+      <w:bookmarkStart w:id="12" w:name="_Toc232014361"/>
       <w:r>
         <w:t>Implementacja</w:t>
       </w:r>
       <w:bookmarkEnd w:id="12"/>
     </w:p>
-    <w:p/>
+    <w:p>
+      <w:r>
+        <w:t xml:space="preserve">System </w:t>
+      </w:r>
+      <w:proofErr w:type="spellStart"/>
+      <w:r>
+        <w:t>eParafia</w:t>
+      </w:r>
+      <w:proofErr w:type="spellEnd"/>
+      <w:r>
+        <w:t xml:space="preserve"> został zrealizowany jako aplikacja </w:t>
+      </w:r>
+      <w:proofErr w:type="spellStart"/>
+      <w:r>
+        <w:t>backendowa</w:t>
+      </w:r>
+      <w:proofErr w:type="spellEnd"/>
+      <w:r>
+        <w:t xml:space="preserve"> w języku Java 21 z wykorzystaniem </w:t>
+      </w:r>
+      <w:proofErr w:type="spellStart"/>
+      <w:r>
+        <w:t>frameworka</w:t>
+      </w:r>
+      <w:proofErr w:type="spellEnd"/>
+      <w:r>
+        <w:t xml:space="preserve"> Spring </w:t>
+      </w:r>
+      <w:proofErr w:type="spellStart"/>
+      <w:r>
+        <w:t>Boot</w:t>
+      </w:r>
+      <w:proofErr w:type="spellEnd"/>
+      <w:r>
+        <w:t xml:space="preserve"> 4.0.6. </w:t>
+      </w:r>
+      <w:proofErr w:type="spellStart"/>
+      <w:r>
+        <w:t>Persystencja</w:t>
+      </w:r>
+      <w:proofErr w:type="spellEnd"/>
+      <w:r>
+        <w:t xml:space="preserve"> danych oparta jest na Spring Data JPA z implementacją </w:t>
+      </w:r>
+      <w:proofErr w:type="spellStart"/>
+      <w:r>
+        <w:t>Hibernate</w:t>
+      </w:r>
+      <w:proofErr w:type="spellEnd"/>
+      <w:r>
+        <w:t xml:space="preserve"> 7 oraz bazą danych H2 w trybie plikowym (</w:t>
+      </w:r>
+      <w:proofErr w:type="gramStart"/>
+      <w:r>
+        <w:t>plik .</w:t>
+      </w:r>
+      <w:proofErr w:type="gramEnd"/>
+      <w:r>
+        <w:t>/data/</w:t>
+      </w:r>
+      <w:proofErr w:type="spellStart"/>
+      <w:r>
+        <w:t>eparish</w:t>
+      </w:r>
+      <w:proofErr w:type="spellEnd"/>
+      <w:r>
+        <w:t xml:space="preserve">). Do generowania kodu szablonowego encji i serwisów użyto biblioteki Lombok. Projekt jest budowany narzędziem </w:t>
+      </w:r>
+      <w:proofErr w:type="spellStart"/>
+      <w:r>
+        <w:t>Gradle</w:t>
+      </w:r>
+      <w:proofErr w:type="spellEnd"/>
+      <w:r>
+        <w:t xml:space="preserve"> (</w:t>
+      </w:r>
+      <w:proofErr w:type="spellStart"/>
+      <w:r>
+        <w:t>wrapper</w:t>
+      </w:r>
+      <w:proofErr w:type="spellEnd"/>
+      <w:r>
+        <w:t xml:space="preserve"> 9.4). Dokumentacja interaktywna API udostępniana jest przez bibliotekę </w:t>
+      </w:r>
+      <w:proofErr w:type="spellStart"/>
+      <w:r>
+        <w:t>springdoc-openapi</w:t>
+      </w:r>
+      <w:proofErr w:type="spellEnd"/>
+      <w:r>
+        <w:t xml:space="preserve"> 2.8.9 pod adresem /</w:t>
+      </w:r>
+      <w:proofErr w:type="spellStart"/>
+      <w:r>
+        <w:t>swagger-ui</w:t>
+      </w:r>
+      <w:proofErr w:type="spellEnd"/>
+      <w:r>
+        <w:t xml:space="preserve">/index.html. </w:t>
+      </w:r>
+      <w:proofErr w:type="spellStart"/>
+      <w:r>
+        <w:t>Serializacja</w:t>
+      </w:r>
+      <w:proofErr w:type="spellEnd"/>
+      <w:r>
+        <w:t xml:space="preserve"> JSON realizowana jest przez Jackson 3 (pakiet </w:t>
+      </w:r>
+      <w:proofErr w:type="spellStart"/>
+      <w:proofErr w:type="gramStart"/>
+      <w:r>
+        <w:t>tools.jackson</w:t>
+      </w:r>
+      <w:proofErr w:type="spellEnd"/>
+      <w:proofErr w:type="gramEnd"/>
+      <w:r>
+        <w:t>).</w:t>
+      </w:r>
+    </w:p>
+    <w:p>
+      <w:pPr>
+        <w:pStyle w:val="Nagwek2"/>
+      </w:pPr>
+      <w:bookmarkStart w:id="13" w:name="_Toc232014362"/>
+      <w:r>
+        <w:t>Architektura aplikacji</w:t>
+      </w:r>
+      <w:bookmarkEnd w:id="13"/>
+    </w:p>
+    <w:p>
+      <w:r>
+        <w:t xml:space="preserve">Projekt stosuje podejście </w:t>
+      </w:r>
+      <w:proofErr w:type="spellStart"/>
+      <w:r>
+        <w:t>Domain-Driven</w:t>
+      </w:r>
+      <w:proofErr w:type="spellEnd"/>
+      <w:r>
+        <w:t xml:space="preserve"> Design (DDD) z czystym podziałem na cztery warstwy. Kontrolery (pakiet </w:t>
+      </w:r>
+      <w:proofErr w:type="spellStart"/>
+      <w:r>
+        <w:t>api</w:t>
+      </w:r>
+      <w:proofErr w:type="spellEnd"/>
+      <w:r>
+        <w:t>) pełnią wyłącznie rolę mapowania żądań HTTP na obiekty poleceń (</w:t>
+      </w:r>
+      <w:proofErr w:type="spellStart"/>
+      <w:r>
+        <w:t>Command</w:t>
+      </w:r>
+      <w:proofErr w:type="spellEnd"/>
+      <w:r>
+        <w:t xml:space="preserve"> </w:t>
+      </w:r>
+      <w:proofErr w:type="spellStart"/>
+      <w:r>
+        <w:t>Records</w:t>
+      </w:r>
+      <w:proofErr w:type="spellEnd"/>
+      <w:r>
+        <w:t xml:space="preserve">) i odpowiedzi JSON – nie zawierają żadnej logiki biznesowej. Serwisy (pakiet </w:t>
+      </w:r>
+      <w:proofErr w:type="spellStart"/>
+      <w:r>
+        <w:t>application</w:t>
+      </w:r>
+      <w:proofErr w:type="spellEnd"/>
+      <w:r>
+        <w:t xml:space="preserve">) realizują przypadki użycia, walidują dane wejściowe, obsługują wyjątki i orkiestrują operacje na fabrykach i repozytoriach. Fabryki (pakiet </w:t>
+      </w:r>
+      <w:proofErr w:type="spellStart"/>
+      <w:r>
+        <w:t>application</w:t>
+      </w:r>
+      <w:proofErr w:type="spellEnd"/>
+      <w:r>
+        <w:t xml:space="preserve">) odpowiadają za tworzenie nowych obiektów domenowych, oddzielając logikę konstrukcji od logiki serwisowej. Repozytoria (pakiet </w:t>
+      </w:r>
+      <w:proofErr w:type="spellStart"/>
+      <w:r>
+        <w:t>domain</w:t>
+      </w:r>
+      <w:proofErr w:type="spellEnd"/>
+      <w:r>
+        <w:t xml:space="preserve">) są interfejsami Spring Data JPA zapewniającymi </w:t>
+      </w:r>
+      <w:proofErr w:type="spellStart"/>
+      <w:r>
+        <w:t>persystencję</w:t>
+      </w:r>
+      <w:proofErr w:type="spellEnd"/>
+      <w:r>
+        <w:t xml:space="preserve"> encji poprzez </w:t>
+      </w:r>
+      <w:proofErr w:type="spellStart"/>
+      <w:r>
+        <w:t>Hibernate</w:t>
+      </w:r>
+      <w:proofErr w:type="spellEnd"/>
+      <w:r>
+        <w:t>.</w:t>
+      </w:r>
+    </w:p>
+    <w:p>
+      <w:pPr>
+        <w:pStyle w:val="Nagwek2"/>
+      </w:pPr>
+      <w:bookmarkStart w:id="14" w:name="_Toc232014363"/>
+      <w:r>
+        <w:t>Konteksty domenowe</w:t>
+      </w:r>
+      <w:bookmarkEnd w:id="14"/>
+    </w:p>
+    <w:p>
+      <w:r>
+        <w:t>Aplikacja podzielona jest na sześć oddzielnych kontekstów (</w:t>
+      </w:r>
+      <w:proofErr w:type="spellStart"/>
+      <w:r>
+        <w:t>bounded</w:t>
+      </w:r>
+      <w:proofErr w:type="spellEnd"/>
+      <w:r>
+        <w:t xml:space="preserve"> </w:t>
+      </w:r>
+      <w:proofErr w:type="spellStart"/>
+      <w:r>
+        <w:t>contexts</w:t>
+      </w:r>
+      <w:proofErr w:type="spellEnd"/>
+      <w:r>
+        <w:t xml:space="preserve">), z których każdy stanowi osobny pakiet Java zawierający własne encje JPA, repozytoria, fabrykę i serwis aplikacyjny. Kontekst </w:t>
+      </w:r>
+      <w:proofErr w:type="spellStart"/>
+      <w:r>
+        <w:t>eventcoordination</w:t>
+      </w:r>
+      <w:proofErr w:type="spellEnd"/>
+      <w:r>
+        <w:t xml:space="preserve"> (</w:t>
+      </w:r>
+      <w:proofErr w:type="spellStart"/>
+      <w:r>
+        <w:t>EventCoordinationService</w:t>
+      </w:r>
+      <w:proofErr w:type="spellEnd"/>
+      <w:r>
+        <w:t xml:space="preserve">, </w:t>
+      </w:r>
+      <w:proofErr w:type="spellStart"/>
+      <w:r>
+        <w:t>EventFactory</w:t>
+      </w:r>
+      <w:proofErr w:type="spellEnd"/>
+      <w:r>
+        <w:t xml:space="preserve">) obsługuje zarządzanie wydarzeniami parafialnymi, harmonogramami, intencjami, ogłoszeniami, ofiarami, uczestnikami i organizatorami. Kontekst </w:t>
+      </w:r>
+      <w:proofErr w:type="spellStart"/>
+      <w:r>
+        <w:t>parishinformation</w:t>
+      </w:r>
+      <w:proofErr w:type="spellEnd"/>
+      <w:r>
+        <w:t xml:space="preserve"> (</w:t>
+      </w:r>
+      <w:proofErr w:type="spellStart"/>
+      <w:r>
+        <w:t>ParishInformationService</w:t>
+      </w:r>
+      <w:proofErr w:type="spellEnd"/>
+      <w:r>
+        <w:t xml:space="preserve">, </w:t>
+      </w:r>
+      <w:proofErr w:type="spellStart"/>
+      <w:r>
+        <w:t>ParishInfoFactory</w:t>
+      </w:r>
+      <w:proofErr w:type="spellEnd"/>
+      <w:r>
+        <w:t xml:space="preserve">) zarządza strukturą parafii, diecezjami, miejscowościami, kartotekami parafian i dokumentami. Kontekst </w:t>
+      </w:r>
+      <w:proofErr w:type="spellStart"/>
+      <w:r>
+        <w:t>pastoralcare</w:t>
+      </w:r>
+      <w:proofErr w:type="spellEnd"/>
+      <w:r>
+        <w:t xml:space="preserve"> (</w:t>
+      </w:r>
+      <w:proofErr w:type="spellStart"/>
+      <w:r>
+        <w:t>PastoralCareService</w:t>
+      </w:r>
+      <w:proofErr w:type="spellEnd"/>
+      <w:r>
+        <w:t xml:space="preserve">, </w:t>
+      </w:r>
+      <w:proofErr w:type="spellStart"/>
+      <w:r>
+        <w:t>PastoralCareFactory</w:t>
+      </w:r>
+      <w:proofErr w:type="spellEnd"/>
+      <w:r>
+        <w:t xml:space="preserve">) realizuje duszpasterstwo wiernych: zarządzanie parafianami, rodzinami i adresami rodzin. Kontekst </w:t>
+      </w:r>
+      <w:proofErr w:type="spellStart"/>
+      <w:r>
+        <w:t>parishgroups</w:t>
+      </w:r>
+      <w:proofErr w:type="spellEnd"/>
+      <w:r>
+        <w:t xml:space="preserve"> (</w:t>
+      </w:r>
+      <w:proofErr w:type="spellStart"/>
+      <w:r>
+        <w:t>ParishGroupService</w:t>
+      </w:r>
+      <w:proofErr w:type="spellEnd"/>
+      <w:r>
+        <w:t xml:space="preserve">, </w:t>
+      </w:r>
+      <w:proofErr w:type="spellStart"/>
+      <w:r>
+        <w:t>ParishGroupFactory</w:t>
+      </w:r>
+      <w:proofErr w:type="spellEnd"/>
+      <w:r>
+        <w:t xml:space="preserve">) obsługuje grupy parafialne i członkostwa. Kontekst </w:t>
+      </w:r>
+      <w:proofErr w:type="spellStart"/>
+      <w:r>
+        <w:t>staffmanagement</w:t>
+      </w:r>
+      <w:proofErr w:type="spellEnd"/>
+      <w:r>
+        <w:t xml:space="preserve"> (</w:t>
+      </w:r>
+      <w:proofErr w:type="spellStart"/>
+      <w:r>
+        <w:t>ParishOperationsService</w:t>
+      </w:r>
+      <w:proofErr w:type="spellEnd"/>
+      <w:r>
+        <w:t xml:space="preserve">, </w:t>
+      </w:r>
+      <w:proofErr w:type="spellStart"/>
+      <w:r>
+        <w:t>StaffFactory</w:t>
+      </w:r>
+      <w:proofErr w:type="spellEnd"/>
+      <w:r>
+        <w:t xml:space="preserve">) zarządza personelem parafii, stanowiskami i obowiązkami. Kontekst </w:t>
+      </w:r>
+      <w:proofErr w:type="spellStart"/>
+      <w:r>
+        <w:t>sacramentalministry</w:t>
+      </w:r>
+      <w:proofErr w:type="spellEnd"/>
+      <w:r>
+        <w:t xml:space="preserve"> (</w:t>
+      </w:r>
+      <w:proofErr w:type="spellStart"/>
+      <w:r>
+        <w:t>SacramentalMinistryService</w:t>
+      </w:r>
+      <w:proofErr w:type="spellEnd"/>
+      <w:r>
+        <w:t xml:space="preserve">, </w:t>
+      </w:r>
+      <w:proofErr w:type="spellStart"/>
+      <w:r>
+        <w:t>SacramentalMinistryFactory</w:t>
+      </w:r>
+      <w:proofErr w:type="spellEnd"/>
+      <w:r>
+        <w:t>) rejestruje sakramenty i ich udzielanie parafianom przez kapłanów.</w:t>
+      </w:r>
+    </w:p>
+    <w:p>
+      <w:pPr>
+        <w:pStyle w:val="Nagwek2"/>
+      </w:pPr>
+      <w:bookmarkStart w:id="15" w:name="_Toc232014364"/>
+      <w:r>
+        <w:t xml:space="preserve">Encje JPA i </w:t>
+      </w:r>
+      <w:proofErr w:type="spellStart"/>
+      <w:r>
+        <w:t>persystencja</w:t>
+      </w:r>
+      <w:proofErr w:type="spellEnd"/>
+      <w:r>
+        <w:t xml:space="preserve"> danych</w:t>
+      </w:r>
+      <w:bookmarkEnd w:id="15"/>
+    </w:p>
+    <w:p>
+      <w:r>
+        <w:t xml:space="preserve">Model danych obejmuje 24 encje JPA, spełniając wymaganie projektowe 20 encji z nadwyżką. Encje zmapowane są na tabele relacyjnej bazy H2 poprzez adnotacje JPA: @Entity, @Table, @Column, @ManyToOne, @OneToOne oraz @OneToMany. Schemat bazy jest tworzony i aktualizowany automatycznie przez </w:t>
+      </w:r>
+      <w:proofErr w:type="spellStart"/>
+      <w:r>
+        <w:t>Hibernate</w:t>
+      </w:r>
+      <w:proofErr w:type="spellEnd"/>
+      <w:r>
+        <w:t xml:space="preserve"> (</w:t>
+      </w:r>
+      <w:proofErr w:type="spellStart"/>
+      <w:r>
+        <w:t>ddl</w:t>
+      </w:r>
+      <w:proofErr w:type="spellEnd"/>
+      <w:r>
+        <w:t xml:space="preserve">-auto=update). Kod szablonowy encji (gettery, </w:t>
+      </w:r>
+      <w:proofErr w:type="spellStart"/>
+      <w:r>
+        <w:t>settery</w:t>
+      </w:r>
+      <w:proofErr w:type="spellEnd"/>
+      <w:r>
+        <w:t xml:space="preserve">, </w:t>
+      </w:r>
+      <w:proofErr w:type="spellStart"/>
+      <w:r>
+        <w:t>konstruktory</w:t>
+      </w:r>
+      <w:proofErr w:type="spellEnd"/>
+      <w:r>
+        <w:t>) generowany jest przez bibliotekę Lombok z adnotacją @Data. Baza H2 pracuje w trybie plikowym (jdbc:h</w:t>
+      </w:r>
+      <w:proofErr w:type="gramStart"/>
+      <w:r>
+        <w:t>2:file:./</w:t>
+      </w:r>
+      <w:proofErr w:type="gramEnd"/>
+      <w:r>
+        <w:t>data/</w:t>
+      </w:r>
+      <w:proofErr w:type="spellStart"/>
+      <w:r>
+        <w:t>eparish</w:t>
+      </w:r>
+      <w:proofErr w:type="spellEnd"/>
+      <w:r>
+        <w:t xml:space="preserve">), co zapewnia trwałość danych </w:t>
+      </w:r>
+      <w:r>
+        <w:lastRenderedPageBreak/>
+        <w:t>między uruchomieniami aplikacji. Konsola zarządzania H2 dostępna jest pod adresem http://localhost:8080/h2-console.</w:t>
+      </w:r>
+    </w:p>
+    <w:p>
+      <w:r>
+        <w:t xml:space="preserve">Przy każdym starcie aplikacji plik </w:t>
+      </w:r>
+      <w:proofErr w:type="spellStart"/>
+      <w:r>
+        <w:t>data.sql</w:t>
+      </w:r>
+      <w:proofErr w:type="spellEnd"/>
+      <w:r>
+        <w:t xml:space="preserve"> (</w:t>
+      </w:r>
+      <w:proofErr w:type="spellStart"/>
+      <w:proofErr w:type="gramStart"/>
+      <w:r>
+        <w:t>spring.sql.init</w:t>
+      </w:r>
+      <w:proofErr w:type="gramEnd"/>
+      <w:r>
+        <w:t>.mode</w:t>
+      </w:r>
+      <w:proofErr w:type="spellEnd"/>
+      <w:r>
+        <w:t>=</w:t>
+      </w:r>
+      <w:proofErr w:type="spellStart"/>
+      <w:r>
+        <w:t>always</w:t>
+      </w:r>
+      <w:proofErr w:type="spellEnd"/>
+      <w:r>
+        <w:t xml:space="preserve">) ładuje dane startowe: diecezję, miejscowość, parafię, personel (2 księży, pracownika), dwa wydarzenia z harmonogramem, intencje, ogłoszenia, ofiary, uczestników, organizatorów, sześć grup parafialnych, siedem sakramentów (Chrzest, Bierzmowanie, Eucharystia, Pokuta, Namaszczenie, Kapłaństwo, Małżeństwo), trzy rodziny z adresami, trzech parafian z kartotekami i dokumentami oraz przykłady udzielania sakramentów. Flaga </w:t>
+      </w:r>
+      <w:proofErr w:type="spellStart"/>
+      <w:proofErr w:type="gramStart"/>
+      <w:r>
+        <w:t>spring.sql.init</w:t>
+      </w:r>
+      <w:proofErr w:type="gramEnd"/>
+      <w:r>
+        <w:t>.continue</w:t>
+      </w:r>
+      <w:proofErr w:type="spellEnd"/>
+      <w:r>
+        <w:t>-on-error=</w:t>
+      </w:r>
+      <w:proofErr w:type="spellStart"/>
+      <w:r>
+        <w:t>true</w:t>
+      </w:r>
+      <w:proofErr w:type="spellEnd"/>
+      <w:r>
+        <w:t xml:space="preserve"> umożliwia ponowny start aplikacji bez błędów, gdy dane startowe już istnieją w bazie.</w:t>
+      </w:r>
+    </w:p>
+    <w:p>
+      <w:pPr>
+        <w:pStyle w:val="Nagwek2"/>
+      </w:pPr>
+      <w:bookmarkStart w:id="16" w:name="_Toc232014365"/>
+      <w:r>
+        <w:t>Agregaty domenowe</w:t>
+      </w:r>
+      <w:bookmarkEnd w:id="16"/>
+    </w:p>
+    <w:p>
+      <w:r>
+        <w:t xml:space="preserve">W architekturze DDD zaimplementowano trzy agregaty domenowe, które grupują powiązane encje i udostępniają metody logiki domenowej. Agregat </w:t>
+      </w:r>
+      <w:proofErr w:type="spellStart"/>
+      <w:r>
+        <w:t>EventAggregate</w:t>
+      </w:r>
+      <w:proofErr w:type="spellEnd"/>
+      <w:r>
+        <w:t xml:space="preserve"> (złożony) ma jako korzeń encję </w:t>
+      </w:r>
+      <w:proofErr w:type="spellStart"/>
+      <w:r>
+        <w:t>ParishEvent</w:t>
+      </w:r>
+      <w:proofErr w:type="spellEnd"/>
+      <w:r>
+        <w:t xml:space="preserve"> i łączy z nią encje: </w:t>
+      </w:r>
+      <w:proofErr w:type="spellStart"/>
+      <w:r>
+        <w:t>Intention</w:t>
+      </w:r>
+      <w:proofErr w:type="spellEnd"/>
+      <w:r>
+        <w:t xml:space="preserve">, </w:t>
+      </w:r>
+      <w:proofErr w:type="spellStart"/>
+      <w:r>
+        <w:t>Announcement</w:t>
+      </w:r>
+      <w:proofErr w:type="spellEnd"/>
+      <w:r>
+        <w:t xml:space="preserve">, </w:t>
+      </w:r>
+      <w:proofErr w:type="spellStart"/>
+      <w:r>
+        <w:t>Offering</w:t>
+      </w:r>
+      <w:proofErr w:type="spellEnd"/>
+      <w:r>
+        <w:t xml:space="preserve">, </w:t>
+      </w:r>
+      <w:proofErr w:type="spellStart"/>
+      <w:r>
+        <w:t>Participant</w:t>
+      </w:r>
+      <w:proofErr w:type="spellEnd"/>
+      <w:r>
+        <w:t xml:space="preserve"> i </w:t>
+      </w:r>
+      <w:proofErr w:type="spellStart"/>
+      <w:r>
+        <w:t>Organizer</w:t>
+      </w:r>
+      <w:proofErr w:type="spellEnd"/>
+      <w:r>
+        <w:t xml:space="preserve">. Udostępnia metody domenowe: </w:t>
+      </w:r>
+      <w:proofErr w:type="spellStart"/>
+      <w:proofErr w:type="gramStart"/>
+      <w:r>
+        <w:t>totalOfferings</w:t>
+      </w:r>
+      <w:proofErr w:type="spellEnd"/>
+      <w:r>
+        <w:t>(</w:t>
+      </w:r>
+      <w:proofErr w:type="gramEnd"/>
+      <w:r>
+        <w:t xml:space="preserve">) obliczającą sumę zebranych ofiar, </w:t>
+      </w:r>
+      <w:proofErr w:type="spellStart"/>
+      <w:proofErr w:type="gramStart"/>
+      <w:r>
+        <w:t>realizedIntentionCount</w:t>
+      </w:r>
+      <w:proofErr w:type="spellEnd"/>
+      <w:r>
+        <w:t>(</w:t>
+      </w:r>
+      <w:proofErr w:type="gramEnd"/>
+      <w:r>
+        <w:t xml:space="preserve">) i </w:t>
+      </w:r>
+      <w:proofErr w:type="spellStart"/>
+      <w:proofErr w:type="gramStart"/>
+      <w:r>
+        <w:t>plannedIntentionCount</w:t>
+      </w:r>
+      <w:proofErr w:type="spellEnd"/>
+      <w:r>
+        <w:t>(</w:t>
+      </w:r>
+      <w:proofErr w:type="gramEnd"/>
+      <w:r>
+        <w:t xml:space="preserve">) zwracające statystyki intencji, </w:t>
+      </w:r>
+      <w:proofErr w:type="spellStart"/>
+      <w:proofErr w:type="gramStart"/>
+      <w:r>
+        <w:t>totalEngaged</w:t>
+      </w:r>
+      <w:proofErr w:type="spellEnd"/>
+      <w:r>
+        <w:t>(</w:t>
+      </w:r>
+      <w:proofErr w:type="gramEnd"/>
+      <w:r>
+        <w:t xml:space="preserve">) sumującą uczestników i organizatorów, </w:t>
+      </w:r>
+      <w:proofErr w:type="spellStart"/>
+      <w:proofErr w:type="gramStart"/>
+      <w:r>
+        <w:t>announcementCount</w:t>
+      </w:r>
+      <w:proofErr w:type="spellEnd"/>
+      <w:r>
+        <w:t>(</w:t>
+      </w:r>
+      <w:proofErr w:type="gramEnd"/>
+      <w:r>
+        <w:t xml:space="preserve">) zwracającą liczbę ogłoszeń oraz </w:t>
+      </w:r>
+      <w:proofErr w:type="spellStart"/>
+      <w:proofErr w:type="gramStart"/>
+      <w:r>
+        <w:t>isIntentionAlreadyAssigned</w:t>
+      </w:r>
+      <w:proofErr w:type="spellEnd"/>
+      <w:r>
+        <w:t>(</w:t>
+      </w:r>
+      <w:proofErr w:type="gramEnd"/>
+      <w:r>
+        <w:t xml:space="preserve">) sprawdzającą duplikaty intencji. Agregat dostępny jest przez </w:t>
+      </w:r>
+      <w:proofErr w:type="spellStart"/>
+      <w:r>
+        <w:t>endpoint</w:t>
+      </w:r>
+      <w:proofErr w:type="spellEnd"/>
+      <w:r>
+        <w:t xml:space="preserve"> GET /</w:t>
+      </w:r>
+      <w:proofErr w:type="spellStart"/>
+      <w:r>
+        <w:t>api</w:t>
+      </w:r>
+      <w:proofErr w:type="spellEnd"/>
+      <w:r>
+        <w:t>/</w:t>
+      </w:r>
+      <w:proofErr w:type="spellStart"/>
+      <w:r>
+        <w:t>events</w:t>
+      </w:r>
+      <w:proofErr w:type="spellEnd"/>
+      <w:r>
+        <w:t>/{id}/</w:t>
+      </w:r>
+      <w:proofErr w:type="spellStart"/>
+      <w:r>
+        <w:t>aggregate</w:t>
+      </w:r>
+      <w:proofErr w:type="spellEnd"/>
+      <w:r>
+        <w:t>.</w:t>
+      </w:r>
+    </w:p>
+    <w:p>
+      <w:r>
+        <w:t xml:space="preserve">Agregat </w:t>
+      </w:r>
+      <w:proofErr w:type="spellStart"/>
+      <w:r>
+        <w:t>ParishionerAggregate</w:t>
+      </w:r>
+      <w:proofErr w:type="spellEnd"/>
+      <w:r>
+        <w:t xml:space="preserve"> grupuje parafianina (</w:t>
+      </w:r>
+      <w:proofErr w:type="spellStart"/>
+      <w:r>
+        <w:t>Parishioner</w:t>
+      </w:r>
+      <w:proofErr w:type="spellEnd"/>
+      <w:r>
+        <w:t>) z jego kartoteką (</w:t>
+      </w:r>
+      <w:proofErr w:type="spellStart"/>
+      <w:r>
+        <w:t>ParishRecord</w:t>
+      </w:r>
+      <w:proofErr w:type="spellEnd"/>
+      <w:r>
+        <w:t>) i dokumentami (</w:t>
+      </w:r>
+      <w:proofErr w:type="spellStart"/>
+      <w:r>
+        <w:t>Document</w:t>
+      </w:r>
+      <w:proofErr w:type="spellEnd"/>
+      <w:r>
+        <w:t>), zwracając pełny profil wiernego. Dostępny przez GET /</w:t>
+      </w:r>
+      <w:proofErr w:type="spellStart"/>
+      <w:r>
+        <w:t>api</w:t>
+      </w:r>
+      <w:proofErr w:type="spellEnd"/>
+      <w:r>
+        <w:t>/</w:t>
+      </w:r>
+      <w:proofErr w:type="spellStart"/>
+      <w:r>
+        <w:t>parishioners</w:t>
+      </w:r>
+      <w:proofErr w:type="spellEnd"/>
+      <w:r>
+        <w:t>/{id}/</w:t>
+      </w:r>
+      <w:proofErr w:type="spellStart"/>
+      <w:r>
+        <w:t>aggregate</w:t>
+      </w:r>
+      <w:proofErr w:type="spellEnd"/>
+      <w:r>
+        <w:t xml:space="preserve">. Agregat </w:t>
+      </w:r>
+      <w:proofErr w:type="spellStart"/>
+      <w:r>
+        <w:t>ParishGroupAggregate</w:t>
+      </w:r>
+      <w:proofErr w:type="spellEnd"/>
+      <w:r>
+        <w:t xml:space="preserve"> łączy grupę parafialną (</w:t>
+      </w:r>
+      <w:proofErr w:type="spellStart"/>
+      <w:r>
+        <w:t>ParishGroup</w:t>
+      </w:r>
+      <w:proofErr w:type="spellEnd"/>
+      <w:r>
+        <w:t>) z listą jej członkostw (</w:t>
+      </w:r>
+      <w:proofErr w:type="spellStart"/>
+      <w:r>
+        <w:t>Membership</w:t>
+      </w:r>
+      <w:proofErr w:type="spellEnd"/>
+      <w:r>
+        <w:t>). Dostępny przez GET /</w:t>
+      </w:r>
+      <w:proofErr w:type="spellStart"/>
+      <w:r>
+        <w:t>api</w:t>
+      </w:r>
+      <w:proofErr w:type="spellEnd"/>
+      <w:r>
+        <w:t>/</w:t>
+      </w:r>
+      <w:proofErr w:type="spellStart"/>
+      <w:r>
+        <w:t>groups</w:t>
+      </w:r>
+      <w:proofErr w:type="spellEnd"/>
+      <w:r>
+        <w:t>/{id}/</w:t>
+      </w:r>
+      <w:proofErr w:type="spellStart"/>
+      <w:r>
+        <w:t>aggregate</w:t>
+      </w:r>
+      <w:proofErr w:type="spellEnd"/>
+      <w:r>
+        <w:t xml:space="preserve">. Każdy agregat jest </w:t>
+      </w:r>
+      <w:proofErr w:type="spellStart"/>
+      <w:r>
+        <w:t>niemutowalnym</w:t>
+      </w:r>
+      <w:proofErr w:type="spellEnd"/>
+      <w:r>
+        <w:t xml:space="preserve"> obiektem Java (</w:t>
+      </w:r>
+      <w:proofErr w:type="spellStart"/>
+      <w:r>
+        <w:t>final</w:t>
+      </w:r>
+      <w:proofErr w:type="spellEnd"/>
+      <w:r>
+        <w:t xml:space="preserve"> </w:t>
+      </w:r>
+      <w:proofErr w:type="spellStart"/>
+      <w:r>
+        <w:t>class</w:t>
+      </w:r>
+      <w:proofErr w:type="spellEnd"/>
+      <w:r>
+        <w:t>) z kopiami obronnymi list (</w:t>
+      </w:r>
+      <w:proofErr w:type="spellStart"/>
+      <w:r>
+        <w:t>List.copyOf</w:t>
+      </w:r>
+      <w:proofErr w:type="spellEnd"/>
+      <w:r>
+        <w:t>), co chroni spójność stanu agregatu.</w:t>
+      </w:r>
+    </w:p>
+    <w:p>
+      <w:pPr>
+        <w:pStyle w:val="Nagwek2"/>
+      </w:pPr>
+      <w:bookmarkStart w:id="17" w:name="_Toc232014366"/>
+      <w:r>
+        <w:t>Interfejs REST API</w:t>
+      </w:r>
+      <w:bookmarkEnd w:id="17"/>
+    </w:p>
+    <w:p>
+      <w:r>
+        <w:t>Aplikacja udostępnia interfejs REST z prefiksem /</w:t>
+      </w:r>
+      <w:proofErr w:type="spellStart"/>
+      <w:r>
+        <w:t>api</w:t>
+      </w:r>
+      <w:proofErr w:type="spellEnd"/>
+      <w:r>
+        <w:t xml:space="preserve"> obsługiwany przez pięć kontrolerów tematycznych: </w:t>
+      </w:r>
+      <w:proofErr w:type="spellStart"/>
+      <w:r>
+        <w:t>EventCoordinationController</w:t>
+      </w:r>
+      <w:proofErr w:type="spellEnd"/>
+      <w:r>
+        <w:t xml:space="preserve">, </w:t>
+      </w:r>
+      <w:proofErr w:type="spellStart"/>
+      <w:r>
+        <w:t>ParishInformationController</w:t>
+      </w:r>
+      <w:proofErr w:type="spellEnd"/>
+      <w:r>
+        <w:t xml:space="preserve">, </w:t>
+      </w:r>
+      <w:proofErr w:type="spellStart"/>
+      <w:r>
+        <w:t>PastoralCareController</w:t>
+      </w:r>
+      <w:proofErr w:type="spellEnd"/>
+      <w:r>
+        <w:t xml:space="preserve">, </w:t>
+      </w:r>
+      <w:proofErr w:type="spellStart"/>
+      <w:r>
+        <w:t>ParishOperationsController</w:t>
+      </w:r>
+      <w:proofErr w:type="spellEnd"/>
+      <w:r>
+        <w:t xml:space="preserve"> oraz </w:t>
+      </w:r>
+      <w:proofErr w:type="spellStart"/>
+      <w:r>
+        <w:t>SacramentalMinistryController</w:t>
+      </w:r>
+      <w:proofErr w:type="spellEnd"/>
+      <w:r>
+        <w:t xml:space="preserve">. Każdy zasób listowy obsługuje metody HTTP: GET (z opcjonalnym filtrowaniem po parametrach zapytania), POST (tworzenie zasobu, odpowiedź 201 </w:t>
+      </w:r>
+      <w:proofErr w:type="spellStart"/>
+      <w:r>
+        <w:t>Created</w:t>
+      </w:r>
+      <w:proofErr w:type="spellEnd"/>
+      <w:r>
+        <w:t xml:space="preserve">), PATCH (częściowa aktualizacja), PUT (pełna aktualizacja) oraz DELETE (usuwanie, odpowiedź 204 No Content). Łącznie zaimplementowano ponad 20 przypadków użycia realizowanych przez dedykowane </w:t>
+      </w:r>
+      <w:proofErr w:type="spellStart"/>
+      <w:r>
+        <w:t>endpointy</w:t>
+      </w:r>
+      <w:proofErr w:type="spellEnd"/>
+      <w:r>
+        <w:t>.</w:t>
+      </w:r>
+    </w:p>
+    <w:p>
+      <w:r>
+        <w:t xml:space="preserve">Filtrowanie list zaimplementowano w klasie pomocniczej </w:t>
+      </w:r>
+      <w:proofErr w:type="spellStart"/>
+      <w:r>
+        <w:t>ListFilterSupport</w:t>
+      </w:r>
+      <w:proofErr w:type="spellEnd"/>
+      <w:r>
+        <w:t xml:space="preserve">. Metoda </w:t>
+      </w:r>
+      <w:proofErr w:type="spellStart"/>
+      <w:proofErr w:type="gramStart"/>
+      <w:r>
+        <w:t>filter</w:t>
+      </w:r>
+      <w:proofErr w:type="spellEnd"/>
+      <w:r>
+        <w:t>(</w:t>
+      </w:r>
+      <w:proofErr w:type="gramEnd"/>
+      <w:r>
+        <w:t>) przyjmuje listę predykatów zbudowanych z parametrów zapytania (</w:t>
+      </w:r>
+      <w:proofErr w:type="spellStart"/>
+      <w:r>
+        <w:t>query</w:t>
+      </w:r>
+      <w:proofErr w:type="spellEnd"/>
+      <w:r>
+        <w:t xml:space="preserve"> </w:t>
+      </w:r>
+      <w:proofErr w:type="spellStart"/>
+      <w:r>
+        <w:t>params</w:t>
+      </w:r>
+      <w:proofErr w:type="spellEnd"/>
+      <w:r>
+        <w:t>). Predykat tworzony jest tylko dla tych parametrów, które faktycznie zostały przekazane w żądaniu; pominięcie parametru oznacza brak filtrowania po tym kryterium. Wszystkie parametry filtrowania są opcjonalne i można je łączyć w logikę AND. Przykład: GET /</w:t>
+      </w:r>
+      <w:proofErr w:type="spellStart"/>
+      <w:r>
+        <w:t>api</w:t>
+      </w:r>
+      <w:proofErr w:type="spellEnd"/>
+      <w:r>
+        <w:t>/</w:t>
+      </w:r>
+      <w:proofErr w:type="spellStart"/>
+      <w:r>
+        <w:t>announcements?eventId</w:t>
+      </w:r>
+      <w:proofErr w:type="spellEnd"/>
+      <w:r>
+        <w:t>=1 zwraca ogłoszenia wyłącznie dla wydarzenia o id=1, natomiast GET /</w:t>
+      </w:r>
+      <w:proofErr w:type="spellStart"/>
+      <w:r>
+        <w:t>api</w:t>
+      </w:r>
+      <w:proofErr w:type="spellEnd"/>
+      <w:r>
+        <w:t>/</w:t>
+      </w:r>
+      <w:proofErr w:type="spellStart"/>
+      <w:r>
+        <w:t>announcements</w:t>
+      </w:r>
+      <w:proofErr w:type="spellEnd"/>
+      <w:r>
+        <w:t xml:space="preserve"> bez parametrów zwraca pełną listę.</w:t>
+      </w:r>
+    </w:p>
+    <w:p>
+      <w:r>
+        <w:t xml:space="preserve">Częściowe aktualizacje (PATCH) realizowane są przez klasę </w:t>
+      </w:r>
+      <w:proofErr w:type="spellStart"/>
+      <w:r>
+        <w:t>PatchBodySupport</w:t>
+      </w:r>
+      <w:proofErr w:type="spellEnd"/>
+      <w:r>
+        <w:t xml:space="preserve">. Ciało żądania </w:t>
+      </w:r>
+      <w:proofErr w:type="spellStart"/>
+      <w:r>
+        <w:t>deserializowane</w:t>
+      </w:r>
+      <w:proofErr w:type="spellEnd"/>
+      <w:r>
+        <w:t xml:space="preserve"> jest jako Map&lt;String, Object&gt;, co pozwala odróżnić pole pominięte w żądaniu (klucz nieobecny w mapie – nie zmieniaj) od jawnie przekazanego </w:t>
+      </w:r>
+      <w:proofErr w:type="spellStart"/>
+      <w:r>
+        <w:t>null</w:t>
+      </w:r>
+      <w:proofErr w:type="spellEnd"/>
+      <w:r>
+        <w:t xml:space="preserve"> (klucz obecny, wartość </w:t>
+      </w:r>
+      <w:proofErr w:type="spellStart"/>
+      <w:r>
+        <w:lastRenderedPageBreak/>
+        <w:t>null</w:t>
+      </w:r>
+      <w:proofErr w:type="spellEnd"/>
+      <w:r>
+        <w:t xml:space="preserve"> – odepnij relację). To rozróżnienie jest istotne np. przy odpinaniu parafianina od rodziny: PATCH /</w:t>
+      </w:r>
+      <w:proofErr w:type="spellStart"/>
+      <w:r>
+        <w:t>api</w:t>
+      </w:r>
+      <w:proofErr w:type="spellEnd"/>
+      <w:r>
+        <w:t>/</w:t>
+      </w:r>
+      <w:proofErr w:type="spellStart"/>
+      <w:r>
+        <w:t>parishioners</w:t>
+      </w:r>
+      <w:proofErr w:type="spellEnd"/>
+      <w:r>
+        <w:t>/{id} z {"</w:t>
+      </w:r>
+      <w:proofErr w:type="spellStart"/>
+      <w:r>
+        <w:t>familyId</w:t>
+      </w:r>
+      <w:proofErr w:type="spellEnd"/>
+      <w:r>
+        <w:t xml:space="preserve">": </w:t>
+      </w:r>
+      <w:proofErr w:type="spellStart"/>
+      <w:r>
+        <w:t>null</w:t>
+      </w:r>
+      <w:proofErr w:type="spellEnd"/>
+      <w:r>
+        <w:t xml:space="preserve">} odpina parafianina, natomiast brak klucza </w:t>
+      </w:r>
+      <w:proofErr w:type="spellStart"/>
+      <w:r>
+        <w:t>familyId</w:t>
+      </w:r>
+      <w:proofErr w:type="spellEnd"/>
+      <w:r>
+        <w:t xml:space="preserve"> pozostawia przypisanie bez zmian. </w:t>
+      </w:r>
+      <w:proofErr w:type="spellStart"/>
+      <w:r>
+        <w:t>PatchBodySupport</w:t>
+      </w:r>
+      <w:proofErr w:type="spellEnd"/>
+      <w:r>
+        <w:t xml:space="preserve"> korzysta z Jackson 3 (pakiet </w:t>
+      </w:r>
+      <w:proofErr w:type="spellStart"/>
+      <w:proofErr w:type="gramStart"/>
+      <w:r>
+        <w:t>tools.jackson</w:t>
+      </w:r>
+      <w:proofErr w:type="spellEnd"/>
+      <w:proofErr w:type="gramEnd"/>
+      <w:r>
+        <w:t xml:space="preserve">), będącego domyślnym </w:t>
+      </w:r>
+      <w:proofErr w:type="spellStart"/>
+      <w:r>
+        <w:t>serializatorem</w:t>
+      </w:r>
+      <w:proofErr w:type="spellEnd"/>
+      <w:r>
+        <w:t xml:space="preserve"> w Spring </w:t>
+      </w:r>
+      <w:proofErr w:type="spellStart"/>
+      <w:r>
+        <w:t>Boot</w:t>
+      </w:r>
+      <w:proofErr w:type="spellEnd"/>
+      <w:r>
+        <w:t xml:space="preserve"> 4.</w:t>
+      </w:r>
+    </w:p>
+    <w:p>
+      <w:pPr>
+        <w:pStyle w:val="Nagwek2"/>
+      </w:pPr>
+      <w:bookmarkStart w:id="18" w:name="_Toc232014367"/>
+      <w:r>
+        <w:t>Obsługa błędów</w:t>
+      </w:r>
+      <w:bookmarkEnd w:id="18"/>
+    </w:p>
+    <w:p>
+      <w:r>
+        <w:t xml:space="preserve">Obsługa błędów scentralizowana jest w klasie </w:t>
+      </w:r>
+      <w:proofErr w:type="spellStart"/>
+      <w:r>
+        <w:t>ApiExceptionHandler</w:t>
+      </w:r>
+      <w:proofErr w:type="spellEnd"/>
+      <w:r>
+        <w:t xml:space="preserve"> oznaczonej adnotacją @ControllerAdvice. Serwisy rzucają wyjątek </w:t>
+      </w:r>
+      <w:proofErr w:type="spellStart"/>
+      <w:r>
+        <w:t>ResponseStatusException</w:t>
+      </w:r>
+      <w:proofErr w:type="spellEnd"/>
+      <w:r>
+        <w:t xml:space="preserve"> z odpowiednim kodem HTTP: </w:t>
+      </w:r>
+      <w:proofErr w:type="spellStart"/>
+      <w:r>
+        <w:t>HttpStatus.NOT_FOUND</w:t>
+      </w:r>
+      <w:proofErr w:type="spellEnd"/>
+      <w:r>
+        <w:t xml:space="preserve"> (404) gdy zasób nie istnieje w bazie, </w:t>
+      </w:r>
+      <w:proofErr w:type="spellStart"/>
+      <w:r>
+        <w:t>HttpStatus.BAD_REQUEST</w:t>
+      </w:r>
+      <w:proofErr w:type="spellEnd"/>
+      <w:r>
+        <w:t xml:space="preserve"> (400) przy nieprawidłowych danych wejściowych (np. brakujące wymagane pole </w:t>
+      </w:r>
+      <w:proofErr w:type="spellStart"/>
+      <w:r>
+        <w:t>familyId</w:t>
+      </w:r>
+      <w:proofErr w:type="spellEnd"/>
+      <w:r>
+        <w:t xml:space="preserve"> przy adresie rodziny) oraz </w:t>
+      </w:r>
+      <w:proofErr w:type="spellStart"/>
+      <w:r>
+        <w:t>HttpStatus.CONFLICT</w:t>
+      </w:r>
+      <w:proofErr w:type="spellEnd"/>
+      <w:r>
+        <w:t xml:space="preserve"> (409) przy próbie naruszenia unikalności (np. zduplikowany adres rodziny). Handler mapuje te wyjątki na ustrukturyzowane odpowiedzi JSON, ułatwiając diagnostykę po stronie klienta API.</w:t>
+      </w:r>
+    </w:p>
+    <w:p>
+      <w:pPr>
+        <w:pStyle w:val="Nagwek2"/>
+      </w:pPr>
+      <w:bookmarkStart w:id="19" w:name="_Toc232014368"/>
+      <w:r>
+        <w:t>Inicjalizacja i konfiguracja</w:t>
+      </w:r>
+      <w:bookmarkEnd w:id="19"/>
+    </w:p>
+    <w:p>
+      <w:r>
+        <w:t xml:space="preserve">Konfiguracja aplikacji przechowywana jest w pliku </w:t>
+      </w:r>
+      <w:proofErr w:type="spellStart"/>
+      <w:r>
+        <w:t>src</w:t>
+      </w:r>
+      <w:proofErr w:type="spellEnd"/>
+      <w:r>
+        <w:t>/</w:t>
+      </w:r>
+      <w:proofErr w:type="spellStart"/>
+      <w:r>
+        <w:t>main</w:t>
+      </w:r>
+      <w:proofErr w:type="spellEnd"/>
+      <w:r>
+        <w:t>/</w:t>
+      </w:r>
+      <w:proofErr w:type="spellStart"/>
+      <w:r>
+        <w:t>resources</w:t>
+      </w:r>
+      <w:proofErr w:type="spellEnd"/>
+      <w:r>
+        <w:t>/</w:t>
+      </w:r>
+      <w:proofErr w:type="spellStart"/>
+      <w:r>
+        <w:t>application.properties</w:t>
+      </w:r>
+      <w:proofErr w:type="spellEnd"/>
+      <w:r>
+        <w:t>. Baza H2 skonfigurowana jest w trybie plikowym (spring.datasource.url=jdbc:h</w:t>
+      </w:r>
+      <w:proofErr w:type="gramStart"/>
+      <w:r>
+        <w:t>2:file:./</w:t>
+      </w:r>
+      <w:proofErr w:type="gramEnd"/>
+      <w:r>
+        <w:t>data/</w:t>
+      </w:r>
+      <w:proofErr w:type="spellStart"/>
+      <w:r>
+        <w:t>eparish</w:t>
+      </w:r>
+      <w:proofErr w:type="spellEnd"/>
+      <w:r>
+        <w:t xml:space="preserve">), dzięki czemu dane zachowują się między restartami serwera. Opcja </w:t>
+      </w:r>
+      <w:proofErr w:type="spellStart"/>
+      <w:proofErr w:type="gramStart"/>
+      <w:r>
+        <w:t>spring.jpa.defer</w:t>
+      </w:r>
+      <w:proofErr w:type="gramEnd"/>
+      <w:r>
+        <w:t>-datasource-initialization</w:t>
+      </w:r>
+      <w:proofErr w:type="spellEnd"/>
+      <w:r>
+        <w:t>=</w:t>
+      </w:r>
+      <w:proofErr w:type="spellStart"/>
+      <w:r>
+        <w:t>true</w:t>
+      </w:r>
+      <w:proofErr w:type="spellEnd"/>
+      <w:r>
+        <w:t xml:space="preserve"> zapewnia, że schemat jest tworzony przez </w:t>
+      </w:r>
+      <w:proofErr w:type="spellStart"/>
+      <w:r>
+        <w:t>Hibernate</w:t>
+      </w:r>
+      <w:proofErr w:type="spellEnd"/>
+      <w:r>
+        <w:t xml:space="preserve"> zanim zostanie wykonany skrypt </w:t>
+      </w:r>
+      <w:proofErr w:type="spellStart"/>
+      <w:r>
+        <w:t>data.sql</w:t>
+      </w:r>
+      <w:proofErr w:type="spellEnd"/>
+      <w:r>
+        <w:t xml:space="preserve">. Katalog data/ jest wykluczony z repozytorium Git wpisem </w:t>
+      </w:r>
+      <w:proofErr w:type="gramStart"/>
+      <w:r>
+        <w:t>w .</w:t>
+      </w:r>
+      <w:proofErr w:type="spellStart"/>
+      <w:r>
+        <w:t>gitignore</w:t>
+      </w:r>
+      <w:proofErr w:type="spellEnd"/>
+      <w:proofErr w:type="gramEnd"/>
+      <w:r>
+        <w:t xml:space="preserve">, co zapobiega przypadkowemu </w:t>
+      </w:r>
+      <w:proofErr w:type="spellStart"/>
+      <w:r>
+        <w:t>commitowaniu</w:t>
+      </w:r>
+      <w:proofErr w:type="spellEnd"/>
+      <w:r>
+        <w:t xml:space="preserve"> danych testowych. Aby zresetować bazę do stanu startowego wystarczy usunąć katalog data/ i ponownie uruchomić aplikację.</w:t>
+      </w:r>
+    </w:p>
+    <w:p>
+      <w:pPr>
+        <w:pStyle w:val="Nagwek2"/>
+      </w:pPr>
+      <w:bookmarkStart w:id="20" w:name="_Toc232014369"/>
+      <w:r>
+        <w:t>Dokumentacja interaktywna API</w:t>
+      </w:r>
+      <w:bookmarkEnd w:id="20"/>
+    </w:p>
+    <w:p>
+      <w:r>
+        <w:t xml:space="preserve">Interaktywna dokumentacja wszystkich </w:t>
+      </w:r>
+      <w:proofErr w:type="spellStart"/>
+      <w:r>
+        <w:t>endpointów</w:t>
+      </w:r>
+      <w:proofErr w:type="spellEnd"/>
+      <w:r>
+        <w:t xml:space="preserve"> dostępna jest przez </w:t>
+      </w:r>
+      <w:proofErr w:type="spellStart"/>
+      <w:r>
+        <w:t>Swagger</w:t>
+      </w:r>
+      <w:proofErr w:type="spellEnd"/>
+      <w:r>
+        <w:t xml:space="preserve"> UI pod adresem http://localhost:8080/swagger-ui/index.html. Dokumentacja generowana jest automatycznie przez bibliotekę </w:t>
+      </w:r>
+      <w:proofErr w:type="spellStart"/>
+      <w:r>
+        <w:t>springdoc-openapi</w:t>
+      </w:r>
+      <w:proofErr w:type="spellEnd"/>
+      <w:r>
+        <w:t xml:space="preserve"> 2.8.9 na podstawie adnotacji @Operation (opis </w:t>
+      </w:r>
+      <w:proofErr w:type="spellStart"/>
+      <w:r>
+        <w:t>endpointu</w:t>
+      </w:r>
+      <w:proofErr w:type="spellEnd"/>
+      <w:r>
+        <w:t xml:space="preserve">) i @Tag (grupowanie w sekcje tematyczne) umieszczonych w kontrolerach REST. </w:t>
+      </w:r>
+      <w:proofErr w:type="spellStart"/>
+      <w:r>
+        <w:t>Swagger</w:t>
+      </w:r>
+      <w:proofErr w:type="spellEnd"/>
+      <w:r>
+        <w:t xml:space="preserve"> UI umożliwia bezpośrednie testowanie każdego </w:t>
+      </w:r>
+      <w:proofErr w:type="spellStart"/>
+      <w:r>
+        <w:t>endpointu</w:t>
+      </w:r>
+      <w:proofErr w:type="spellEnd"/>
+      <w:r>
+        <w:t xml:space="preserve"> z poziomu przeglądarki bez potrzeby używania zewnętrznych narzędzi. Strona startowa aplikacji (GET /) zawiera listę wszystkich zaimplementowanych przypadków użycia wraz z metodami HTTP i ścieżkami.</w:t>
+      </w:r>
+    </w:p>
     <w:p>
       <w:pPr>
         <w:pStyle w:val="Nagwek1"/>
       </w:pPr>
-      <w:bookmarkStart w:id="13" w:name="_Toc224203108"/>
+      <w:bookmarkStart w:id="21" w:name="_Toc232014370"/>
       <w:r>
         <w:t>Testy</w:t>
       </w:r>
-      <w:bookmarkEnd w:id="13"/>
+      <w:bookmarkEnd w:id="21"/>
     </w:p>
     <w:p>
       <w:pPr>
         <w:pStyle w:val="Nagwek2"/>
       </w:pPr>
+      <w:bookmarkStart w:id="22" w:name="_Toc232014371"/>
       <w:r>
         <w:t>Cel testów</w:t>
       </w:r>
+      <w:bookmarkEnd w:id="22"/>
     </w:p>
     <w:p>
       <w:r>
@@ -7578,7 +10329,11 @@
       </w:r>
       <w:proofErr w:type="spellEnd"/>
       <w:r>
-        <w:t xml:space="preserve">) oraz uruchamiano poprzez narzędzie testowe bazujące na wbudowanej bazie danych H2 (.\gradlew.bat test), wysyłając żądania HTTP do lokalnie uruchomionego </w:t>
+        <w:t xml:space="preserve">) oraz uruchamiano poprzez narzędzie testowe bazujące na </w:t>
+      </w:r>
+      <w:r>
+        <w:lastRenderedPageBreak/>
+        <w:t xml:space="preserve">wbudowanej bazie danych H2 (.\gradlew.bat test), wysyłając żądania HTTP do lokalnie uruchomionego </w:t>
       </w:r>
       <w:proofErr w:type="spellStart"/>
       <w:r>
@@ -7593,9 +10348,11 @@
       <w:pPr>
         <w:pStyle w:val="Nagwek2"/>
       </w:pPr>
+      <w:bookmarkStart w:id="23" w:name="_Toc232014372"/>
       <w:r>
         <w:t>Organizacja testów</w:t>
       </w:r>
+      <w:bookmarkEnd w:id="23"/>
     </w:p>
     <w:p>
       <w:r>
@@ -7825,12 +10582,12 @@
       <w:pPr>
         <w:pStyle w:val="Nagwek2"/>
       </w:pPr>
-      <w:bookmarkStart w:id="14" w:name="_GoBack"/>
-      <w:bookmarkEnd w:id="14"/>
+      <w:bookmarkStart w:id="24" w:name="_Toc232014373"/>
       <w:r>
         <w:lastRenderedPageBreak/>
         <w:t>Przygotowanie danych testowych</w:t>
       </w:r>
+      <w:bookmarkEnd w:id="24"/>
     </w:p>
     <w:p>
       <w:r>
@@ -8580,7 +11337,7 @@
             <v:path o:extrusionok="f" gradientshapeok="t" o:connecttype="rect"/>
             <o:lock v:ext="edit" aspectratio="t"/>
           </v:shapetype>
-          <v:shape id="_x0000_i1028" type="#_x0000_t75" style="width:294pt;height:114pt">
+          <v:shape id="_x0000_i1025" type="#_x0000_t75" style="width:294pt;height:114pt">
             <v:imagedata r:id="rId32" o:title="Zrzut ekranu 2026-06-07 184329"/>
           </v:shape>
         </w:pict>
@@ -8619,6 +11376,7 @@
       <w:pPr>
         <w:pStyle w:val="Nagwek2"/>
       </w:pPr>
+      <w:bookmarkStart w:id="25" w:name="_Toc232014374"/>
       <w:r>
         <w:t>Testy opieki duszpasterskiej i kartotek (</w:t>
       </w:r>
@@ -8638,6 +11396,7 @@
       <w:r>
         <w:t>)</w:t>
       </w:r>
+      <w:bookmarkEnd w:id="25"/>
     </w:p>
     <w:tbl>
       <w:tblPr>
@@ -9649,7 +12408,7 @@
       </w:pPr>
       <w:r>
         <w:pict w14:anchorId="0F12D3E3">
-          <v:shape id="_x0000_i1029" type="#_x0000_t75" style="width:279.6pt;height:173.4pt">
+          <v:shape id="_x0000_i1026" type="#_x0000_t75" style="width:279.75pt;height:173.25pt">
             <v:imagedata r:id="rId33" o:title="prowadzenie kartotek parafian1"/>
           </v:shape>
         </w:pict>
@@ -9671,7 +12430,7 @@
     <w:p>
       <w:r>
         <w:pict w14:anchorId="2B075B4F">
-          <v:shape id="_x0000_i1030" type="#_x0000_t75" style="width:453pt;height:85.8pt">
+          <v:shape id="_x0000_i1027" type="#_x0000_t75" style="width:453pt;height:85.5pt">
             <v:imagedata r:id="rId34" o:title="prowadzenie kartotek parafian8"/>
           </v:shape>
         </w:pict>
@@ -9699,6 +12458,7 @@
       <w:pPr>
         <w:pStyle w:val="Nagwek2"/>
       </w:pPr>
+      <w:bookmarkStart w:id="26" w:name="_Toc232014375"/>
       <w:r>
         <w:lastRenderedPageBreak/>
         <w:t>Testy grup parafialnych (</w:t>
@@ -9719,6 +12479,7 @@
       <w:r>
         <w:t>)</w:t>
       </w:r>
+      <w:bookmarkEnd w:id="26"/>
     </w:p>
     <w:tbl>
       <w:tblPr>
@@ -10458,7 +13219,7 @@
       </w:pPr>
       <w:r>
         <w:pict w14:anchorId="6A97C41F">
-          <v:shape id="_x0000_i1031" type="#_x0000_t75" style="width:297.6pt;height:112.8pt">
+          <v:shape id="_x0000_i1028" type="#_x0000_t75" style="width:297.75pt;height:112.5pt">
             <v:imagedata r:id="rId35" o:title="Zrzut ekranu 2026-06-07 185032"/>
           </v:shape>
         </w:pict>
@@ -10477,7 +13238,7 @@
     <w:p>
       <w:r>
         <w:pict w14:anchorId="26973C46">
-          <v:shape id="_x0000_i1034" type="#_x0000_t75" style="width:453pt;height:95.4pt">
+          <v:shape id="_x0000_i1029" type="#_x0000_t75" style="width:453pt;height:95.25pt">
             <v:imagedata r:id="rId36" o:title="Zrzut ekranu 2026-06-07 185142"/>
           </v:shape>
         </w:pict>
@@ -10497,6 +13258,7 @@
       <w:pPr>
         <w:pStyle w:val="Nagwek2"/>
       </w:pPr>
+      <w:bookmarkStart w:id="27" w:name="_Toc232014376"/>
       <w:r>
         <w:lastRenderedPageBreak/>
         <w:t xml:space="preserve">Testy organizacji wydarzeń i harmonogramów (Event </w:t>
@@ -10509,6 +13271,7 @@
       <w:r>
         <w:t>)</w:t>
       </w:r>
+      <w:bookmarkEnd w:id="27"/>
     </w:p>
     <w:tbl>
       <w:tblPr>
@@ -11238,7 +14001,7 @@
       </w:pPr>
       <w:r>
         <w:pict w14:anchorId="5E780C59">
-          <v:shape id="_x0000_i1037" type="#_x0000_t75" style="width:300.6pt;height:147pt">
+          <v:shape id="_x0000_i1030" type="#_x0000_t75" style="width:300.75pt;height:147pt">
             <v:imagedata r:id="rId37" o:title="Zrzut ekranu 2026-06-07 182448"/>
           </v:shape>
         </w:pict>
@@ -11263,7 +14026,7 @@
       </w:pPr>
       <w:r>
         <w:pict w14:anchorId="484FA7CA">
-          <v:shape id="_x0000_i1038" type="#_x0000_t75" style="width:300.6pt;height:115.8pt">
+          <v:shape id="_x0000_i1031" type="#_x0000_t75" style="width:300.75pt;height:115.5pt">
             <v:imagedata r:id="rId38" o:title="Zrzut ekranu 2026-06-07 182737"/>
           </v:shape>
         </w:pict>
@@ -11280,7 +14043,7 @@
         </w:rPr>
         <w:lastRenderedPageBreak/>
         <w:drawing>
-          <wp:inline distT="0" distB="0" distL="0" distR="0" wp14:anchorId="24A01C20" wp14:editId="007B714D">
+          <wp:inline distT="0" distB="0" distL="0" distR="0" wp14:anchorId="24A01C20" wp14:editId="71081A2B">
             <wp:extent cx="5760720" cy="1234440"/>
             <wp:effectExtent l="0" t="0" r="0" b="3810"/>
             <wp:docPr id="2" name="Obraz 2" descr="C:\Users\ASUS\AppData\Local\Microsoft\Windows\INetCache\Content.Word\Zrzut ekranu 2026-06-07 182808.png"/>
@@ -11353,9 +14116,11 @@
       <w:pPr>
         <w:pStyle w:val="Nagwek2"/>
       </w:pPr>
+      <w:bookmarkStart w:id="28" w:name="_Toc232014377"/>
       <w:r>
         <w:t>Podsumowanie</w:t>
       </w:r>
+      <w:bookmarkEnd w:id="28"/>
     </w:p>
     <w:p>
       <w:r>
@@ -11380,21 +14145,177 @@
       <w:pPr>
         <w:pStyle w:val="Nagwek1"/>
       </w:pPr>
-      <w:bookmarkStart w:id="15" w:name="_Toc224203109"/>
+      <w:bookmarkStart w:id="29" w:name="_Toc232014378"/>
       <w:r>
         <w:t>Informacje dodatkowe</w:t>
       </w:r>
-      <w:bookmarkEnd w:id="15"/>
+      <w:bookmarkEnd w:id="29"/>
     </w:p>
     <w:p>
       <w:pPr>
         <w:pStyle w:val="Nagwek2"/>
       </w:pPr>
-      <w:bookmarkStart w:id="16" w:name="_Toc224203110"/>
+      <w:bookmarkStart w:id="30" w:name="_Toc232014379"/>
       <w:r>
         <w:t>Role w projekcie</w:t>
       </w:r>
-      <w:bookmarkEnd w:id="16"/>
+      <w:bookmarkEnd w:id="30"/>
+    </w:p>
+    <w:p>
+      <w:pPr>
+        <w:rPr>
+          <w:b/>
+          <w:bCs/>
+        </w:rPr>
+      </w:pPr>
+      <w:r>
+        <w:rPr>
+          <w:b/>
+          <w:bCs/>
+        </w:rPr>
+        <w:t>Analitycy:</w:t>
+      </w:r>
+    </w:p>
+    <w:p>
+      <w:r>
+        <w:t xml:space="preserve">Anita </w:t>
+      </w:r>
+      <w:proofErr w:type="spellStart"/>
+      <w:r>
+        <w:t>Gumieniak</w:t>
+      </w:r>
+      <w:proofErr w:type="spellEnd"/>
+    </w:p>
+    <w:p>
+      <w:r>
+        <w:t xml:space="preserve">Piotr </w:t>
+      </w:r>
+      <w:proofErr w:type="spellStart"/>
+      <w:r>
+        <w:t>Kut</w:t>
+      </w:r>
+      <w:proofErr w:type="spellEnd"/>
+    </w:p>
+    <w:p>
+      <w:r>
+        <w:t>Marta Flis</w:t>
+      </w:r>
+    </w:p>
+    <w:p>
+      <w:r>
+        <w:t>Faustyna Gryboś</w:t>
+      </w:r>
+    </w:p>
+    <w:p>
+      <w:r>
+        <w:rPr>
+          <w:b/>
+          <w:bCs/>
+        </w:rPr>
+        <w:t xml:space="preserve">Projektanci: </w:t>
+      </w:r>
+    </w:p>
+    <w:p>
+      <w:r>
+        <w:t>Mateusz Domin</w:t>
+      </w:r>
+    </w:p>
+    <w:p>
+      <w:r>
+        <w:t xml:space="preserve">Mateusz </w:t>
+      </w:r>
+      <w:proofErr w:type="spellStart"/>
+      <w:r>
+        <w:t>Draus</w:t>
+      </w:r>
+      <w:proofErr w:type="spellEnd"/>
+    </w:p>
+    <w:p>
+      <w:pPr>
+        <w:spacing w:line="259" w:lineRule="auto"/>
+        <w:jc w:val="left"/>
+      </w:pPr>
+      <w:r>
+        <w:br w:type="page"/>
+      </w:r>
+    </w:p>
+    <w:p>
+      <w:pPr>
+        <w:rPr>
+          <w:b/>
+          <w:bCs/>
+        </w:rPr>
+      </w:pPr>
+      <w:r>
+        <w:rPr>
+          <w:b/>
+          <w:bCs/>
+        </w:rPr>
+        <w:lastRenderedPageBreak/>
+        <w:t>Programiści:</w:t>
+      </w:r>
+    </w:p>
+    <w:p>
+      <w:r>
+        <w:t>Mikołaj Data</w:t>
+      </w:r>
+    </w:p>
+    <w:p>
+      <w:r>
+        <w:t>Maciej Gilecki</w:t>
+      </w:r>
+    </w:p>
+    <w:p>
+      <w:r>
+        <w:t>Paweł Górski</w:t>
+      </w:r>
+    </w:p>
+    <w:p>
+      <w:r>
+        <w:t xml:space="preserve">Mateusz </w:t>
+      </w:r>
+      <w:proofErr w:type="spellStart"/>
+      <w:r>
+        <w:t>Gałda</w:t>
+      </w:r>
+      <w:proofErr w:type="spellEnd"/>
+    </w:p>
+    <w:p>
+      <w:pPr>
+        <w:rPr>
+          <w:b/>
+          <w:bCs/>
+        </w:rPr>
+      </w:pPr>
+      <w:r>
+        <w:rPr>
+          <w:b/>
+          <w:bCs/>
+        </w:rPr>
+        <w:t>Testerzy</w:t>
+      </w:r>
+      <w:r>
+        <w:rPr>
+          <w:b/>
+          <w:bCs/>
+        </w:rPr>
+        <w:t>:</w:t>
+      </w:r>
+    </w:p>
+    <w:p>
+      <w:r>
+        <w:t>Aleksandra Gabro</w:t>
+      </w:r>
+    </w:p>
+    <w:p>
+      <w:r>
+        <w:t>Wioletta Grabias</w:t>
+      </w:r>
+    </w:p>
+    <w:p>
+      <w:r>
+        <w:t>Jakub Dul</w:t>
+      </w:r>
     </w:p>
     <w:p/>
     <w:sectPr>
@@ -11408,7 +14329,7 @@
 </file>
 
 <file path=word/endnotes.xml><?xml version="1.0" encoding="utf-8"?>
-<w:endnotes xmlns:wpc="http://schemas.microsoft.com/office/word/2010/wordprocessingCanvas" xmlns:cx="http://schemas.microsoft.com/office/drawing/2014/chartex" xmlns:cx1="http://schemas.microsoft.com/office/drawing/2015/9/8/chartex" xmlns:mc="http://schemas.openxmlformats.org/markup-compatibility/2006" xmlns:o="urn:schemas-microsoft-com:office:office" xmlns:r="http://schemas.openxmlformats.org/officeDocument/2006/relationships" xmlns:m="http://schemas.openxmlformats.org/officeDocument/2006/math" xmlns:v="urn:schemas-microsoft-com:vml" xmlns:wp14="http://schemas.microsoft.com/office/word/2010/wordprocessingDrawing" xmlns:wp="http://schemas.openxmlformats.org/drawingml/2006/wordprocessingDrawing" xmlns:w10="urn:schemas-microsoft-com:office:word" xmlns:w="http://schemas.openxmlformats.org/wordprocessingml/2006/main" xmlns:w14="http://schemas.microsoft.com/office/word/2010/wordml" xmlns:w15="http://schemas.microsoft.com/office/word/2012/wordml" xmlns:w16se="http://schemas.microsoft.com/office/word/2015/wordml/symex" xmlns:wpg="http://schemas.microsoft.com/office/word/2010/wordprocessingGroup" xmlns:wpi="http://schemas.microsoft.com/office/word/2010/wordprocessingInk" xmlns:wne="http://schemas.microsoft.com/office/word/2006/wordml" xmlns:wps="http://schemas.microsoft.com/office/word/2010/wordprocessingShape" mc:Ignorable="w14 w15 w16se wp14">
+<w:endnotes xmlns:wpc="http://schemas.microsoft.com/office/word/2010/wordprocessingCanvas" xmlns:cx="http://schemas.microsoft.com/office/drawing/2014/chartex" xmlns:cx1="http://schemas.microsoft.com/office/drawing/2015/9/8/chartex" xmlns:cx2="http://schemas.microsoft.com/office/drawing/2015/10/21/chartex" xmlns:cx3="http://schemas.microsoft.com/office/drawing/2016/5/9/chartex" xmlns:cx4="http://schemas.microsoft.com/office/drawing/2016/5/10/chartex" xmlns:cx5="http://schemas.microsoft.com/office/drawing/2016/5/11/chartex" xmlns:cx6="http://schemas.microsoft.com/office/drawing/2016/5/12/chartex" xmlns:cx7="http://schemas.microsoft.com/office/drawing/2016/5/13/chartex" xmlns:cx8="http://schemas.microsoft.com/office/drawing/2016/5/14/chartex" xmlns:mc="http://schemas.openxmlformats.org/markup-compatibility/2006" xmlns:aink="http://schemas.microsoft.com/office/drawing/2016/ink" xmlns:am3d="http://schemas.microsoft.com/office/drawing/2017/model3d" xmlns:o="urn:schemas-microsoft-com:office:office" xmlns:oel="http://schemas.microsoft.com/office/2019/extlst" xmlns:r="http://schemas.openxmlformats.org/officeDocument/2006/relationships" xmlns:m="http://schemas.openxmlformats.org/officeDocument/2006/math" xmlns:v="urn:schemas-microsoft-com:vml" xmlns:wp14="http://schemas.microsoft.com/office/word/2010/wordprocessingDrawing" xmlns:wp="http://schemas.openxmlformats.org/drawingml/2006/wordprocessingDrawing" xmlns:w10="urn:schemas-microsoft-com:office:word" xmlns:w="http://schemas.openxmlformats.org/wordprocessingml/2006/main" xmlns:w14="http://schemas.microsoft.com/office/word/2010/wordml" xmlns:w15="http://schemas.microsoft.com/office/word/2012/wordml" xmlns:w16cex="http://schemas.microsoft.com/office/word/2018/wordml/cex" xmlns:w16cid="http://schemas.microsoft.com/office/word/2016/wordml/cid" xmlns:w16="http://schemas.microsoft.com/office/word/2018/wordml" xmlns:w16du="http://schemas.microsoft.com/office/word/2023/wordml/word16du" xmlns:w16sdtdh="http://schemas.microsoft.com/office/word/2020/wordml/sdtdatahash" xmlns:w16sdtfl="http://schemas.microsoft.com/office/word/2024/wordml/sdtformatlock" xmlns:w16se="http://schemas.microsoft.com/office/word/2015/wordml/symex" xmlns:wpg="http://schemas.microsoft.com/office/word/2010/wordprocessingGroup" xmlns:wpi="http://schemas.microsoft.com/office/word/2010/wordprocessingInk" xmlns:wne="http://schemas.microsoft.com/office/word/2006/wordml" xmlns:wps="http://schemas.microsoft.com/office/word/2010/wordprocessingShape" mc:Ignorable="w14 w15 w16se w16cid w16 w16cex w16sdtdh w16sdtfl w16du wp14">
   <w:endnote w:type="separator" w:id="-1">
     <w:p>
       <w:pPr>
@@ -11433,7 +14354,7 @@
 </file>
 
 <file path=word/footer1.xml><?xml version="1.0" encoding="utf-8"?>
-<w:ftr xmlns:wpc="http://schemas.microsoft.com/office/word/2010/wordprocessingCanvas" xmlns:cx="http://schemas.microsoft.com/office/drawing/2014/chartex" xmlns:cx1="http://schemas.microsoft.com/office/drawing/2015/9/8/chartex" xmlns:mc="http://schemas.openxmlformats.org/markup-compatibility/2006" xmlns:o="urn:schemas-microsoft-com:office:office" xmlns:r="http://schemas.openxmlformats.org/officeDocument/2006/relationships" xmlns:m="http://schemas.openxmlformats.org/officeDocument/2006/math" xmlns:v="urn:schemas-microsoft-com:vml" xmlns:wp14="http://schemas.microsoft.com/office/word/2010/wordprocessingDrawing" xmlns:wp="http://schemas.openxmlformats.org/drawingml/2006/wordprocessingDrawing" xmlns:w10="urn:schemas-microsoft-com:office:word" xmlns:w="http://schemas.openxmlformats.org/wordprocessingml/2006/main" xmlns:w14="http://schemas.microsoft.com/office/word/2010/wordml" xmlns:w15="http://schemas.microsoft.com/office/word/2012/wordml" xmlns:w16se="http://schemas.microsoft.com/office/word/2015/wordml/symex" xmlns:wpg="http://schemas.microsoft.com/office/word/2010/wordprocessingGroup" xmlns:wpi="http://schemas.microsoft.com/office/word/2010/wordprocessingInk" xmlns:wne="http://schemas.microsoft.com/office/word/2006/wordml" xmlns:wps="http://schemas.microsoft.com/office/word/2010/wordprocessingShape" mc:Ignorable="w14 w15 w16se wp14">
+<w:ftr xmlns:wpc="http://schemas.microsoft.com/office/word/2010/wordprocessingCanvas" xmlns:cx="http://schemas.microsoft.com/office/drawing/2014/chartex" xmlns:cx1="http://schemas.microsoft.com/office/drawing/2015/9/8/chartex" xmlns:cx2="http://schemas.microsoft.com/office/drawing/2015/10/21/chartex" xmlns:cx3="http://schemas.microsoft.com/office/drawing/2016/5/9/chartex" xmlns:cx4="http://schemas.microsoft.com/office/drawing/2016/5/10/chartex" xmlns:cx5="http://schemas.microsoft.com/office/drawing/2016/5/11/chartex" xmlns:cx6="http://schemas.microsoft.com/office/drawing/2016/5/12/chartex" xmlns:cx7="http://schemas.microsoft.com/office/drawing/2016/5/13/chartex" xmlns:cx8="http://schemas.microsoft.com/office/drawing/2016/5/14/chartex" xmlns:mc="http://schemas.openxmlformats.org/markup-compatibility/2006" xmlns:aink="http://schemas.microsoft.com/office/drawing/2016/ink" xmlns:am3d="http://schemas.microsoft.com/office/drawing/2017/model3d" xmlns:o="urn:schemas-microsoft-com:office:office" xmlns:oel="http://schemas.microsoft.com/office/2019/extlst" xmlns:r="http://schemas.openxmlformats.org/officeDocument/2006/relationships" xmlns:m="http://schemas.openxmlformats.org/officeDocument/2006/math" xmlns:v="urn:schemas-microsoft-com:vml" xmlns:wp14="http://schemas.microsoft.com/office/word/2010/wordprocessingDrawing" xmlns:wp="http://schemas.openxmlformats.org/drawingml/2006/wordprocessingDrawing" xmlns:w10="urn:schemas-microsoft-com:office:word" xmlns:w="http://schemas.openxmlformats.org/wordprocessingml/2006/main" xmlns:w14="http://schemas.microsoft.com/office/word/2010/wordml" xmlns:w15="http://schemas.microsoft.com/office/word/2012/wordml" xmlns:w16cex="http://schemas.microsoft.com/office/word/2018/wordml/cex" xmlns:w16cid="http://schemas.microsoft.com/office/word/2016/wordml/cid" xmlns:w16="http://schemas.microsoft.com/office/word/2018/wordml" xmlns:w16du="http://schemas.microsoft.com/office/word/2023/wordml/word16du" xmlns:w16sdtdh="http://schemas.microsoft.com/office/word/2020/wordml/sdtdatahash" xmlns:w16sdtfl="http://schemas.microsoft.com/office/word/2024/wordml/sdtformatlock" xmlns:w16se="http://schemas.microsoft.com/office/word/2015/wordml/symex" xmlns:wpg="http://schemas.microsoft.com/office/word/2010/wordprocessingGroup" xmlns:wpi="http://schemas.microsoft.com/office/word/2010/wordprocessingInk" xmlns:wne="http://schemas.microsoft.com/office/word/2006/wordml" xmlns:wps="http://schemas.microsoft.com/office/word/2010/wordprocessingShape" mc:Ignorable="w14 w15 w16se w16cid w16 w16cex w16sdtdh w16sdtfl w16du wp14">
   <w:tbl>
     <w:tblPr>
       <w:tblW w:w="0" w:type="auto"/>
@@ -11493,7 +14414,7 @@
 </file>
 
 <file path=word/footnotes.xml><?xml version="1.0" encoding="utf-8"?>
-<w:footnotes xmlns:wpc="http://schemas.microsoft.com/office/word/2010/wordprocessingCanvas" xmlns:cx="http://schemas.microsoft.com/office/drawing/2014/chartex" xmlns:cx1="http://schemas.microsoft.com/office/drawing/2015/9/8/chartex" xmlns:mc="http://schemas.openxmlformats.org/markup-compatibility/2006" xmlns:o="urn:schemas-microsoft-com:office:office" xmlns:r="http://schemas.openxmlformats.org/officeDocument/2006/relationships" xmlns:m="http://schemas.openxmlformats.org/officeDocument/2006/math" xmlns:v="urn:schemas-microsoft-com:vml" xmlns:wp14="http://schemas.microsoft.com/office/word/2010/wordprocessingDrawing" xmlns:wp="http://schemas.openxmlformats.org/drawingml/2006/wordprocessingDrawing" xmlns:w10="urn:schemas-microsoft-com:office:word" xmlns:w="http://schemas.openxmlformats.org/wordprocessingml/2006/main" xmlns:w14="http://schemas.microsoft.com/office/word/2010/wordml" xmlns:w15="http://schemas.microsoft.com/office/word/2012/wordml" xmlns:w16se="http://schemas.microsoft.com/office/word/2015/wordml/symex" xmlns:wpg="http://schemas.microsoft.com/office/word/2010/wordprocessingGroup" xmlns:wpi="http://schemas.microsoft.com/office/word/2010/wordprocessingInk" xmlns:wne="http://schemas.microsoft.com/office/word/2006/wordml" xmlns:wps="http://schemas.microsoft.com/office/word/2010/wordprocessingShape" mc:Ignorable="w14 w15 w16se wp14">
+<w:footnotes xmlns:wpc="http://schemas.microsoft.com/office/word/2010/wordprocessingCanvas" xmlns:cx="http://schemas.microsoft.com/office/drawing/2014/chartex" xmlns:cx1="http://schemas.microsoft.com/office/drawing/2015/9/8/chartex" xmlns:cx2="http://schemas.microsoft.com/office/drawing/2015/10/21/chartex" xmlns:cx3="http://schemas.microsoft.com/office/drawing/2016/5/9/chartex" xmlns:cx4="http://schemas.microsoft.com/office/drawing/2016/5/10/chartex" xmlns:cx5="http://schemas.microsoft.com/office/drawing/2016/5/11/chartex" xmlns:cx6="http://schemas.microsoft.com/office/drawing/2016/5/12/chartex" xmlns:cx7="http://schemas.microsoft.com/office/drawing/2016/5/13/chartex" xmlns:cx8="http://schemas.microsoft.com/office/drawing/2016/5/14/chartex" xmlns:mc="http://schemas.openxmlformats.org/markup-compatibility/2006" xmlns:aink="http://schemas.microsoft.com/office/drawing/2016/ink" xmlns:am3d="http://schemas.microsoft.com/office/drawing/2017/model3d" xmlns:o="urn:schemas-microsoft-com:office:office" xmlns:oel="http://schemas.microsoft.com/office/2019/extlst" xmlns:r="http://schemas.openxmlformats.org/officeDocument/2006/relationships" xmlns:m="http://schemas.openxmlformats.org/officeDocument/2006/math" xmlns:v="urn:schemas-microsoft-com:vml" xmlns:wp14="http://schemas.microsoft.com/office/word/2010/wordprocessingDrawing" xmlns:wp="http://schemas.openxmlformats.org/drawingml/2006/wordprocessingDrawing" xmlns:w10="urn:schemas-microsoft-com:office:word" xmlns:w="http://schemas.openxmlformats.org/wordprocessingml/2006/main" xmlns:w14="http://schemas.microsoft.com/office/word/2010/wordml" xmlns:w15="http://schemas.microsoft.com/office/word/2012/wordml" xmlns:w16cex="http://schemas.microsoft.com/office/word/2018/wordml/cex" xmlns:w16cid="http://schemas.microsoft.com/office/word/2016/wordml/cid" xmlns:w16="http://schemas.microsoft.com/office/word/2018/wordml" xmlns:w16du="http://schemas.microsoft.com/office/word/2023/wordml/word16du" xmlns:w16sdtdh="http://schemas.microsoft.com/office/word/2020/wordml/sdtdatahash" xmlns:w16sdtfl="http://schemas.microsoft.com/office/word/2024/wordml/sdtformatlock" xmlns:w16se="http://schemas.microsoft.com/office/word/2015/wordml/symex" xmlns:wpg="http://schemas.microsoft.com/office/word/2010/wordprocessingGroup" xmlns:wpi="http://schemas.microsoft.com/office/word/2010/wordprocessingInk" xmlns:wne="http://schemas.microsoft.com/office/word/2006/wordml" xmlns:wps="http://schemas.microsoft.com/office/word/2010/wordprocessingShape" mc:Ignorable="w14 w15 w16se w16cid w16 w16cex w16sdtdh w16sdtfl w16du wp14">
   <w:footnote w:type="separator" w:id="-1">
     <w:p>
       <w:pPr>
@@ -11518,7 +14439,7 @@
 </file>
 
 <file path=word/header1.xml><?xml version="1.0" encoding="utf-8"?>
-<w:hdr xmlns:wpc="http://schemas.microsoft.com/office/word/2010/wordprocessingCanvas" xmlns:cx="http://schemas.microsoft.com/office/drawing/2014/chartex" xmlns:cx1="http://schemas.microsoft.com/office/drawing/2015/9/8/chartex" xmlns:mc="http://schemas.openxmlformats.org/markup-compatibility/2006" xmlns:o="urn:schemas-microsoft-com:office:office" xmlns:r="http://schemas.openxmlformats.org/officeDocument/2006/relationships" xmlns:m="http://schemas.openxmlformats.org/officeDocument/2006/math" xmlns:v="urn:schemas-microsoft-com:vml" xmlns:wp14="http://schemas.microsoft.com/office/word/2010/wordprocessingDrawing" xmlns:wp="http://schemas.openxmlformats.org/drawingml/2006/wordprocessingDrawing" xmlns:w10="urn:schemas-microsoft-com:office:word" xmlns:w="http://schemas.openxmlformats.org/wordprocessingml/2006/main" xmlns:w14="http://schemas.microsoft.com/office/word/2010/wordml" xmlns:w15="http://schemas.microsoft.com/office/word/2012/wordml" xmlns:w16se="http://schemas.microsoft.com/office/word/2015/wordml/symex" xmlns:wpg="http://schemas.microsoft.com/office/word/2010/wordprocessingGroup" xmlns:wpi="http://schemas.microsoft.com/office/word/2010/wordprocessingInk" xmlns:wne="http://schemas.microsoft.com/office/word/2006/wordml" xmlns:wps="http://schemas.microsoft.com/office/word/2010/wordprocessingShape" mc:Ignorable="w14 w15 w16se wp14">
+<w:hdr xmlns:wpc="http://schemas.microsoft.com/office/word/2010/wordprocessingCanvas" xmlns:cx="http://schemas.microsoft.com/office/drawing/2014/chartex" xmlns:cx1="http://schemas.microsoft.com/office/drawing/2015/9/8/chartex" xmlns:cx2="http://schemas.microsoft.com/office/drawing/2015/10/21/chartex" xmlns:cx3="http://schemas.microsoft.com/office/drawing/2016/5/9/chartex" xmlns:cx4="http://schemas.microsoft.com/office/drawing/2016/5/10/chartex" xmlns:cx5="http://schemas.microsoft.com/office/drawing/2016/5/11/chartex" xmlns:cx6="http://schemas.microsoft.com/office/drawing/2016/5/12/chartex" xmlns:cx7="http://schemas.microsoft.com/office/drawing/2016/5/13/chartex" xmlns:cx8="http://schemas.microsoft.com/office/drawing/2016/5/14/chartex" xmlns:mc="http://schemas.openxmlformats.org/markup-compatibility/2006" xmlns:aink="http://schemas.microsoft.com/office/drawing/2016/ink" xmlns:am3d="http://schemas.microsoft.com/office/drawing/2017/model3d" xmlns:o="urn:schemas-microsoft-com:office:office" xmlns:oel="http://schemas.microsoft.com/office/2019/extlst" xmlns:r="http://schemas.openxmlformats.org/officeDocument/2006/relationships" xmlns:m="http://schemas.openxmlformats.org/officeDocument/2006/math" xmlns:v="urn:schemas-microsoft-com:vml" xmlns:wp14="http://schemas.microsoft.com/office/word/2010/wordprocessingDrawing" xmlns:wp="http://schemas.openxmlformats.org/drawingml/2006/wordprocessingDrawing" xmlns:w10="urn:schemas-microsoft-com:office:word" xmlns:w="http://schemas.openxmlformats.org/wordprocessingml/2006/main" xmlns:w14="http://schemas.microsoft.com/office/word/2010/wordml" xmlns:w15="http://schemas.microsoft.com/office/word/2012/wordml" xmlns:w16cex="http://schemas.microsoft.com/office/word/2018/wordml/cex" xmlns:w16cid="http://schemas.microsoft.com/office/word/2016/wordml/cid" xmlns:w16="http://schemas.microsoft.com/office/word/2018/wordml" xmlns:w16du="http://schemas.microsoft.com/office/word/2023/wordml/word16du" xmlns:w16sdtdh="http://schemas.microsoft.com/office/word/2020/wordml/sdtdatahash" xmlns:w16sdtfl="http://schemas.microsoft.com/office/word/2024/wordml/sdtformatlock" xmlns:w16se="http://schemas.microsoft.com/office/word/2015/wordml/symex" xmlns:wpg="http://schemas.microsoft.com/office/word/2010/wordprocessingGroup" xmlns:wpi="http://schemas.microsoft.com/office/word/2010/wordprocessingInk" xmlns:wne="http://schemas.microsoft.com/office/word/2006/wordml" xmlns:wps="http://schemas.microsoft.com/office/word/2010/wordprocessingShape" mc:Ignorable="w14 w15 w16se w16cid w16 w16cex w16sdtdh w16sdtfl w16du wp14">
   <w:tbl>
     <w:tblPr>
       <w:tblW w:w="0" w:type="auto"/>
@@ -11578,7 +14499,7 @@
 </file>
 
 <file path=word/numbering.xml><?xml version="1.0" encoding="utf-8"?>
-<w:numbering xmlns:wpc="http://schemas.microsoft.com/office/word/2010/wordprocessingCanvas" xmlns:cx="http://schemas.microsoft.com/office/drawing/2014/chartex" xmlns:cx1="http://schemas.microsoft.com/office/drawing/2015/9/8/chartex" xmlns:mc="http://schemas.openxmlformats.org/markup-compatibility/2006" xmlns:o="urn:schemas-microsoft-com:office:office" xmlns:r="http://schemas.openxmlformats.org/officeDocument/2006/relationships" xmlns:m="http://schemas.openxmlformats.org/officeDocument/2006/math" xmlns:v="urn:schemas-microsoft-com:vml" xmlns:wp14="http://schemas.microsoft.com/office/word/2010/wordprocessingDrawing" xmlns:wp="http://schemas.openxmlformats.org/drawingml/2006/wordprocessingDrawing" xmlns:w10="urn:schemas-microsoft-com:office:word" xmlns:w="http://schemas.openxmlformats.org/wordprocessingml/2006/main" xmlns:w14="http://schemas.microsoft.com/office/word/2010/wordml" xmlns:w15="http://schemas.microsoft.com/office/word/2012/wordml" xmlns:w16se="http://schemas.microsoft.com/office/word/2015/wordml/symex" xmlns:wpg="http://schemas.microsoft.com/office/word/2010/wordprocessingGroup" xmlns:wpi="http://schemas.microsoft.com/office/word/2010/wordprocessingInk" xmlns:wne="http://schemas.microsoft.com/office/word/2006/wordml" xmlns:wps="http://schemas.microsoft.com/office/word/2010/wordprocessingShape" mc:Ignorable="w14 w15 w16se wp14">
+<w:numbering xmlns:wpc="http://schemas.microsoft.com/office/word/2010/wordprocessingCanvas" xmlns:cx="http://schemas.microsoft.com/office/drawing/2014/chartex" xmlns:cx1="http://schemas.microsoft.com/office/drawing/2015/9/8/chartex" xmlns:cx2="http://schemas.microsoft.com/office/drawing/2015/10/21/chartex" xmlns:cx3="http://schemas.microsoft.com/office/drawing/2016/5/9/chartex" xmlns:cx4="http://schemas.microsoft.com/office/drawing/2016/5/10/chartex" xmlns:cx5="http://schemas.microsoft.com/office/drawing/2016/5/11/chartex" xmlns:cx6="http://schemas.microsoft.com/office/drawing/2016/5/12/chartex" xmlns:cx7="http://schemas.microsoft.com/office/drawing/2016/5/13/chartex" xmlns:cx8="http://schemas.microsoft.com/office/drawing/2016/5/14/chartex" xmlns:mc="http://schemas.openxmlformats.org/markup-compatibility/2006" xmlns:aink="http://schemas.microsoft.com/office/drawing/2016/ink" xmlns:am3d="http://schemas.microsoft.com/office/drawing/2017/model3d" xmlns:o="urn:schemas-microsoft-com:office:office" xmlns:oel="http://schemas.microsoft.com/office/2019/extlst" xmlns:r="http://schemas.openxmlformats.org/officeDocument/2006/relationships" xmlns:m="http://schemas.openxmlformats.org/officeDocument/2006/math" xmlns:v="urn:schemas-microsoft-com:vml" xmlns:wp14="http://schemas.microsoft.com/office/word/2010/wordprocessingDrawing" xmlns:wp="http://schemas.openxmlformats.org/drawingml/2006/wordprocessingDrawing" xmlns:w10="urn:schemas-microsoft-com:office:word" xmlns:w="http://schemas.openxmlformats.org/wordprocessingml/2006/main" xmlns:w14="http://schemas.microsoft.com/office/word/2010/wordml" xmlns:w15="http://schemas.microsoft.com/office/word/2012/wordml" xmlns:w16cex="http://schemas.microsoft.com/office/word/2018/wordml/cex" xmlns:w16cid="http://schemas.microsoft.com/office/word/2016/wordml/cid" xmlns:w16="http://schemas.microsoft.com/office/word/2018/wordml" xmlns:w16du="http://schemas.microsoft.com/office/word/2023/wordml/word16du" xmlns:w16sdtdh="http://schemas.microsoft.com/office/word/2020/wordml/sdtdatahash" xmlns:w16sdtfl="http://schemas.microsoft.com/office/word/2024/wordml/sdtformatlock" xmlns:w16se="http://schemas.microsoft.com/office/word/2015/wordml/symex" xmlns:wpg="http://schemas.microsoft.com/office/word/2010/wordprocessingGroup" xmlns:wpi="http://schemas.microsoft.com/office/word/2010/wordprocessingInk" xmlns:wne="http://schemas.microsoft.com/office/word/2006/wordml" xmlns:wps="http://schemas.microsoft.com/office/word/2010/wordprocessingShape" mc:Ignorable="w14 w15 w16se w16cid w16 w16cex w16sdtdh w16sdtfl w16du wp14">
   <w:abstractNum w:abstractNumId="0" w15:restartNumberingAfterBreak="0">
     <w:nsid w:val="16FF5D21"/>
     <w:multiLevelType w:val="multilevel"/>
@@ -12707,38 +15628,38 @@
       </w:pPr>
     </w:lvl>
   </w:abstractNum>
-  <w:num w:numId="1">
+  <w:num w:numId="1" w16cid:durableId="1111974341">
     <w:abstractNumId w:val="5"/>
   </w:num>
-  <w:num w:numId="2">
+  <w:num w:numId="2" w16cid:durableId="265121778">
     <w:abstractNumId w:val="3"/>
   </w:num>
-  <w:num w:numId="3">
+  <w:num w:numId="3" w16cid:durableId="1385908743">
     <w:abstractNumId w:val="0"/>
   </w:num>
-  <w:num w:numId="4">
+  <w:num w:numId="4" w16cid:durableId="351495970">
     <w:abstractNumId w:val="6"/>
   </w:num>
-  <w:num w:numId="5">
+  <w:num w:numId="5" w16cid:durableId="1247881957">
     <w:abstractNumId w:val="1"/>
   </w:num>
-  <w:num w:numId="6">
+  <w:num w:numId="6" w16cid:durableId="187449503">
     <w:abstractNumId w:val="4"/>
   </w:num>
-  <w:num w:numId="7">
+  <w:num w:numId="7" w16cid:durableId="2103183138">
     <w:abstractNumId w:val="8"/>
   </w:num>
-  <w:num w:numId="8">
+  <w:num w:numId="8" w16cid:durableId="1516962421">
     <w:abstractNumId w:val="7"/>
   </w:num>
-  <w:num w:numId="9">
+  <w:num w:numId="9" w16cid:durableId="860243546">
     <w:abstractNumId w:val="2"/>
   </w:num>
 </w:numbering>
 </file>
 
 <file path=word/styles.xml><?xml version="1.0" encoding="utf-8"?>
-<w:styles xmlns:mc="http://schemas.openxmlformats.org/markup-compatibility/2006" xmlns:r="http://schemas.openxmlformats.org/officeDocument/2006/relationships" xmlns:w="http://schemas.openxmlformats.org/wordprocessingml/2006/main" xmlns:w14="http://schemas.microsoft.com/office/word/2010/wordml" xmlns:w15="http://schemas.microsoft.com/office/word/2012/wordml" xmlns:w16se="http://schemas.microsoft.com/office/word/2015/wordml/symex" mc:Ignorable="w14 w15 w16se">
+<w:styles xmlns:mc="http://schemas.openxmlformats.org/markup-compatibility/2006" xmlns:r="http://schemas.openxmlformats.org/officeDocument/2006/relationships" xmlns:w="http://schemas.openxmlformats.org/wordprocessingml/2006/main" xmlns:w14="http://schemas.microsoft.com/office/word/2010/wordml" xmlns:w15="http://schemas.microsoft.com/office/word/2012/wordml" xmlns:w16cex="http://schemas.microsoft.com/office/word/2018/wordml/cex" xmlns:w16cid="http://schemas.microsoft.com/office/word/2016/wordml/cid" xmlns:w16="http://schemas.microsoft.com/office/word/2018/wordml" xmlns:w16du="http://schemas.microsoft.com/office/word/2023/wordml/word16du" xmlns:w16sdtdh="http://schemas.microsoft.com/office/word/2020/wordml/sdtdatahash" xmlns:w16sdtfl="http://schemas.microsoft.com/office/word/2024/wordml/sdtformatlock" xmlns:w16se="http://schemas.microsoft.com/office/word/2015/wordml/symex" mc:Ignorable="w14 w15 w16se w16cid w16 w16cex w16sdtdh w16sdtfl w16du">
   <w:docDefaults>
     <w:rPrDefault>
       <w:rPr>
@@ -12756,7 +15677,7 @@
       </w:pPr>
     </w:pPrDefault>
   </w:docDefaults>
-  <w:latentStyles w:defLockedState="0" w:defUIPriority="99" w:defSemiHidden="0" w:defUnhideWhenUsed="0" w:defQFormat="0" w:count="371">
+  <w:latentStyles w:defLockedState="0" w:defUIPriority="99" w:defSemiHidden="0" w:defUnhideWhenUsed="0" w:defQFormat="0" w:count="376">
     <w:lsdException w:name="Normal" w:uiPriority="0" w:qFormat="1"/>
     <w:lsdException w:name="heading 1" w:uiPriority="9" w:qFormat="1"/>
     <w:lsdException w:name="heading 2" w:semiHidden="1" w:uiPriority="9" w:unhideWhenUsed="1" w:qFormat="1"/>
@@ -13128,6 +16049,11 @@
     <w:lsdException w:name="List Table 5 Dark Accent 6" w:uiPriority="50"/>
     <w:lsdException w:name="List Table 6 Colorful Accent 6" w:uiPriority="51"/>
     <w:lsdException w:name="List Table 7 Colorful Accent 6" w:uiPriority="52"/>
+    <w:lsdException w:name="Mention" w:semiHidden="1" w:unhideWhenUsed="1"/>
+    <w:lsdException w:name="Smart Hyperlink" w:semiHidden="1" w:unhideWhenUsed="1"/>
+    <w:lsdException w:name="Hashtag" w:semiHidden="1" w:unhideWhenUsed="1"/>
+    <w:lsdException w:name="Unresolved Mention" w:semiHidden="1" w:unhideWhenUsed="1"/>
+    <w:lsdException w:name="Smart Link" w:semiHidden="1" w:unhideWhenUsed="1"/>
   </w:latentStyles>
   <w:style w:type="paragraph" w:default="1" w:styleId="Normalny">
     <w:name w:val="Normal"/>
@@ -13358,6 +16284,7 @@
   <w:style w:type="character" w:default="1" w:styleId="Domylnaczcionkaakapitu">
     <w:name w:val="Default Paragraph Font"/>
     <w:uiPriority w:val="1"/>
+    <w:semiHidden/>
     <w:unhideWhenUsed/>
   </w:style>
   <w:style w:type="table" w:default="1" w:styleId="Standardowy">
@@ -14210,6 +17137,21 @@
 </file>
 
 <file path=customXml/item1.xml><?xml version="1.0" encoding="utf-8"?>
+<?mso-contentType ?>
+<FormTemplates xmlns="http://schemas.microsoft.com/sharepoint/v3/contenttype/forms">
+  <Display>DocumentLibraryForm</Display>
+  <Edit>DocumentLibraryForm</Edit>
+  <New>DocumentLibraryForm</New>
+</FormTemplates>
+</file>
+
+<file path=customXml/item2.xml><?xml version="1.0" encoding="utf-8"?>
+<p:properties xmlns:p="http://schemas.microsoft.com/office/2006/metadata/properties" xmlns:xsi="http://www.w3.org/2001/XMLSchema-instance" xmlns:pc="http://schemas.microsoft.com/office/infopath/2007/PartnerControls">
+  <documentManagement/>
+</p:properties>
+</file>
+
+<file path=customXml/item3.xml><?xml version="1.0" encoding="utf-8"?>
 <ct:contentTypeSchema xmlns:ct="http://schemas.microsoft.com/office/2006/metadata/contentType" xmlns:ma="http://schemas.microsoft.com/office/2006/metadata/properties/metaAttributes" ct:_="" ma:_="" ma:contentTypeName="Dokument" ma:contentTypeID="0x010100598298FDFD8AEB40A027713C0F245956" ma:contentTypeVersion="3" ma:contentTypeDescription="Utwórz nowy dokument." ma:contentTypeScope="" ma:versionID="8a5d1e7024cd28f41b9f7e249bd655f2">
   <xsd:schema xmlns:xsd="http://www.w3.org/2001/XMLSchema" xmlns:xs="http://www.w3.org/2001/XMLSchema" xmlns:p="http://schemas.microsoft.com/office/2006/metadata/properties" xmlns:ns2="c06174c6-5321-458e-8456-046322437e1f" targetNamespace="http://schemas.microsoft.com/office/2006/metadata/properties" ma:root="true" ma:fieldsID="999d59ea67ffb96c2d16a27609d6f263" ns2:_="">
     <xsd:import namespace="c06174c6-5321-458e-8456-046322437e1f"/>
@@ -14347,26 +17289,28 @@
 </ct:contentTypeSchema>
 </file>
 
-<file path=customXml/item2.xml><?xml version="1.0" encoding="utf-8"?>
-<p:properties xmlns:p="http://schemas.microsoft.com/office/2006/metadata/properties" xmlns:xsi="http://www.w3.org/2001/XMLSchema-instance" xmlns:pc="http://schemas.microsoft.com/office/infopath/2007/PartnerControls">
-  <documentManagement/>
-</p:properties>
-</file>
-
-<file path=customXml/item3.xml><?xml version="1.0" encoding="utf-8"?>
-<?mso-contentType ?>
-<FormTemplates xmlns="http://schemas.microsoft.com/sharepoint/v3/contenttype/forms">
-  <Display>DocumentLibraryForm</Display>
-  <Edit>DocumentLibraryForm</Edit>
-  <New>DocumentLibraryForm</New>
-</FormTemplates>
-</file>
-
 <file path=customXml/item4.xml><?xml version="1.0" encoding="utf-8"?>
 <b:Sources xmlns:b="http://schemas.openxmlformats.org/officeDocument/2006/bibliography" xmlns="http://schemas.openxmlformats.org/officeDocument/2006/bibliography" SelectedStyle="\APASixthEditionOfficeOnline.xsl" StyleName="APA" Version="6"/>
 </file>
 
 <file path=customXml/itemProps1.xml><?xml version="1.0" encoding="utf-8"?>
+<ds:datastoreItem xmlns:ds="http://schemas.openxmlformats.org/officeDocument/2006/customXml" ds:itemID="{797410FD-B46D-4767-BC79-2D1A3EE0D0F8}">
+  <ds:schemaRefs>
+    <ds:schemaRef ds:uri="http://schemas.microsoft.com/sharepoint/v3/contenttype/forms"/>
+  </ds:schemaRefs>
+</ds:datastoreItem>
+</file>
+
+<file path=customXml/itemProps2.xml><?xml version="1.0" encoding="utf-8"?>
+<ds:datastoreItem xmlns:ds="http://schemas.openxmlformats.org/officeDocument/2006/customXml" ds:itemID="{14B73347-0DC7-43EE-8D49-DD80FBA90EA0}">
+  <ds:schemaRefs>
+    <ds:schemaRef ds:uri="http://schemas.microsoft.com/office/2006/metadata/properties"/>
+    <ds:schemaRef ds:uri="http://schemas.microsoft.com/office/infopath/2007/PartnerControls"/>
+  </ds:schemaRefs>
+</ds:datastoreItem>
+</file>
+
+<file path=customXml/itemProps3.xml><?xml version="1.0" encoding="utf-8"?>
 <ds:datastoreItem xmlns:ds="http://schemas.openxmlformats.org/officeDocument/2006/customXml" ds:itemID="{5C394E00-BA43-4C60-AF16-02D9981819CF}">
   <ds:schemaRefs>
     <ds:schemaRef ds:uri="http://schemas.microsoft.com/office/2006/metadata/contentType"/>
@@ -14384,23 +17328,6 @@
 </ds:datastoreItem>
 </file>
 
-<file path=customXml/itemProps2.xml><?xml version="1.0" encoding="utf-8"?>
-<ds:datastoreItem xmlns:ds="http://schemas.openxmlformats.org/officeDocument/2006/customXml" ds:itemID="{14B73347-0DC7-43EE-8D49-DD80FBA90EA0}">
-  <ds:schemaRefs>
-    <ds:schemaRef ds:uri="http://schemas.microsoft.com/office/2006/metadata/properties"/>
-    <ds:schemaRef ds:uri="http://schemas.microsoft.com/office/infopath/2007/PartnerControls"/>
-  </ds:schemaRefs>
-</ds:datastoreItem>
-</file>
-
-<file path=customXml/itemProps3.xml><?xml version="1.0" encoding="utf-8"?>
-<ds:datastoreItem xmlns:ds="http://schemas.openxmlformats.org/officeDocument/2006/customXml" ds:itemID="{797410FD-B46D-4767-BC79-2D1A3EE0D0F8}">
-  <ds:schemaRefs>
-    <ds:schemaRef ds:uri="http://schemas.microsoft.com/sharepoint/v3/contenttype/forms"/>
-  </ds:schemaRefs>
-</ds:datastoreItem>
-</file>
-
 <file path=customXml/itemProps4.xml><?xml version="1.0" encoding="utf-8"?>
 <ds:datastoreItem xmlns:ds="http://schemas.openxmlformats.org/officeDocument/2006/customXml" ds:itemID="{1D272626-4DED-4B30-BC9E-7B2DF307E968}">
   <ds:schemaRefs>

</xml_diff>